<commit_message>
Press papers rebuilt on the 2024 Hanoi format, SCDF named as co-host
Co-Authored-By: Claude Fable 5.1 <noreply@anthropic.com>
Claude-Session: https://claude.ai/code/session_01BHBsW6jxyH2X7L51FtZqxc
</commit_message>
<xml_diff>
--- a/reports/acdr2026_staff_deployment/広報資料_ACDR2026_0928/内閣府記者発表資料_ACDR2026_案_0928.docx
+++ b/reports/acdr2026_staff_deployment/広報資料_ACDR2026_0928/内閣府記者発表資料_ACDR2026_案_0928.docx
@@ -131,8 +131,8 @@
         <w:rPr>
           <w:rFonts w:ascii="ＭＳ ゴシック;MS Gothic" w:hAnsi="ＭＳ ゴシック;MS Gothic" w:eastAsia="ＭＳ ゴシック;MS Gothic" w:cs="ＭＳ ゴシック;MS Gothic"/>
           <w:b/>
-          <w:sz w:val="24"/>
-          <w:szCs w:val="24"/>
+          <w:sz w:val="28"/>
+          <w:szCs w:val="28"/>
         </w:rPr>
       </w:pPr>
       <w:r>
@@ -142,7 +142,7 @@
           <w:sz w:val="28"/>
           <w:szCs w:val="28"/>
         </w:rPr>
-        <w:t>「アジア防災会議2026」をシンガポールで開催</w:t>
+        <w:t>「アジア防災会議2026」をシンガポール共和国で開催</w:t>
         <w:br/>
         <w:t>～アジア各国の防災能力の向上とアジア地域の防災ネットワークの充実・強化を図ります～</w:t>
       </w:r>
@@ -171,74 +171,55 @@
     <w:p>
       <w:pPr>
         <w:pStyle w:val="Normal"/>
+        <w:spacing w:lineRule="exact" w:line="240"/>
+        <w:jc w:val="center"/>
+        <w:rPr>
+          <w:rFonts w:ascii="ＭＳ ゴシック;MS Gothic" w:hAnsi="ＭＳ ゴシック;MS Gothic" w:eastAsia="ＭＳ ゴシック;MS Gothic" w:cs="ＭＳ ゴシック;MS Gothic"/>
+          <w:b/>
+          <w:sz w:val="28"/>
+          <w:szCs w:val="28"/>
+        </w:rPr>
+      </w:pPr>
+      <w:r>
+        <w:rPr>
+          <w:rFonts w:eastAsia="ＭＳ ゴシック;MS Gothic" w:cs="ＭＳ ゴシック;MS Gothic" w:ascii="ＭＳ ゴシック;MS Gothic" w:hAnsi="ＭＳ ゴシック;MS Gothic"/>
+          <w:b/>
+          <w:sz w:val="28"/>
+          <w:szCs w:val="28"/>
+        </w:rPr>
+      </w:r>
+    </w:p>
+    <w:p>
+      <w:pPr>
+        <w:pStyle w:val="Normal"/>
         <w:ind w:firstLine="235" w:right="0"/>
         <w:rPr>
-          <w:rFonts w:ascii="ＭＳ ゴシック;MS Gothic" w:hAnsi="ＭＳ ゴシック;MS Gothic" w:eastAsia="ＭＳ ゴシック;MS Gothic" w:cs="ＭＳ ゴシック;MS Gothic"/>
-        </w:rPr>
-      </w:pPr>
-      <w:bookmarkStart w:id="0" w:name="_Hlk215130208"/>
-      <w:bookmarkStart w:id="1" w:name="_Hlk215587818"/>
-      <w:bookmarkEnd w:id="1"/>
+          <w:rFonts w:ascii="ＭＳ ゴシック;MS Gothic" w:hAnsi="ＭＳ ゴシック;MS Gothic" w:eastAsia="ＭＳ ゴシック;MS Gothic" w:cs="ＭＳ Ｐゴシック"/>
+          <w:kern w:val="0"/>
+        </w:rPr>
+      </w:pPr>
       <w:r>
         <w:rPr>
           <w:rFonts w:ascii="ＭＳ ゴシック;MS Gothic" w:hAnsi="ＭＳ ゴシック;MS Gothic" w:cs="ＭＳ Ｐゴシック" w:eastAsia="ＭＳ ゴシック;MS Gothic"/>
           <w:kern w:val="0"/>
         </w:rPr>
-        <w:t>内閣府政策統括官（防災担当）は、アジア各国の防災能力の向上とアジア地域の防災ネットワークの充実・強化を図るため、アジア防災センター（</w:t>
-      </w:r>
-      <w:r>
-        <w:rPr>
-          <w:rFonts w:eastAsia="ＭＳ ゴシック;MS Gothic" w:cs="ＭＳ Ｐゴシック" w:ascii="ＭＳ ゴシック;MS Gothic" w:hAnsi="ＭＳ ゴシック;MS Gothic"/>
+        <w:t>内閣府政策統括官（防災担当）は、一般財団法人アジア防災センター（ADRC）と共同して、毎年「アジア防災会議」を開催しています。今回はシンガポール共和国において、シンガポール民間防衛庁（SCDF）を共同ホストとして、シンガポール国際防災・危機管理エキスポ（SIDEX）との合同開催「SIDEX-ACDR2026」の中で開催しますのでお知らせします。なお、ACDR2026ウェビナー（URLは確定後に記載）より、どなたでも会議を御覧いただけます。</w:t>
+      </w:r>
+    </w:p>
+    <w:p>
+      <w:pPr>
+        <w:pStyle w:val="Normal"/>
+        <w:jc w:val="left"/>
+        <w:rPr>
+          <w:rFonts w:ascii="ＭＳ ゴシック;MS Gothic" w:hAnsi="ＭＳ ゴシック;MS Gothic" w:eastAsia="ＭＳ ゴシック;MS Gothic" w:cs="ＭＳ ゴシック;MS Gothic"/>
           <w:kern w:val="0"/>
         </w:rPr>
-        <w:t>ADRC</w:t>
-      </w:r>
-      <w:r>
-        <w:rPr>
-          <w:rFonts w:ascii="ＭＳ ゴシック;MS Gothic" w:hAnsi="ＭＳ ゴシック;MS Gothic" w:cs="ＭＳ Ｐゴシック" w:eastAsia="ＭＳ ゴシック;MS Gothic"/>
+      </w:pPr>
+      <w:r>
+        <w:rPr>
+          <w:rFonts w:eastAsia="ＭＳ ゴシック;MS Gothic" w:cs="ＭＳ ゴシック;MS Gothic" w:ascii="ＭＳ ゴシック;MS Gothic" w:hAnsi="ＭＳ ゴシック;MS Gothic"/>
           <w:kern w:val="0"/>
         </w:rPr>
-        <w:t>）のメンバー国政府の防災関係者や防災専門家等を参集して、毎年</w:t>
-      </w:r>
-      <w:r>
-        <w:rPr>
-          <w:rFonts w:ascii="ＭＳ ゴシック;MS Gothic" w:hAnsi="ＭＳ ゴシック;MS Gothic" w:cs="ＭＳ ゴシック;MS Gothic" w:eastAsia="ＭＳ ゴシック;MS Gothic"/>
-        </w:rPr>
-        <w:t>「アジア防災会議」を開催しています。</w:t>
-      </w:r>
-      <w:bookmarkEnd w:id="0"/>
-    </w:p>
-    <w:p>
-      <w:pPr>
-        <w:pStyle w:val="Normal"/>
-        <w:ind w:firstLine="235" w:right="0"/>
-        <w:rPr>
-          <w:rFonts w:ascii="ＭＳ ゴシック;MS Gothic" w:hAnsi="ＭＳ ゴシック;MS Gothic" w:eastAsia="ＭＳ ゴシック;MS Gothic" w:cs="ＭＳ Ｐゴシック"/>
-          <w:kern w:val="0"/>
-        </w:rPr>
-      </w:pPr>
-      <w:r>
-        <w:rPr>
-          <w:rFonts w:ascii="ＭＳ ゴシック;MS Gothic" w:hAnsi="ＭＳ ゴシック;MS Gothic" w:cs="ＭＳ ゴシック;MS Gothic" w:eastAsia="ＭＳ ゴシック;MS Gothic"/>
-        </w:rPr>
-        <w:t>今回、シンガポール民間防衛庁（SCDF）の協力の下、シンガポール国際防災・危機管理エキスポ（SIDEX）と合同で「SIDEX-ACDR2026」として、シンガポールEXPOにてアジア防災会議2026（ACDR2026）が開催され、10月28日（水）の開会式には、内閣府から〇〇が出席（予定）します。</w:t>
-      </w:r>
-    </w:p>
-    <w:p>
-      <w:pPr>
-        <w:pStyle w:val="Normal"/>
-        <w:ind w:firstLine="235" w:right="0"/>
-        <w:rPr>
-          <w:rFonts w:ascii="ＭＳ ゴシック;MS Gothic" w:hAnsi="ＭＳ ゴシック;MS Gothic" w:eastAsia="ＭＳ ゴシック;MS Gothic" w:cs="ＭＳ Ｐゴシック"/>
-          <w:kern w:val="0"/>
-        </w:rPr>
-      </w:pPr>
-      <w:r>
-        <w:rPr>
-          <w:rFonts w:ascii="ＭＳ ゴシック;MS Gothic" w:hAnsi="ＭＳ ゴシック;MS Gothic" w:cs="ＭＳ Ｐゴシック" w:eastAsia="ＭＳ ゴシック;MS Gothic"/>
-          <w:kern w:val="0"/>
-        </w:rPr>
-        <w:t>なお、ACDR2026ウェビナー（URLは確定後に記載）より、どなたでも会議を御覧いただけます。</w:t>
       </w:r>
     </w:p>
     <w:p>
@@ -254,6 +235,27 @@
           <w:rFonts w:ascii="ＭＳ ゴシック;MS Gothic" w:hAnsi="ＭＳ ゴシック;MS Gothic" w:cs="ＭＳ ゴシック;MS Gothic" w:eastAsia="ＭＳ ゴシック;MS Gothic"/>
         </w:rPr>
         <w:t>＜アジア防災会議2026の概要＞</w:t>
+      </w:r>
+    </w:p>
+    <w:p>
+      <w:pPr>
+        <w:pStyle w:val="Normal"/>
+        <w:tabs>
+          <w:tab w:val="clear" w:pos="840"/>
+          <w:tab w:val="left" w:pos="1100" w:leader="none"/>
+        </w:tabs>
+        <w:spacing w:lineRule="exact" w:line="200"/>
+        <w:ind w:hanging="1229" w:left="1229" w:right="0"/>
+        <w:rPr>
+          <w:rFonts w:ascii="ＭＳ ゴシック;MS Gothic" w:hAnsi="ＭＳ ゴシック;MS Gothic" w:eastAsia="ＭＳ ゴシック;MS Gothic" w:cs="ＭＳ ゴシック;MS Gothic"/>
+          <w:color w:val="000000"/>
+        </w:rPr>
+      </w:pPr>
+      <w:r>
+        <w:rPr>
+          <w:rFonts w:eastAsia="ＭＳ ゴシック;MS Gothic" w:cs="ＭＳ ゴシック;MS Gothic" w:ascii="ＭＳ ゴシック;MS Gothic" w:hAnsi="ＭＳ ゴシック;MS Gothic"/>
+          <w:color w:val="000000"/>
+        </w:rPr>
       </w:r>
     </w:p>
     <w:p>
@@ -274,7 +276,7 @@
           <w:rFonts w:ascii="ＭＳ ゴシック;MS Gothic" w:hAnsi="ＭＳ ゴシック;MS Gothic" w:cs="ＭＳ ゴシック;MS Gothic" w:eastAsia="ＭＳ ゴシック;MS Gothic"/>
           <w:color w:val="000000"/>
         </w:rPr>
-        <w:t>１　日程　　令和８年10月28日（水）、29日（木）　※プログラムは別紙ご参照</w:t>
+        <w:t>１　日程　　令和８年10月28日（水）、29日（木）</w:t>
       </w:r>
     </w:p>
     <w:p>
@@ -311,10 +313,8 @@
           <w:rFonts w:ascii="ＭＳ ゴシック;MS Gothic" w:hAnsi="ＭＳ ゴシック;MS Gothic" w:cs="ＭＳ ゴシック;MS Gothic" w:eastAsia="ＭＳ ゴシック;MS Gothic"/>
           <w:color w:val="000000"/>
         </w:rPr>
-        <w:t>２　場所  　シンガポールEXPO（シンガポール）</w:t>
-      </w:r>
-      <w:bookmarkStart w:id="4" w:name="_Hlk215128959"/>
-      <w:bookmarkEnd w:id="4"/>
+        <w:t>２　場所  　シンガポールEXPO（シンガポール共和国）</w:t>
+      </w:r>
     </w:p>
     <w:p>
       <w:pPr>
@@ -366,10 +366,8 @@
           <w:rFonts w:ascii="ＭＳ ゴシック;MS Gothic" w:hAnsi="ＭＳ ゴシック;MS Gothic" w:cs="ＭＳ ゴシック;MS Gothic" w:eastAsia="ＭＳ ゴシック;MS Gothic"/>
           <w:color w:val="000000"/>
         </w:rPr>
-        <w:t>３　主催　　内閣府政策統括官（防災担当）、アジア防災センター（ADRC）</w:t>
-      </w:r>
-      <w:bookmarkStart w:id="5" w:name="_Hlk215587965"/>
-      <w:bookmarkEnd w:id="5"/>
+        <w:t>３　主催　　内閣府政策統括官（防災担当）、一般財団法人アジア防災センター（ADRC）、</w:t>
+      </w:r>
     </w:p>
     <w:p>
       <w:pPr>
@@ -379,17 +377,14 @@
           <w:tab w:val="left" w:pos="1100" w:leader="none"/>
         </w:tabs>
         <w:ind w:hanging="1881" w:left="1881" w:right="0"/>
-        <w:rPr>
-          <w:rFonts w:ascii="ＭＳ ゴシック;MS Gothic" w:hAnsi="ＭＳ ゴシック;MS Gothic" w:eastAsia="ＭＳ ゴシック;MS Gothic" w:cs="ＭＳ ゴシック;MS Gothic"/>
-          <w:color w:val="000000"/>
-        </w:rPr>
-      </w:pPr>
-      <w:r>
-        <w:rPr>
-          <w:rFonts w:ascii="ＭＳ ゴシック;MS Gothic" w:hAnsi="ＭＳ ゴシック;MS Gothic" w:cs="ＭＳ ゴシック;MS Gothic" w:eastAsia="ＭＳ ゴシック;MS Gothic"/>
-          <w:color w:val="000000"/>
-        </w:rPr>
-        <w:t xml:space="preserve">　　　　　　　　（SIDEX主催：COSEM（シンガポール民間防衛庁職員協同組合）、協力：シンガポール民間防衛庁（SCDF））</w:t>
+        <w:rPr/>
+      </w:pPr>
+      <w:r>
+        <w:rPr>
+          <w:rFonts w:ascii="ＭＳ ゴシック;MS Gothic" w:hAnsi="ＭＳ ゴシック;MS Gothic" w:cs="ＭＳ ゴシック;MS Gothic" w:eastAsia="ＭＳ ゴシック;MS Gothic"/>
+          <w:color w:val="000000"/>
+        </w:rPr>
+        <w:t xml:space="preserve">　　　　　　　　シンガポール民間防衛庁（SCDF）（共同ホスト）</w:t>
       </w:r>
     </w:p>
     <w:p>
@@ -400,6 +395,24 @@
           <w:tab w:val="left" w:pos="1100" w:leader="none"/>
         </w:tabs>
         <w:ind w:hanging="1881" w:left="1881" w:right="0"/>
+        <w:rPr/>
+      </w:pPr>
+      <w:r>
+        <w:rPr>
+          <w:rFonts w:ascii="ＭＳ ゴシック;MS Gothic" w:hAnsi="ＭＳ ゴシック;MS Gothic" w:cs="ＭＳ ゴシック;MS Gothic" w:eastAsia="ＭＳ ゴシック;MS Gothic"/>
+          <w:color w:val="000000"/>
+        </w:rPr>
+        <w:t xml:space="preserve">　　　　　　　　※SIDEX（主催：COSEM）との合同開催「SIDEX-ACDR2026」として実施</w:t>
+      </w:r>
+    </w:p>
+    <w:p>
+      <w:pPr>
+        <w:pStyle w:val="Normal"/>
+        <w:tabs>
+          <w:tab w:val="clear" w:pos="840"/>
+          <w:tab w:val="left" w:pos="1100" w:leader="none"/>
+        </w:tabs>
+        <w:ind w:hanging="1881" w:left="1881" w:right="0"/>
         <w:rPr>
           <w:rFonts w:ascii="ＭＳ ゴシック;MS Gothic" w:hAnsi="ＭＳ ゴシック;MS Gothic" w:eastAsia="ＭＳ ゴシック;MS Gothic" w:cs="ＭＳ ゴシック;MS Gothic"/>
           <w:color w:val="000000"/>
@@ -416,7 +429,8 @@
         <w:rPr>
           <w:rFonts w:ascii="ＭＳ ゴシック;MS Gothic" w:hAnsi="ＭＳ ゴシック;MS Gothic" w:cs="ＭＳ ゴシック;MS Gothic" w:eastAsia="ＭＳ ゴシック;MS Gothic"/>
           <w:color w:val="000000"/>
-          <w:spacing w:val="55"/>
+          <w:spacing w:val="96"/>
+          <w:w w:val="78"/>
           <w:kern w:val="0"/>
         </w:rPr>
         <w:t>参加</w:t>
@@ -425,12 +439,19 @@
         <w:rPr>
           <w:rFonts w:ascii="ＭＳ ゴシック;MS Gothic" w:hAnsi="ＭＳ ゴシック;MS Gothic" w:cs="ＭＳ ゴシック;MS Gothic" w:eastAsia="ＭＳ ゴシック;MS Gothic"/>
           <w:color w:val="000000"/>
+          <w:w w:val="78"/>
           <w:kern w:val="0"/>
         </w:rPr>
-        <w:t>者　　</w:t>
-      </w:r>
-      <w:bookmarkStart w:id="6" w:name="_Hlk215587998"/>
-      <w:bookmarkStart w:id="7" w:name="_Hlk215129032"/>
+        <w:t>者</w:t>
+      </w:r>
+      <w:r>
+        <w:rPr>
+          <w:rFonts w:ascii="ＭＳ ゴシック;MS Gothic" w:hAnsi="ＭＳ ゴシック;MS Gothic" w:cs="ＭＳ ゴシック;MS Gothic" w:eastAsia="ＭＳ ゴシック;MS Gothic"/>
+          <w:color w:val="000000"/>
+          <w:kern w:val="0"/>
+        </w:rPr>
+        <w:t>　　</w:t>
+      </w:r>
       <w:r>
         <w:rPr>
           <w:rFonts w:eastAsia="ＭＳ ゴシック;MS Gothic" w:cs="ＭＳ ゴシック;MS Gothic" w:ascii="ＭＳ ゴシック;MS Gothic" w:hAnsi="ＭＳ ゴシック;MS Gothic"/>
@@ -443,15 +464,7 @@
           <w:rFonts w:ascii="ＭＳ ゴシック;MS Gothic" w:hAnsi="ＭＳ ゴシック;MS Gothic" w:cs="ＭＳ ゴシック;MS Gothic" w:eastAsia="ＭＳ ゴシック;MS Gothic"/>
           <w:color w:val="000000"/>
         </w:rPr>
-        <w:t>のメンバー国政府の防災機関関係者</w:t>
-      </w:r>
-      <w:bookmarkEnd w:id="7"/>
-      <w:r>
-        <w:rPr>
-          <w:rFonts w:ascii="ＭＳ ゴシック;MS Gothic" w:hAnsi="ＭＳ ゴシック;MS Gothic" w:cs="ＭＳ ゴシック;MS Gothic" w:eastAsia="ＭＳ ゴシック;MS Gothic"/>
-          <w:color w:val="000000"/>
-        </w:rPr>
-        <w:t>、国連等関係機関防災担当者、</w:t>
+        <w:t>のメンバー国政府の防災関係者、国連等関係機関防災担当者、</w:t>
       </w:r>
     </w:p>
     <w:p>
@@ -480,19 +493,38 @@
         <w:pStyle w:val="Normal"/>
         <w:rPr>
           <w:rFonts w:ascii="ＭＳ ゴシック;MS Gothic" w:hAnsi="ＭＳ ゴシック;MS Gothic" w:eastAsia="ＭＳ ゴシック;MS Gothic" w:cs="ＭＳ ゴシック;MS Gothic"/>
+        </w:rPr>
+      </w:pPr>
+      <w:r>
+        <w:rPr>
+          <w:rFonts w:ascii="ＭＳ ゴシック;MS Gothic" w:hAnsi="ＭＳ ゴシック;MS Gothic" w:cs="ＭＳ ゴシック;MS Gothic" w:eastAsia="ＭＳ ゴシック;MS Gothic"/>
+        </w:rPr>
+        <w:t>５　</w:t>
+      </w:r>
+      <w:r>
+        <w:rPr>
+          <w:rFonts w:ascii="ＭＳ ゴシック;MS Gothic" w:hAnsi="ＭＳ ゴシック;MS Gothic" w:cs="ＭＳ ゴシック;MS Gothic" w:eastAsia="ＭＳ ゴシック;MS Gothic"/>
+          <w:spacing w:val="53"/>
+          <w:w w:val="65"/>
           <w:kern w:val="0"/>
-          <w:lang w:eastAsia="ja-JP"/>
-        </w:rPr>
-      </w:pPr>
-      <w:bookmarkEnd w:id="6"/>
-      <w:r>
-        <w:rPr>
-          <w:rFonts w:ascii="ＭＳ ゴシック;MS Gothic" w:hAnsi="ＭＳ ゴシック;MS Gothic" w:cs="ＭＳ ゴシック;MS Gothic" w:eastAsia="ＭＳ ゴシック;MS Gothic"/>
-        </w:rPr>
-        <w:t xml:space="preserve">５　使用言語　　英語　</w:t>
-      </w:r>
-      <w:bookmarkStart w:id="8" w:name="_Hlk215588146"/>
-      <w:bookmarkEnd w:id="8"/>
+        </w:rPr>
+        <w:t>使用言</w:t>
+      </w:r>
+      <w:r>
+        <w:rPr>
+          <w:rFonts w:ascii="ＭＳ ゴシック;MS Gothic" w:hAnsi="ＭＳ ゴシック;MS Gothic" w:cs="ＭＳ ゴシック;MS Gothic" w:eastAsia="ＭＳ ゴシック;MS Gothic"/>
+          <w:w w:val="65"/>
+          <w:kern w:val="0"/>
+        </w:rPr>
+        <w:t>語</w:t>
+      </w:r>
+      <w:r>
+        <w:rPr>
+          <w:rFonts w:ascii="ＭＳ ゴシック;MS Gothic" w:hAnsi="ＭＳ ゴシック;MS Gothic" w:cs="ＭＳ ゴシック;MS Gothic" w:eastAsia="ＭＳ ゴシック;MS Gothic"/>
+          <w:kern w:val="0"/>
+        </w:rPr>
+        <w:t>　　英語　</w:t>
+      </w:r>
     </w:p>
     <w:p>
       <w:pPr>
@@ -506,7 +538,7 @@
         <w:rPr>
           <w:rFonts w:ascii="ＭＳ ゴシック;MS Gothic" w:hAnsi="ＭＳ ゴシック;MS Gothic" w:cs="ＭＳ ゴシック;MS Gothic" w:eastAsia="ＭＳ ゴシック;MS Gothic"/>
         </w:rPr>
-        <w:t>６　特設HP　　https://acdr.adrc.asia/home/acdr2026　※会議の詳細内容はこちら</w:t>
+        <w:t>６　特設HP　 https://acdr.adrc.asia/home/acdr2026　※会議の詳細内容はこちら</w:t>
       </w:r>
     </w:p>
     <w:p>
@@ -558,104 +590,23 @@
     <w:p>
       <w:pPr>
         <w:pStyle w:val="Normal"/>
-        <w:ind w:firstLine="235" w:right="0"/>
-        <w:rPr>
-          <w:rFonts w:ascii="ＭＳ ゴシック;MS Gothic" w:hAnsi="ＭＳ ゴシック;MS Gothic" w:eastAsia="ＭＳ ゴシック;MS Gothic" w:cs="ＭＳ ゴシック;MS Gothic"/>
-        </w:rPr>
-      </w:pPr>
-      <w:bookmarkStart w:id="9" w:name="_Hlk215129901"/>
-      <w:bookmarkEnd w:id="9"/>
-      <w:r>
-        <w:rPr>
-          <w:rFonts w:ascii="ＭＳ ゴシック;MS Gothic" w:hAnsi="ＭＳ ゴシック;MS Gothic" w:cs="ＭＳ ゴシック;MS Gothic" w:eastAsia="ＭＳ ゴシック;MS Gothic"/>
-        </w:rPr>
-        <w:t>別紙３：アジア防災センターメンバー国</w:t>
-      </w:r>
-    </w:p>
-    <w:p>
-      <w:pPr>
-        <w:pStyle w:val="Normal"/>
-        <w:ind w:firstLine="235" w:right="0"/>
-        <w:rPr>
-          <w:rFonts w:ascii="ＭＳ ゴシック;MS Gothic" w:hAnsi="ＭＳ ゴシック;MS Gothic" w:eastAsia="ＭＳ ゴシック;MS Gothic" w:cs="ＭＳ ゴシック;MS Gothic"/>
+        <w:spacing w:lineRule="atLeast" w:line="0"/>
+        <w:rPr>
+          <w:rFonts w:ascii="ＭＳ ゴシック;MS Gothic" w:hAnsi="ＭＳ ゴシック;MS Gothic" w:eastAsia="ＭＳ ゴシック;MS Gothic" w:cs="ＭＳ ゴシック;MS Gothic"/>
+          <w:sz w:val="8"/>
         </w:rPr>
       </w:pPr>
       <w:r>
         <w:rPr>
           <w:rFonts w:eastAsia="ＭＳ ゴシック;MS Gothic" w:cs="ＭＳ ゴシック;MS Gothic" w:ascii="ＭＳ ゴシック;MS Gothic" w:hAnsi="ＭＳ ゴシック;MS Gothic"/>
-        </w:rPr>
-      </w:r>
-      <w:bookmarkStart w:id="10" w:name="_Hlk215129901_Copy_1"/>
-      <w:bookmarkStart w:id="11" w:name="_Hlk215129901_Copy_1"/>
-      <w:bookmarkEnd w:id="11"/>
-    </w:p>
-    <w:p>
-      <w:pPr>
-        <w:pStyle w:val="Normal"/>
-        <w:numPr>
-          <w:ilvl w:val="0"/>
-          <w:numId w:val="1"/>
-        </w:numPr>
-        <w:rPr>
-          <w:rFonts w:ascii="ＭＳ ゴシック;MS Gothic" w:hAnsi="ＭＳ ゴシック;MS Gothic" w:eastAsia="ＭＳ ゴシック;MS Gothic" w:cs="ＭＳ ゴシック;MS Gothic"/>
-          <w:b/>
-          <w:bCs/>
-        </w:rPr>
-      </w:pPr>
-      <w:r>
-        <w:rPr>
-          <w:rFonts w:ascii="ＭＳ ゴシック;MS Gothic" w:hAnsi="ＭＳ ゴシック;MS Gothic" w:cs="ＭＳ ゴシック;MS Gothic" w:eastAsia="ＭＳ ゴシック;MS Gothic"/>
-          <w:b/>
-          <w:bCs/>
-        </w:rPr>
-        <w:t>なお、お手数ですが、当日取材を希望される方は、事務局</w:t>
-      </w:r>
-      <w:r>
-        <w:rPr>
-          <w:rFonts w:eastAsia="ＭＳ ゴシック;MS Gothic" w:cs="ＭＳ ゴシック;MS Gothic" w:ascii="ＭＳ ゴシック;MS Gothic" w:hAnsi="ＭＳ ゴシック;MS Gothic"/>
-          <w:b/>
-          <w:bCs/>
-        </w:rPr>
-        <w:t>(</w:t>
-      </w:r>
-      <w:r>
-        <w:rPr>
-          <w:rFonts w:ascii="ＭＳ ゴシック;MS Gothic" w:hAnsi="ＭＳ ゴシック;MS Gothic" w:cs="ＭＳ ゴシック;MS Gothic" w:eastAsia="ＭＳ ゴシック;MS Gothic"/>
-          <w:b/>
-          <w:bCs/>
-        </w:rPr>
-        <w:t>一般財団法人アジア防災センター</w:t>
-      </w:r>
-      <w:r>
-        <w:rPr>
-          <w:rFonts w:eastAsia="ＭＳ ゴシック;MS Gothic" w:cs="ＭＳ ゴシック;MS Gothic" w:ascii="ＭＳ ゴシック;MS Gothic" w:hAnsi="ＭＳ ゴシック;MS Gothic"/>
-          <w:b/>
-          <w:bCs/>
-        </w:rPr>
-        <w:t>)</w:t>
-      </w:r>
-      <w:r>
-        <w:rPr>
-          <w:rFonts w:ascii="ＭＳ ゴシック;MS Gothic" w:hAnsi="ＭＳ ゴシック;MS Gothic" w:cs="ＭＳ ゴシック;MS Gothic" w:eastAsia="ＭＳ ゴシック;MS Gothic"/>
-          <w:b/>
-          <w:bCs/>
-        </w:rPr>
-        <w:t>に電話・メール等でご連絡をお願いします。</w:t>
-      </w:r>
-    </w:p>
-    <w:p>
-      <w:pPr>
-        <w:pStyle w:val="Normal"/>
-        <w:widowControl w:val="false"/>
-        <w:numPr>
-          <w:ilvl w:val="0"/>
-          <w:numId w:val="0"/>
-        </w:numPr>
-        <w:suppressAutoHyphens w:val="true"/>
-        <w:bidi w:val="0"/>
-        <w:spacing w:lineRule="atLeast" w:line="0" w:before="0" w:after="0"/>
-        <w:ind w:hanging="0" w:left="0"/>
-        <w:jc w:val="both"/>
+          <w:sz w:val="8"/>
+        </w:rPr>
+      </w:r>
+    </w:p>
+    <w:p>
+      <w:pPr>
+        <w:pStyle w:val="Normal"/>
+        <w:spacing w:lineRule="atLeast" w:line="0"/>
         <w:rPr>
           <w:rFonts w:ascii="ＭＳ ゴシック;MS Gothic" w:hAnsi="ＭＳ ゴシック;MS Gothic" w:eastAsia="ＭＳ ゴシック;MS Gothic" w:cs="ＭＳ ゴシック;MS Gothic"/>
           <w:sz w:val="8"/>
@@ -668,15 +619,429 @@
           <w:sz w:val="8"/>
           <w:lang w:val="en-US" w:eastAsia="en-US"/>
         </w:rPr>
+        <mc:AlternateContent>
+          <mc:Choice Requires="wps">
+            <w:drawing>
+              <wp:anchor behindDoc="0" distT="0" distB="0" distL="0" distR="0" simplePos="0" locked="0" layoutInCell="1" allowOverlap="1" relativeHeight="3">
+                <wp:simplePos x="0" y="0"/>
+                <wp:positionH relativeFrom="column">
+                  <wp:posOffset>287020</wp:posOffset>
+                </wp:positionH>
+                <wp:positionV relativeFrom="paragraph">
+                  <wp:posOffset>49530</wp:posOffset>
+                </wp:positionV>
+                <wp:extent cx="5638800" cy="1524000"/>
+                <wp:effectExtent l="5080" t="5080" r="5080" b="5080"/>
+                <wp:wrapNone/>
+                <wp:docPr id="2" name="Frame1"/>
+                <a:graphic xmlns:a="http://schemas.openxmlformats.org/drawingml/2006/main">
+                  <a:graphicData uri="http://schemas.microsoft.com/office/word/2010/wordprocessingShape">
+                    <wps:wsp>
+                      <wps:cNvSpPr/>
+                      <wps:spPr>
+                        <a:xfrm>
+                          <a:off x="0" y="0"/>
+                          <a:ext cx="5638680" cy="1523880"/>
+                        </a:xfrm>
+                        <a:prstGeom prst="rect">
+                          <a:avLst/>
+                        </a:prstGeom>
+                        <a:noFill/>
+                        <a:ln w="9525">
+                          <a:solidFill>
+                            <a:srgbClr val="000000"/>
+                          </a:solidFill>
+                          <a:round/>
+                        </a:ln>
+                      </wps:spPr>
+                      <wps:style>
+                        <a:lnRef idx="0"/>
+                        <a:fillRef idx="0"/>
+                        <a:effectRef idx="0"/>
+                        <a:fontRef idx="minor"/>
+                      </wps:style>
+                      <wps:txbx>
+                        <w:txbxContent>
+                          <w:p>
+                            <w:pPr>
+                              <w:pStyle w:val="Normal"/>
+                              <w:spacing w:lineRule="exact" w:line="280"/>
+                              <w:ind w:firstLine="235" w:right="0"/>
+                              <w:jc w:val="left"/>
+                              <w:rPr>
+                                <w:rFonts w:ascii="ＭＳ ゴシック;MS Gothic" w:hAnsi="ＭＳ ゴシック;MS Gothic" w:eastAsia="ＭＳ ゴシック;MS Gothic" w:cs="ＭＳ ゴシック;MS Gothic"/>
+                                <w:b/>
+                                <w:color w:val="000000"/>
+                              </w:rPr>
+                            </w:pPr>
+                            <w:r>
+                              <w:rPr>
+                                <w:rFonts w:ascii="ＭＳ ゴシック;MS Gothic" w:hAnsi="ＭＳ ゴシック;MS Gothic" w:cs="ＭＳ ゴシック;MS Gothic" w:eastAsia="ＭＳ ゴシック;MS Gothic"/>
+                                <w:color w:val="000000"/>
+                              </w:rPr>
+                              <w:t>＜本件問合せ先＞　　</w:t>
+                            </w:r>
+                          </w:p>
+                          <w:p>
+                            <w:pPr>
+                              <w:pStyle w:val="Normal"/>
+                              <w:spacing w:lineRule="exact" w:line="280"/>
+                              <w:ind w:firstLine="235" w:right="0"/>
+                              <w:jc w:val="left"/>
+                              <w:rPr>
+                                <w:rFonts w:ascii="ＭＳ ゴシック;MS Gothic" w:hAnsi="ＭＳ ゴシック;MS Gothic" w:eastAsia="ＭＳ ゴシック;MS Gothic" w:cs="ＭＳ ゴシック;MS Gothic"/>
+                                <w:color w:val="000000"/>
+                              </w:rPr>
+                            </w:pPr>
+                            <w:r>
+                              <w:rPr>
+                                <w:rFonts w:eastAsia="ＭＳ ゴシック;MS Gothic" w:cs="ＭＳ ゴシック;MS Gothic" w:ascii="ＭＳ ゴシック;MS Gothic" w:hAnsi="ＭＳ ゴシック;MS Gothic"/>
+                                <w:color w:val="000000"/>
+                              </w:rPr>
+                              <w:t>●</w:t>
+                            </w:r>
+                            <w:r>
+                              <w:rPr>
+                                <w:rFonts w:ascii="ＭＳ ゴシック;MS Gothic" w:hAnsi="ＭＳ ゴシック;MS Gothic" w:cs="ＭＳ ゴシック;MS Gothic" w:eastAsia="ＭＳ ゴシック;MS Gothic"/>
+                                <w:color w:val="000000"/>
+                              </w:rPr>
+                              <w:t>会議に関すること</w:t>
+                            </w:r>
+                          </w:p>
+                          <w:p>
+                            <w:pPr>
+                              <w:pStyle w:val="Normal"/>
+                              <w:spacing w:lineRule="exact" w:line="280"/>
+                              <w:ind w:firstLine="705" w:right="0"/>
+                              <w:jc w:val="left"/>
+                              <w:rPr>
+                                <w:rFonts w:ascii="ＭＳ ゴシック;MS Gothic" w:hAnsi="ＭＳ ゴシック;MS Gothic" w:eastAsia="ＭＳ ゴシック;MS Gothic" w:cs="ＭＳ ゴシック;MS Gothic"/>
+                              </w:rPr>
+                            </w:pPr>
+                            <w:r>
+                              <w:rPr>
+                                <w:rFonts w:ascii="ＭＳ ゴシック;MS Gothic" w:hAnsi="ＭＳ ゴシック;MS Gothic" w:cs="ＭＳ ゴシック;MS Gothic" w:eastAsia="ＭＳ ゴシック;MS Gothic"/>
+                                <w:color w:val="000000"/>
+                              </w:rPr>
+                              <w:t xml:space="preserve">事務局（一般財団法人アジア防災センター）担当：荒木田</w:t>
+                            </w:r>
+                            <w:r>
+                              <w:rPr>
+                                <w:rFonts w:ascii="ＭＳ ゴシック;MS Gothic" w:hAnsi="ＭＳ ゴシック;MS Gothic" w:cs="ＭＳ ゴシック;MS Gothic" w:eastAsia="ＭＳ ゴシック;MS Gothic"/>
+                              </w:rPr>
+                              <w:t/>
+                            </w:r>
+                          </w:p>
+                          <w:p>
+                            <w:pPr>
+                              <w:pStyle w:val="Normal"/>
+                              <w:spacing w:lineRule="exact" w:line="280"/>
+                              <w:ind w:firstLine="705" w:right="0"/>
+                              <w:jc w:val="left"/>
+                              <w:rPr>
+                                <w:rFonts w:ascii="ＭＳ ゴシック;MS Gothic" w:hAnsi="ＭＳ ゴシック;MS Gothic" w:eastAsia="ＭＳ ゴシック;MS Gothic" w:cs="ＭＳ ゴシック;MS Gothic"/>
+                              </w:rPr>
+                            </w:pPr>
+                            <w:r>
+                              <w:rPr>
+                                <w:rFonts w:eastAsia="ＭＳ ゴシック;MS Gothic" w:cs="ＭＳ ゴシック;MS Gothic" w:ascii="ＭＳ ゴシック;MS Gothic" w:hAnsi="ＭＳ ゴシック;MS Gothic"/>
+                              </w:rPr>
+                              <w:t xml:space="preserve">E-mail　ma-arakida@adrc.asia, acdr2026sgp@adrc.asia</w:t>
+                            </w:r>
+                            <w:r>
+                              <w:rPr>
+                                <w:rFonts w:ascii="ＭＳ ゴシック;MS Gothic" w:hAnsi="ＭＳ ゴシック;MS Gothic" w:cs="ＭＳ ゴシック;MS Gothic" w:eastAsia="ＭＳ ゴシック;MS Gothic"/>
+                              </w:rPr>
+                              <w:t/>
+                            </w:r>
+                            <w:r>
+                              <w:rPr>
+                                <w:rFonts w:eastAsia="ＭＳ ゴシック;MS Gothic" w:cs="ＭＳ ゴシック;MS Gothic" w:ascii="ＭＳ ゴシック;MS Gothic" w:hAnsi="ＭＳ ゴシック;MS Gothic"/>
+                              </w:rPr>
+                              <w:t/>
+                            </w:r>
+                          </w:p>
+                          <w:p>
+                            <w:pPr>
+                              <w:pStyle w:val="Normal"/>
+                              <w:spacing w:lineRule="exact" w:line="280"/>
+                              <w:ind w:firstLine="705" w:right="0"/>
+                              <w:jc w:val="left"/>
+                              <w:rPr>
+                                <w:rFonts w:ascii="ＭＳ ゴシック;MS Gothic" w:hAnsi="ＭＳ ゴシック;MS Gothic" w:eastAsia="ＭＳ ゴシック;MS Gothic" w:cs="ＭＳ ゴシック;MS Gothic"/>
+                              </w:rPr>
+                            </w:pPr>
+                            <w:r>
+                              <w:rPr>
+                                <w:rFonts w:eastAsia="ＭＳ ゴシック;MS Gothic" w:cs="ＭＳ ゴシック;MS Gothic" w:ascii="ＭＳ ゴシック;MS Gothic" w:hAnsi="ＭＳ ゴシック;MS Gothic"/>
+                              </w:rPr>
+                              <w:t>TEL 078-262-5540 FAX 078-262-5546</w:t>
+                            </w:r>
+                          </w:p>
+                          <w:p>
+                            <w:pPr>
+                              <w:pStyle w:val="Normal"/>
+                              <w:spacing w:lineRule="exact" w:line="280"/>
+                              <w:jc w:val="left"/>
+                              <w:rPr>
+                                <w:rFonts w:ascii="ＭＳ ゴシック;MS Gothic" w:hAnsi="ＭＳ ゴシック;MS Gothic" w:eastAsia="ＭＳ ゴシック;MS Gothic" w:cs="ＭＳ ゴシック;MS Gothic"/>
+                              </w:rPr>
+                            </w:pPr>
+                            <w:r>
+                              <w:rPr>
+                                <w:rFonts w:ascii="ＭＳ ゴシック;MS Gothic" w:hAnsi="ＭＳ ゴシック;MS Gothic" w:cs="ＭＳ ゴシック;MS Gothic" w:eastAsia="ＭＳ ゴシック;MS Gothic"/>
+                              </w:rPr>
+                              <w:t>　●その他全般に関すること</w:t>
+                            </w:r>
+                          </w:p>
+                          <w:p>
+                            <w:pPr>
+                              <w:pStyle w:val="Normal"/>
+                              <w:spacing w:lineRule="exact" w:line="280"/>
+                              <w:ind w:firstLine="705" w:right="0"/>
+                              <w:jc w:val="left"/>
+                              <w:rPr>
+                                <w:rFonts w:ascii="ＭＳ ゴシック;MS Gothic" w:hAnsi="ＭＳ ゴシック;MS Gothic" w:eastAsia="ＭＳ ゴシック;MS Gothic" w:cs="ＭＳ ゴシック;MS Gothic"/>
+                                <w:color w:val="000000"/>
+                              </w:rPr>
+                            </w:pPr>
+                            <w:r>
+                              <w:rPr>
+                                <w:rFonts w:ascii="ＭＳ ゴシック;MS Gothic" w:hAnsi="ＭＳ ゴシック;MS Gothic" w:cs="ＭＳ ゴシック;MS Gothic" w:eastAsia="ＭＳ ゴシック;MS Gothic"/>
+                                <w:color w:val="000000"/>
+                              </w:rPr>
+                              <w:t>内閣府政策統括官（防災担当）付参事官（普及啓発・連携担当）付</w:t>
+                            </w:r>
+                          </w:p>
+                          <w:p>
+                            <w:pPr>
+                              <w:pStyle w:val="Normal"/>
+                              <w:spacing w:lineRule="exact" w:line="280"/>
+                              <w:jc w:val="left"/>
+                              <w:rPr/>
+                            </w:pPr>
+                            <w:r>
+                              <w:rPr>
+                                <w:rFonts w:ascii="ＭＳ ゴシック;MS Gothic" w:hAnsi="ＭＳ ゴシック;MS Gothic" w:cs="ＭＳ ゴシック;MS Gothic" w:eastAsia="ＭＳ ゴシック;MS Gothic"/>
+                                <w:color w:val="000000"/>
+                              </w:rPr>
+                              <w:t xml:space="preserve">　　　担当：〇〇　TEL 03-3502-6984 FAX 03-3581-7510</w:t>
+                            </w:r>
+                            <w:r>
+                              <w:rPr>
+                                <w:rFonts w:eastAsia="ＭＳ ゴシック;MS Gothic" w:cs="ＭＳ ゴシック;MS Gothic" w:ascii="ＭＳ ゴシック;MS Gothic" w:hAnsi="ＭＳ ゴシック;MS Gothic"/>
+                                <w:color w:val="000000"/>
+                              </w:rPr>
+                              <w:t/>
+                            </w:r>
+                          </w:p>
+                        </w:txbxContent>
+                      </wps:txbx>
+                      <wps:bodyPr lIns="74160" rIns="74160" tIns="9000" bIns="9000" anchor="t">
+                        <a:noAutofit/>
+                      </wps:bodyPr>
+                    </wps:wsp>
+                  </a:graphicData>
+                </a:graphic>
+              </wp:anchor>
+            </w:drawing>
+          </mc:Choice>
+          <mc:Fallback>
+            <w:pict>
+              <v:rect id="shape_0" ID="Frame1" path="m0,0l-2147483645,0l-2147483645,-2147483646l0,-2147483646xe" fillcolor="white" stroked="t" o:allowincell="f" style="position:absolute;margin-left:22.6pt;margin-top:3.9pt;width:443.95pt;height:119.95pt;mso-wrap-style:square;v-text-anchor:top">
+                <v:fill o:detectmouseclick="t" type="solid" color2="black" opacity="0"/>
+                <v:stroke color="black" weight="9360" joinstyle="round" endcap="flat"/>
+                <v:textbox>
+                  <w:txbxContent>
+                    <w:p>
+                      <w:pPr>
+                        <w:pStyle w:val="Normal"/>
+                        <w:spacing w:lineRule="exact" w:line="280"/>
+                        <w:ind w:firstLine="235" w:right="0"/>
+                        <w:jc w:val="left"/>
+                        <w:rPr>
+                          <w:rFonts w:ascii="ＭＳ ゴシック;MS Gothic" w:hAnsi="ＭＳ ゴシック;MS Gothic" w:eastAsia="ＭＳ ゴシック;MS Gothic" w:cs="ＭＳ ゴシック;MS Gothic"/>
+                          <w:b/>
+                          <w:color w:val="000000"/>
+                        </w:rPr>
+                      </w:pPr>
+                      <w:r>
+                        <w:rPr>
+                          <w:rFonts w:ascii="ＭＳ ゴシック;MS Gothic" w:hAnsi="ＭＳ ゴシック;MS Gothic" w:cs="ＭＳ ゴシック;MS Gothic" w:eastAsia="ＭＳ ゴシック;MS Gothic"/>
+                          <w:color w:val="000000"/>
+                        </w:rPr>
+                        <w:t>＜本件問合せ先＞　　</w:t>
+                      </w:r>
+                    </w:p>
+                    <w:p>
+                      <w:pPr>
+                        <w:pStyle w:val="Normal"/>
+                        <w:spacing w:lineRule="exact" w:line="280"/>
+                        <w:ind w:firstLine="235" w:right="0"/>
+                        <w:jc w:val="left"/>
+                        <w:rPr>
+                          <w:rFonts w:ascii="ＭＳ ゴシック;MS Gothic" w:hAnsi="ＭＳ ゴシック;MS Gothic" w:eastAsia="ＭＳ ゴシック;MS Gothic" w:cs="ＭＳ ゴシック;MS Gothic"/>
+                          <w:color w:val="000000"/>
+                        </w:rPr>
+                      </w:pPr>
+                      <w:r>
+                        <w:rPr>
+                          <w:rFonts w:eastAsia="ＭＳ ゴシック;MS Gothic" w:cs="ＭＳ ゴシック;MS Gothic" w:ascii="ＭＳ ゴシック;MS Gothic" w:hAnsi="ＭＳ ゴシック;MS Gothic"/>
+                          <w:color w:val="000000"/>
+                        </w:rPr>
+                        <w:t>●</w:t>
+                      </w:r>
+                      <w:r>
+                        <w:rPr>
+                          <w:rFonts w:ascii="ＭＳ ゴシック;MS Gothic" w:hAnsi="ＭＳ ゴシック;MS Gothic" w:cs="ＭＳ ゴシック;MS Gothic" w:eastAsia="ＭＳ ゴシック;MS Gothic"/>
+                          <w:color w:val="000000"/>
+                        </w:rPr>
+                        <w:t>会議に関すること</w:t>
+                      </w:r>
+                    </w:p>
+                    <w:p>
+                      <w:pPr>
+                        <w:pStyle w:val="Normal"/>
+                        <w:spacing w:lineRule="exact" w:line="280"/>
+                        <w:ind w:firstLine="705" w:right="0"/>
+                        <w:jc w:val="left"/>
+                        <w:rPr>
+                          <w:rFonts w:ascii="ＭＳ ゴシック;MS Gothic" w:hAnsi="ＭＳ ゴシック;MS Gothic" w:eastAsia="ＭＳ ゴシック;MS Gothic" w:cs="ＭＳ ゴシック;MS Gothic"/>
+                        </w:rPr>
+                      </w:pPr>
+                      <w:r>
+                        <w:rPr>
+                          <w:rFonts w:ascii="ＭＳ ゴシック;MS Gothic" w:hAnsi="ＭＳ ゴシック;MS Gothic" w:cs="ＭＳ ゴシック;MS Gothic" w:eastAsia="ＭＳ ゴシック;MS Gothic"/>
+                          <w:color w:val="000000"/>
+                        </w:rPr>
+                        <w:t xml:space="preserve">事務局（一般財団法人アジア防災センター）担当：荒木田</w:t>
+                      </w:r>
+                      <w:r>
+                        <w:rPr>
+                          <w:rFonts w:ascii="ＭＳ ゴシック;MS Gothic" w:hAnsi="ＭＳ ゴシック;MS Gothic" w:cs="ＭＳ ゴシック;MS Gothic" w:eastAsia="ＭＳ ゴシック;MS Gothic"/>
+                        </w:rPr>
+                        <w:t/>
+                      </w:r>
+                    </w:p>
+                    <w:p>
+                      <w:pPr>
+                        <w:pStyle w:val="Normal"/>
+                        <w:spacing w:lineRule="exact" w:line="280"/>
+                        <w:ind w:firstLine="705" w:right="0"/>
+                        <w:jc w:val="left"/>
+                        <w:rPr>
+                          <w:rFonts w:ascii="ＭＳ ゴシック;MS Gothic" w:hAnsi="ＭＳ ゴシック;MS Gothic" w:eastAsia="ＭＳ ゴシック;MS Gothic" w:cs="ＭＳ ゴシック;MS Gothic"/>
+                        </w:rPr>
+                      </w:pPr>
+                      <w:r>
+                        <w:rPr>
+                          <w:rFonts w:eastAsia="ＭＳ ゴシック;MS Gothic" w:cs="ＭＳ ゴシック;MS Gothic" w:ascii="ＭＳ ゴシック;MS Gothic" w:hAnsi="ＭＳ ゴシック;MS Gothic"/>
+                        </w:rPr>
+                        <w:t xml:space="preserve">E-mail　ma-arakida@adrc.asia, acdr2026sgp@adrc.asia</w:t>
+                      </w:r>
+                      <w:r>
+                        <w:rPr>
+                          <w:rFonts w:ascii="ＭＳ ゴシック;MS Gothic" w:hAnsi="ＭＳ ゴシック;MS Gothic" w:cs="ＭＳ ゴシック;MS Gothic" w:eastAsia="ＭＳ ゴシック;MS Gothic"/>
+                        </w:rPr>
+                        <w:t/>
+                      </w:r>
+                      <w:r>
+                        <w:rPr>
+                          <w:rFonts w:eastAsia="ＭＳ ゴシック;MS Gothic" w:cs="ＭＳ ゴシック;MS Gothic" w:ascii="ＭＳ ゴシック;MS Gothic" w:hAnsi="ＭＳ ゴシック;MS Gothic"/>
+                        </w:rPr>
+                        <w:t/>
+                      </w:r>
+                    </w:p>
+                    <w:p>
+                      <w:pPr>
+                        <w:pStyle w:val="Normal"/>
+                        <w:spacing w:lineRule="exact" w:line="280"/>
+                        <w:ind w:firstLine="705" w:right="0"/>
+                        <w:jc w:val="left"/>
+                        <w:rPr>
+                          <w:rFonts w:ascii="ＭＳ ゴシック;MS Gothic" w:hAnsi="ＭＳ ゴシック;MS Gothic" w:eastAsia="ＭＳ ゴシック;MS Gothic" w:cs="ＭＳ ゴシック;MS Gothic"/>
+                        </w:rPr>
+                      </w:pPr>
+                      <w:r>
+                        <w:rPr>
+                          <w:rFonts w:eastAsia="ＭＳ ゴシック;MS Gothic" w:cs="ＭＳ ゴシック;MS Gothic" w:ascii="ＭＳ ゴシック;MS Gothic" w:hAnsi="ＭＳ ゴシック;MS Gothic"/>
+                        </w:rPr>
+                        <w:t>TEL 078-262-5540 FAX 078-262-5546</w:t>
+                      </w:r>
+                    </w:p>
+                    <w:p>
+                      <w:pPr>
+                        <w:pStyle w:val="Normal"/>
+                        <w:spacing w:lineRule="exact" w:line="280"/>
+                        <w:jc w:val="left"/>
+                        <w:rPr>
+                          <w:rFonts w:ascii="ＭＳ ゴシック;MS Gothic" w:hAnsi="ＭＳ ゴシック;MS Gothic" w:eastAsia="ＭＳ ゴシック;MS Gothic" w:cs="ＭＳ ゴシック;MS Gothic"/>
+                        </w:rPr>
+                      </w:pPr>
+                      <w:r>
+                        <w:rPr>
+                          <w:rFonts w:ascii="ＭＳ ゴシック;MS Gothic" w:hAnsi="ＭＳ ゴシック;MS Gothic" w:cs="ＭＳ ゴシック;MS Gothic" w:eastAsia="ＭＳ ゴシック;MS Gothic"/>
+                        </w:rPr>
+                        <w:t>　●その他全般に関すること</w:t>
+                      </w:r>
+                    </w:p>
+                    <w:p>
+                      <w:pPr>
+                        <w:pStyle w:val="Normal"/>
+                        <w:spacing w:lineRule="exact" w:line="280"/>
+                        <w:ind w:firstLine="705" w:right="0"/>
+                        <w:jc w:val="left"/>
+                        <w:rPr>
+                          <w:rFonts w:ascii="ＭＳ ゴシック;MS Gothic" w:hAnsi="ＭＳ ゴシック;MS Gothic" w:eastAsia="ＭＳ ゴシック;MS Gothic" w:cs="ＭＳ ゴシック;MS Gothic"/>
+                          <w:color w:val="000000"/>
+                        </w:rPr>
+                      </w:pPr>
+                      <w:r>
+                        <w:rPr>
+                          <w:rFonts w:ascii="ＭＳ ゴシック;MS Gothic" w:hAnsi="ＭＳ ゴシック;MS Gothic" w:cs="ＭＳ ゴシック;MS Gothic" w:eastAsia="ＭＳ ゴシック;MS Gothic"/>
+                          <w:color w:val="000000"/>
+                        </w:rPr>
+                        <w:t>内閣府政策統括官（防災担当）付参事官（普及啓発・連携担当）付</w:t>
+                      </w:r>
+                    </w:p>
+                    <w:p>
+                      <w:pPr>
+                        <w:pStyle w:val="Normal"/>
+                        <w:spacing w:lineRule="exact" w:line="280"/>
+                        <w:jc w:val="left"/>
+                        <w:rPr/>
+                      </w:pPr>
+                      <w:r>
+                        <w:rPr>
+                          <w:rFonts w:ascii="ＭＳ ゴシック;MS Gothic" w:hAnsi="ＭＳ ゴシック;MS Gothic" w:cs="ＭＳ ゴシック;MS Gothic" w:eastAsia="ＭＳ ゴシック;MS Gothic"/>
+                          <w:color w:val="000000"/>
+                        </w:rPr>
+                        <w:t xml:space="preserve">　　　担当：〇〇　TEL 03-3502-6984 FAX 03-3581-7510</w:t>
+                      </w:r>
+                      <w:r>
+                        <w:rPr>
+                          <w:rFonts w:eastAsia="ＭＳ ゴシック;MS Gothic" w:cs="ＭＳ ゴシック;MS Gothic" w:ascii="ＭＳ ゴシック;MS Gothic" w:hAnsi="ＭＳ ゴシック;MS Gothic"/>
+                          <w:color w:val="000000"/>
+                        </w:rPr>
+                        <w:t/>
+                      </w:r>
+                    </w:p>
+                  </w:txbxContent>
+                </v:textbox>
+                <w10:wrap type="none"/>
+              </v:rect>
+            </w:pict>
+          </mc:Fallback>
+        </mc:AlternateContent>
       </w:r>
     </w:p>
     <w:sectPr>
-      <w:headerReference w:type="even" r:id="rId6"/>
-      <w:headerReference w:type="default" r:id="rId7"/>
-      <w:headerReference w:type="first" r:id="rId8"/>
-      <w:footerReference w:type="even" r:id="rId9"/>
-      <w:footerReference w:type="default" r:id="rId10"/>
-      <w:footerReference w:type="first" r:id="rId11"/>
+      <w:headerReference w:type="even" r:id="rId5"/>
+      <w:headerReference w:type="default" r:id="rId6"/>
+      <w:headerReference w:type="first" r:id="rId7"/>
+      <w:footerReference w:type="even" r:id="rId8"/>
+      <w:footerReference w:type="default" r:id="rId9"/>
+      <w:footerReference w:type="first" r:id="rId10"/>
       <w:type w:val="nextPage"/>
       <w:pgSz w:w="11906" w:h="16838"/>
       <w:pgMar w:left="1134" w:right="1134" w:gutter="0" w:header="720" w:top="777" w:footer="720" w:bottom="777"/>
@@ -793,248 +1158,6 @@
 </w:hdr>
 </file>
 
-<file path=word/numbering.xml><?xml version="1.0" encoding="utf-8"?>
-<w:numbering xmlns:w="http://schemas.openxmlformats.org/wordprocessingml/2006/main" xmlns:o="urn:schemas-microsoft-com:office:office" xmlns:r="http://schemas.openxmlformats.org/officeDocument/2006/relationships" xmlns:v="urn:schemas-microsoft-com:vml" xmlns:mc="http://schemas.openxmlformats.org/markup-compatibility/2006" xmlns:w14="http://schemas.microsoft.com/office/word/2010/wordml" mc:Ignorable="w14">
-  <w:abstractNum w:abstractNumId="1">
-    <w:lvl w:ilvl="0">
-      <w:numFmt w:val="bullet"/>
-      <w:lvlText w:val="※"/>
-      <w:lvlJc w:val="left"/>
-      <w:pPr>
-        <w:tabs>
-          <w:tab w:val="num" w:pos="0"/>
-        </w:tabs>
-        <w:ind w:left="595" w:hanging="360"/>
-      </w:pPr>
-      <w:rPr>
-        <w:rFonts w:ascii="ＭＳ ゴシック" w:hAnsi="ＭＳ ゴシック" w:cs="ＭＳ ゴシック" w:hint="default"/>
-      </w:rPr>
-    </w:lvl>
-    <w:lvl w:ilvl="1">
-      <w:start w:val="1"/>
-      <w:numFmt w:val="decimal"/>
-      <w:lvlText w:val="%2."/>
-      <w:lvlJc w:val="left"/>
-      <w:pPr>
-        <w:tabs>
-          <w:tab w:val="num" w:pos="1080"/>
-        </w:tabs>
-        <w:ind w:left="1080" w:hanging="360"/>
-      </w:pPr>
-    </w:lvl>
-    <w:lvl w:ilvl="2">
-      <w:start w:val="1"/>
-      <w:numFmt w:val="decimal"/>
-      <w:lvlText w:val="%3."/>
-      <w:lvlJc w:val="left"/>
-      <w:pPr>
-        <w:tabs>
-          <w:tab w:val="num" w:pos="1440"/>
-        </w:tabs>
-        <w:ind w:left="1440" w:hanging="360"/>
-      </w:pPr>
-    </w:lvl>
-    <w:lvl w:ilvl="3">
-      <w:start w:val="1"/>
-      <w:numFmt w:val="decimal"/>
-      <w:lvlText w:val="%4."/>
-      <w:lvlJc w:val="left"/>
-      <w:pPr>
-        <w:tabs>
-          <w:tab w:val="num" w:pos="1800"/>
-        </w:tabs>
-        <w:ind w:left="1800" w:hanging="360"/>
-      </w:pPr>
-    </w:lvl>
-    <w:lvl w:ilvl="4">
-      <w:start w:val="1"/>
-      <w:numFmt w:val="decimal"/>
-      <w:lvlText w:val="%5."/>
-      <w:lvlJc w:val="left"/>
-      <w:pPr>
-        <w:tabs>
-          <w:tab w:val="num" w:pos="2160"/>
-        </w:tabs>
-        <w:ind w:left="2160" w:hanging="360"/>
-      </w:pPr>
-    </w:lvl>
-    <w:lvl w:ilvl="5">
-      <w:start w:val="1"/>
-      <w:numFmt w:val="decimal"/>
-      <w:lvlText w:val="%6."/>
-      <w:lvlJc w:val="left"/>
-      <w:pPr>
-        <w:tabs>
-          <w:tab w:val="num" w:pos="2520"/>
-        </w:tabs>
-        <w:ind w:left="2520" w:hanging="360"/>
-      </w:pPr>
-    </w:lvl>
-    <w:lvl w:ilvl="6">
-      <w:start w:val="1"/>
-      <w:numFmt w:val="decimal"/>
-      <w:lvlText w:val="%7."/>
-      <w:lvlJc w:val="left"/>
-      <w:pPr>
-        <w:tabs>
-          <w:tab w:val="num" w:pos="2880"/>
-        </w:tabs>
-        <w:ind w:left="2880" w:hanging="360"/>
-      </w:pPr>
-    </w:lvl>
-    <w:lvl w:ilvl="7">
-      <w:start w:val="1"/>
-      <w:numFmt w:val="decimal"/>
-      <w:lvlText w:val="%8."/>
-      <w:lvlJc w:val="left"/>
-      <w:pPr>
-        <w:tabs>
-          <w:tab w:val="num" w:pos="3240"/>
-        </w:tabs>
-        <w:ind w:left="3240" w:hanging="360"/>
-      </w:pPr>
-    </w:lvl>
-    <w:lvl w:ilvl="8">
-      <w:start w:val="1"/>
-      <w:numFmt w:val="decimal"/>
-      <w:lvlText w:val="%9."/>
-      <w:lvlJc w:val="left"/>
-      <w:pPr>
-        <w:tabs>
-          <w:tab w:val="num" w:pos="3600"/>
-        </w:tabs>
-        <w:ind w:left="3600" w:hanging="360"/>
-      </w:pPr>
-    </w:lvl>
-  </w:abstractNum>
-  <w:abstractNum w:abstractNumId="2">
-    <w:lvl w:ilvl="0">
-      <w:start w:val="1"/>
-      <w:numFmt w:val="none"/>
-      <w:suff w:val="nothing"/>
-      <w:lvlText w:val=""/>
-      <w:lvlJc w:val="left"/>
-      <w:pPr>
-        <w:tabs>
-          <w:tab w:val="num" w:pos="0"/>
-        </w:tabs>
-        <w:ind w:left="0" w:hanging="0"/>
-      </w:pPr>
-    </w:lvl>
-    <w:lvl w:ilvl="1">
-      <w:start w:val="1"/>
-      <w:numFmt w:val="none"/>
-      <w:suff w:val="nothing"/>
-      <w:lvlText w:val=""/>
-      <w:lvlJc w:val="left"/>
-      <w:pPr>
-        <w:tabs>
-          <w:tab w:val="num" w:pos="0"/>
-        </w:tabs>
-        <w:ind w:left="0" w:hanging="0"/>
-      </w:pPr>
-    </w:lvl>
-    <w:lvl w:ilvl="2">
-      <w:start w:val="1"/>
-      <w:numFmt w:val="none"/>
-      <w:suff w:val="nothing"/>
-      <w:lvlText w:val=""/>
-      <w:lvlJc w:val="left"/>
-      <w:pPr>
-        <w:tabs>
-          <w:tab w:val="num" w:pos="0"/>
-        </w:tabs>
-        <w:ind w:left="0" w:hanging="0"/>
-      </w:pPr>
-    </w:lvl>
-    <w:lvl w:ilvl="3">
-      <w:start w:val="1"/>
-      <w:numFmt w:val="none"/>
-      <w:suff w:val="nothing"/>
-      <w:lvlText w:val=""/>
-      <w:lvlJc w:val="left"/>
-      <w:pPr>
-        <w:tabs>
-          <w:tab w:val="num" w:pos="0"/>
-        </w:tabs>
-        <w:ind w:left="0" w:hanging="0"/>
-      </w:pPr>
-    </w:lvl>
-    <w:lvl w:ilvl="4">
-      <w:start w:val="1"/>
-      <w:numFmt w:val="none"/>
-      <w:suff w:val="nothing"/>
-      <w:lvlText w:val=""/>
-      <w:lvlJc w:val="left"/>
-      <w:pPr>
-        <w:tabs>
-          <w:tab w:val="num" w:pos="0"/>
-        </w:tabs>
-        <w:ind w:left="0" w:hanging="0"/>
-      </w:pPr>
-    </w:lvl>
-    <w:lvl w:ilvl="5">
-      <w:start w:val="1"/>
-      <w:numFmt w:val="none"/>
-      <w:suff w:val="nothing"/>
-      <w:lvlText w:val=""/>
-      <w:lvlJc w:val="left"/>
-      <w:pPr>
-        <w:tabs>
-          <w:tab w:val="num" w:pos="0"/>
-        </w:tabs>
-        <w:ind w:left="0" w:hanging="0"/>
-      </w:pPr>
-    </w:lvl>
-    <w:lvl w:ilvl="6">
-      <w:start w:val="1"/>
-      <w:numFmt w:val="none"/>
-      <w:suff w:val="nothing"/>
-      <w:lvlText w:val=""/>
-      <w:lvlJc w:val="left"/>
-      <w:pPr>
-        <w:tabs>
-          <w:tab w:val="num" w:pos="0"/>
-        </w:tabs>
-        <w:ind w:left="0" w:hanging="0"/>
-      </w:pPr>
-    </w:lvl>
-    <w:lvl w:ilvl="7">
-      <w:start w:val="1"/>
-      <w:numFmt w:val="none"/>
-      <w:suff w:val="nothing"/>
-      <w:lvlText w:val=""/>
-      <w:lvlJc w:val="left"/>
-      <w:pPr>
-        <w:tabs>
-          <w:tab w:val="num" w:pos="0"/>
-        </w:tabs>
-        <w:ind w:left="0" w:hanging="0"/>
-      </w:pPr>
-    </w:lvl>
-    <w:lvl w:ilvl="8">
-      <w:start w:val="1"/>
-      <w:numFmt w:val="none"/>
-      <w:suff w:val="nothing"/>
-      <w:lvlText w:val=""/>
-      <w:lvlJc w:val="left"/>
-      <w:pPr>
-        <w:tabs>
-          <w:tab w:val="num" w:pos="0"/>
-        </w:tabs>
-        <w:ind w:left="0" w:hanging="0"/>
-      </w:pPr>
-    </w:lvl>
-  </w:abstractNum>
-  <w:num w:numId="1">
-    <w:abstractNumId w:val="1"/>
-  </w:num>
-  <w:num w:numId="2">
-    <w:abstractNumId w:val="2"/>
-  </w:num>
-</w:numbering>
-</file>
-
 <file path=word/styles.xml><?xml version="1.0" encoding="utf-8"?>
 <w:styles xmlns:w="http://schemas.openxmlformats.org/wordprocessingml/2006/main" xmlns:w14="http://schemas.microsoft.com/office/word/2010/wordml" xmlns:mc="http://schemas.openxmlformats.org/markup-compatibility/2006" mc:Ignorable="w14">
   <w:docDefaults>
@@ -1089,7 +1212,7 @@
     <w:name w:val="WW8Num2z0"/>
     <w:qFormat/>
     <w:rPr>
-      <w:rFonts w:ascii="ＭＳ ゴシック;MS Gothic" w:hAnsi="ＭＳ ゴシック;MS Gothic" w:eastAsia="ＭＳ ゴシック;MS Gothic" w:cs="ＭＳ ゴシック;MS Gothic"/>
+      <w:rFonts w:ascii="Calibri" w:hAnsi="Calibri" w:eastAsia="ＭＳ Ｐゴシック" w:cs="Calibri"/>
     </w:rPr>
   </w:style>
   <w:style w:type="character" w:styleId="WW8Num2z1">
@@ -1103,25 +1226,11 @@
     <w:name w:val="WW8Num3z0"/>
     <w:qFormat/>
     <w:rPr>
-      <w:rFonts w:ascii="Calibri" w:hAnsi="Calibri" w:eastAsia="ＭＳ Ｐゴシック" w:cs="Calibri"/>
+      <w:rFonts w:ascii="ＭＳ ゴシック;MS Gothic" w:hAnsi="ＭＳ ゴシック;MS Gothic" w:eastAsia="ＭＳ ゴシック;MS Gothic" w:cs="ＭＳ ゴシック;MS Gothic"/>
     </w:rPr>
   </w:style>
   <w:style w:type="character" w:styleId="WW8Num3z1">
     <w:name w:val="WW8Num3z1"/>
-    <w:qFormat/>
-    <w:rPr>
-      <w:rFonts w:ascii="Wingdings" w:hAnsi="Wingdings" w:cs="Wingdings"/>
-    </w:rPr>
-  </w:style>
-  <w:style w:type="character" w:styleId="WW8Num4z0">
-    <w:name w:val="WW8Num4z0"/>
-    <w:qFormat/>
-    <w:rPr>
-      <w:rFonts w:ascii="ＭＳ ゴシック;MS Gothic" w:hAnsi="ＭＳ ゴシック;MS Gothic" w:eastAsia="ＭＳ ゴシック;MS Gothic" w:cs="ＭＳ ゴシック;MS Gothic"/>
-    </w:rPr>
-  </w:style>
-  <w:style w:type="character" w:styleId="WW8Num4z1">
-    <w:name w:val="WW8Num4z1"/>
     <w:qFormat/>
     <w:rPr>
       <w:rFonts w:ascii="Wingdings" w:hAnsi="Wingdings" w:cs="Wingdings"/>
@@ -1431,10 +1540,6 @@
   </w:style>
   <w:style w:type="numbering" w:styleId="WW8Num3">
     <w:name w:val="WW8Num3"/>
-    <w:qFormat/>
-  </w:style>
-  <w:style w:type="numbering" w:styleId="WW8Num4">
-    <w:name w:val="WW8Num4"/>
     <w:qFormat/>
   </w:style>
 </w:styles>

</xml_diff>

<commit_message>
Cabinet Office press paper: 2025 layout with logo, 2024-style co-host content
Co-Authored-By: Claude Fable 5.1 <noreply@anthropic.com>
Claude-Session: https://claude.ai/code/session_01BHBsW6jxyH2X7L51FtZqxc
</commit_message>
<xml_diff>
--- a/reports/acdr2026_staff_deployment/広報資料_ACDR2026_0928/内閣府記者発表資料_ACDR2026_案_0928.docx
+++ b/reports/acdr2026_staff_deployment/広報資料_ACDR2026_0928/内閣府記者発表資料_ACDR2026_案_0928.docx
@@ -17,6 +17,54 @@
         </w:rPr>
         <w:t>令和８年10月　日</w:t>
       </w:r>
+      <w:r>
+        <w:drawing>
+          <wp:anchor behindDoc="0" distT="0" distB="0" distL="0" distR="0" simplePos="0" locked="0" layoutInCell="1" allowOverlap="1" relativeHeight="2">
+            <wp:simplePos x="0" y="0"/>
+            <wp:positionH relativeFrom="column">
+              <wp:posOffset>-2540</wp:posOffset>
+            </wp:positionH>
+            <wp:positionV relativeFrom="paragraph">
+              <wp:posOffset>-388620</wp:posOffset>
+            </wp:positionV>
+            <wp:extent cx="1200150" cy="1000760"/>
+            <wp:effectExtent l="0" t="0" r="0" b="0"/>
+            <wp:wrapNone/>
+            <wp:docPr id="1" name="Image1" descr=""/>
+            <wp:cNvGraphicFramePr>
+              <a:graphicFrameLocks xmlns:a="http://schemas.openxmlformats.org/drawingml/2006/main" noChangeAspect="1"/>
+            </wp:cNvGraphicFramePr>
+            <a:graphic xmlns:a="http://schemas.openxmlformats.org/drawingml/2006/main">
+              <a:graphicData uri="http://schemas.openxmlformats.org/drawingml/2006/picture">
+                <pic:pic xmlns:pic="http://schemas.openxmlformats.org/drawingml/2006/picture">
+                  <pic:nvPicPr>
+                    <pic:cNvPr id="1" name="Image1" descr=""/>
+                    <pic:cNvPicPr>
+                      <a:picLocks noChangeAspect="1" noChangeArrowheads="1"/>
+                    </pic:cNvPicPr>
+                  </pic:nvPicPr>
+                  <pic:blipFill>
+                    <a:blip r:embed="rId2"/>
+                    <a:srcRect l="-20" t="-24" r="-20" b="-24"/>
+                    <a:stretch>
+                      <a:fillRect/>
+                    </a:stretch>
+                  </pic:blipFill>
+                  <pic:spPr bwMode="auto">
+                    <a:xfrm>
+                      <a:off x="0" y="0"/>
+                      <a:ext cx="1200150" cy="1000760"/>
+                    </a:xfrm>
+                    <a:prstGeom prst="rect">
+                      <a:avLst/>
+                    </a:prstGeom>
+                  </pic:spPr>
+                </pic:pic>
+              </a:graphicData>
+            </a:graphic>
+          </wp:anchor>
+        </w:drawing>
+      </w:r>
     </w:p>
     <w:p>
       <w:pPr>
@@ -131,8 +179,8 @@
         <w:rPr>
           <w:rFonts w:ascii="ＭＳ ゴシック;MS Gothic" w:hAnsi="ＭＳ ゴシック;MS Gothic" w:eastAsia="ＭＳ ゴシック;MS Gothic" w:cs="ＭＳ ゴシック;MS Gothic"/>
           <w:b/>
-          <w:sz w:val="28"/>
-          <w:szCs w:val="28"/>
+          <w:sz w:val="24"/>
+          <w:szCs w:val="24"/>
         </w:rPr>
       </w:pPr>
       <w:r>
@@ -194,32 +242,35 @@
         <w:pStyle w:val="Normal"/>
         <w:ind w:firstLine="235" w:right="0"/>
         <w:rPr>
+          <w:rFonts w:ascii="ＭＳ ゴシック;MS Gothic" w:hAnsi="ＭＳ ゴシック;MS Gothic" w:eastAsia="ＭＳ ゴシック;MS Gothic" w:cs="ＭＳ ゴシック;MS Gothic"/>
+        </w:rPr>
+      </w:pPr>
+      <w:bookmarkStart w:id="0" w:name="_Hlk215130208"/>
+      <w:bookmarkStart w:id="1" w:name="_Hlk215587818"/>
+      <w:bookmarkEnd w:id="1"/>
+      <w:r>
+        <w:rPr>
+          <w:rFonts w:ascii="ＭＳ ゴシック;MS Gothic" w:hAnsi="ＭＳ ゴシック;MS Gothic" w:cs="ＭＳ Ｐゴシック" w:eastAsia="ＭＳ ゴシック;MS Gothic"/>
+          <w:kern w:val="0"/>
+        </w:rPr>
+        <w:t>内閣府政策統括官（防災担当）は、一般財団法人アジア防災センター（ADRC）と共同して、毎年「アジア防災会議」を開催しています。今回はシンガポール共和国において、シンガポール民間防衛庁（SCDF）を共同ホストとして、シンガポール国際防災・危機管理エキスポ（SIDEX）との合同開催「SIDEX-ACDR2026」の中で開催しますのでお知らせします。</w:t>
+      </w:r>
+      <w:bookmarkEnd w:id="0"/>
+    </w:p>
+    <w:p>
+      <w:pPr>
+        <w:pStyle w:val="Normal"/>
+        <w:ind w:firstLine="235" w:right="0"/>
+        <w:rPr>
           <w:rFonts w:ascii="ＭＳ ゴシック;MS Gothic" w:hAnsi="ＭＳ ゴシック;MS Gothic" w:eastAsia="ＭＳ ゴシック;MS Gothic" w:cs="ＭＳ Ｐゴシック"/>
           <w:kern w:val="0"/>
         </w:rPr>
       </w:pPr>
       <w:r>
         <w:rPr>
-          <w:rFonts w:ascii="ＭＳ ゴシック;MS Gothic" w:hAnsi="ＭＳ ゴシック;MS Gothic" w:cs="ＭＳ Ｐゴシック" w:eastAsia="ＭＳ ゴシック;MS Gothic"/>
-          <w:kern w:val="0"/>
-        </w:rPr>
-        <w:t>内閣府政策統括官（防災担当）は、一般財団法人アジア防災センター（ADRC）と共同して、毎年「アジア防災会議」を開催しています。今回はシンガポール共和国において、シンガポール民間防衛庁（SCDF）を共同ホストとして、シンガポール国際防災・危機管理エキスポ（SIDEX）との合同開催「SIDEX-ACDR2026」の中で開催しますのでお知らせします。なお、ACDR2026ウェビナー（URLは確定後に記載）より、どなたでも会議を御覧いただけます。</w:t>
-      </w:r>
-    </w:p>
-    <w:p>
-      <w:pPr>
-        <w:pStyle w:val="Normal"/>
-        <w:jc w:val="left"/>
-        <w:rPr>
-          <w:rFonts w:ascii="ＭＳ ゴシック;MS Gothic" w:hAnsi="ＭＳ ゴシック;MS Gothic" w:eastAsia="ＭＳ ゴシック;MS Gothic" w:cs="ＭＳ ゴシック;MS Gothic"/>
-          <w:kern w:val="0"/>
-        </w:rPr>
-      </w:pPr>
-      <w:r>
-        <w:rPr>
-          <w:rFonts w:eastAsia="ＭＳ ゴシック;MS Gothic" w:cs="ＭＳ ゴシック;MS Gothic" w:ascii="ＭＳ ゴシック;MS Gothic" w:hAnsi="ＭＳ ゴシック;MS Gothic"/>
-          <w:kern w:val="0"/>
-        </w:rPr>
+          <w:rFonts w:ascii="ＭＳ ゴシック;MS Gothic" w:hAnsi="ＭＳ ゴシック;MS Gothic" w:cs="ＭＳ ゴシック;MS Gothic" w:eastAsia="ＭＳ ゴシック;MS Gothic"/>
+        </w:rPr>
+        <w:t>なお、ACDR2026ウェビナー（URLは確定後に記載）より、どなたでも会議を御覧いただけます。</w:t>
       </w:r>
     </w:p>
     <w:p>
@@ -276,7 +327,7 @@
           <w:rFonts w:ascii="ＭＳ ゴシック;MS Gothic" w:hAnsi="ＭＳ ゴシック;MS Gothic" w:cs="ＭＳ ゴシック;MS Gothic" w:eastAsia="ＭＳ ゴシック;MS Gothic"/>
           <w:color w:val="000000"/>
         </w:rPr>
-        <w:t>１　日程　　令和８年10月28日（水）、29日（木）</w:t>
+        <w:t>１　日程　　令和８年10月28日（水）、29日（木）　※プログラムは別紙ご参照</w:t>
       </w:r>
     </w:p>
     <w:p>
@@ -315,6 +366,8 @@
         </w:rPr>
         <w:t>２　場所  　シンガポールEXPO（シンガポール共和国）</w:t>
       </w:r>
+      <w:bookmarkStart w:id="4" w:name="_Hlk215128959"/>
+      <w:bookmarkEnd w:id="4"/>
     </w:p>
     <w:p>
       <w:pPr>
@@ -368,6 +421,8 @@
         </w:rPr>
         <w:t>３　主催　　内閣府政策統括官（防災担当）、一般財団法人アジア防災センター（ADRC）、</w:t>
       </w:r>
+      <w:bookmarkStart w:id="5" w:name="_Hlk215587965"/>
+      <w:bookmarkEnd w:id="5"/>
     </w:p>
     <w:p>
       <w:pPr>
@@ -377,7 +432,10 @@
           <w:tab w:val="left" w:pos="1100" w:leader="none"/>
         </w:tabs>
         <w:ind w:hanging="1881" w:left="1881" w:right="0"/>
-        <w:rPr/>
+        <w:rPr>
+          <w:rFonts w:ascii="ＭＳ ゴシック;MS Gothic" w:hAnsi="ＭＳ ゴシック;MS Gothic" w:eastAsia="ＭＳ ゴシック;MS Gothic" w:cs="ＭＳ ゴシック;MS Gothic"/>
+          <w:color w:val="000000"/>
+        </w:rPr>
       </w:pPr>
       <w:r>
         <w:rPr>
@@ -395,7 +453,10 @@
           <w:tab w:val="left" w:pos="1100" w:leader="none"/>
         </w:tabs>
         <w:ind w:hanging="1881" w:left="1881" w:right="0"/>
-        <w:rPr/>
+        <w:rPr>
+          <w:rFonts w:ascii="ＭＳ ゴシック;MS Gothic" w:hAnsi="ＭＳ ゴシック;MS Gothic" w:eastAsia="ＭＳ ゴシック;MS Gothic" w:cs="ＭＳ ゴシック;MS Gothic"/>
+          <w:color w:val="000000"/>
+        </w:rPr>
       </w:pPr>
       <w:r>
         <w:rPr>
@@ -429,8 +490,7 @@
         <w:rPr>
           <w:rFonts w:ascii="ＭＳ ゴシック;MS Gothic" w:hAnsi="ＭＳ ゴシック;MS Gothic" w:cs="ＭＳ ゴシック;MS Gothic" w:eastAsia="ＭＳ ゴシック;MS Gothic"/>
           <w:color w:val="000000"/>
-          <w:spacing w:val="96"/>
-          <w:w w:val="78"/>
+          <w:spacing w:val="55"/>
           <w:kern w:val="0"/>
         </w:rPr>
         <w:t>参加</w:t>
@@ -439,19 +499,12 @@
         <w:rPr>
           <w:rFonts w:ascii="ＭＳ ゴシック;MS Gothic" w:hAnsi="ＭＳ ゴシック;MS Gothic" w:cs="ＭＳ ゴシック;MS Gothic" w:eastAsia="ＭＳ ゴシック;MS Gothic"/>
           <w:color w:val="000000"/>
-          <w:w w:val="78"/>
           <w:kern w:val="0"/>
         </w:rPr>
-        <w:t>者</w:t>
-      </w:r>
-      <w:r>
-        <w:rPr>
-          <w:rFonts w:ascii="ＭＳ ゴシック;MS Gothic" w:hAnsi="ＭＳ ゴシック;MS Gothic" w:cs="ＭＳ ゴシック;MS Gothic" w:eastAsia="ＭＳ ゴシック;MS Gothic"/>
-          <w:color w:val="000000"/>
-          <w:kern w:val="0"/>
-        </w:rPr>
-        <w:t>　　</w:t>
-      </w:r>
+        <w:t>者　　</w:t>
+      </w:r>
+      <w:bookmarkStart w:id="6" w:name="_Hlk215587998"/>
+      <w:bookmarkStart w:id="7" w:name="_Hlk215129032"/>
       <w:r>
         <w:rPr>
           <w:rFonts w:eastAsia="ＭＳ ゴシック;MS Gothic" w:cs="ＭＳ ゴシック;MS Gothic" w:ascii="ＭＳ ゴシック;MS Gothic" w:hAnsi="ＭＳ ゴシック;MS Gothic"/>
@@ -464,7 +517,15 @@
           <w:rFonts w:ascii="ＭＳ ゴシック;MS Gothic" w:hAnsi="ＭＳ ゴシック;MS Gothic" w:cs="ＭＳ ゴシック;MS Gothic" w:eastAsia="ＭＳ ゴシック;MS Gothic"/>
           <w:color w:val="000000"/>
         </w:rPr>
-        <w:t>のメンバー国政府の防災関係者、国連等関係機関防災担当者、</w:t>
+        <w:t>のメンバー国政府の防災機関関係者</w:t>
+      </w:r>
+      <w:bookmarkEnd w:id="7"/>
+      <w:r>
+        <w:rPr>
+          <w:rFonts w:ascii="ＭＳ ゴシック;MS Gothic" w:hAnsi="ＭＳ ゴシック;MS Gothic" w:cs="ＭＳ ゴシック;MS Gothic" w:eastAsia="ＭＳ ゴシック;MS Gothic"/>
+          <w:color w:val="000000"/>
+        </w:rPr>
+        <w:t>、国連等関係機関防災担当者、</w:t>
       </w:r>
     </w:p>
     <w:p>
@@ -493,38 +554,19 @@
         <w:pStyle w:val="Normal"/>
         <w:rPr>
           <w:rFonts w:ascii="ＭＳ ゴシック;MS Gothic" w:hAnsi="ＭＳ ゴシック;MS Gothic" w:eastAsia="ＭＳ ゴシック;MS Gothic" w:cs="ＭＳ ゴシック;MS Gothic"/>
-        </w:rPr>
-      </w:pPr>
-      <w:r>
-        <w:rPr>
-          <w:rFonts w:ascii="ＭＳ ゴシック;MS Gothic" w:hAnsi="ＭＳ ゴシック;MS Gothic" w:cs="ＭＳ ゴシック;MS Gothic" w:eastAsia="ＭＳ ゴシック;MS Gothic"/>
-        </w:rPr>
-        <w:t>５　</w:t>
-      </w:r>
-      <w:r>
-        <w:rPr>
-          <w:rFonts w:ascii="ＭＳ ゴシック;MS Gothic" w:hAnsi="ＭＳ ゴシック;MS Gothic" w:cs="ＭＳ ゴシック;MS Gothic" w:eastAsia="ＭＳ ゴシック;MS Gothic"/>
-          <w:spacing w:val="53"/>
-          <w:w w:val="65"/>
           <w:kern w:val="0"/>
-        </w:rPr>
-        <w:t>使用言</w:t>
-      </w:r>
-      <w:r>
-        <w:rPr>
-          <w:rFonts w:ascii="ＭＳ ゴシック;MS Gothic" w:hAnsi="ＭＳ ゴシック;MS Gothic" w:cs="ＭＳ ゴシック;MS Gothic" w:eastAsia="ＭＳ ゴシック;MS Gothic"/>
-          <w:w w:val="65"/>
-          <w:kern w:val="0"/>
-        </w:rPr>
-        <w:t>語</w:t>
-      </w:r>
-      <w:r>
-        <w:rPr>
-          <w:rFonts w:ascii="ＭＳ ゴシック;MS Gothic" w:hAnsi="ＭＳ ゴシック;MS Gothic" w:cs="ＭＳ ゴシック;MS Gothic" w:eastAsia="ＭＳ ゴシック;MS Gothic"/>
-          <w:kern w:val="0"/>
-        </w:rPr>
-        <w:t>　　英語　</w:t>
-      </w:r>
+          <w:lang w:eastAsia="ja-JP"/>
+        </w:rPr>
+      </w:pPr>
+      <w:bookmarkEnd w:id="6"/>
+      <w:r>
+        <w:rPr>
+          <w:rFonts w:ascii="ＭＳ ゴシック;MS Gothic" w:hAnsi="ＭＳ ゴシック;MS Gothic" w:cs="ＭＳ ゴシック;MS Gothic" w:eastAsia="ＭＳ ゴシック;MS Gothic"/>
+        </w:rPr>
+        <w:t xml:space="preserve">５　使用言語　　英語　</w:t>
+      </w:r>
+      <w:bookmarkStart w:id="8" w:name="_Hlk215588146"/>
+      <w:bookmarkEnd w:id="8"/>
     </w:p>
     <w:p>
       <w:pPr>
@@ -538,7 +580,7 @@
         <w:rPr>
           <w:rFonts w:ascii="ＭＳ ゴシック;MS Gothic" w:hAnsi="ＭＳ ゴシック;MS Gothic" w:cs="ＭＳ ゴシック;MS Gothic" w:eastAsia="ＭＳ ゴシック;MS Gothic"/>
         </w:rPr>
-        <w:t>６　特設HP　 https://acdr.adrc.asia/home/acdr2026　※会議の詳細内容はこちら</w:t>
+        <w:t>６　特設HP　　https://acdr.adrc.asia/home/acdr2026　※会議の詳細内容はこちら</w:t>
       </w:r>
     </w:p>
     <w:p>
@@ -590,23 +632,70 @@
     <w:p>
       <w:pPr>
         <w:pStyle w:val="Normal"/>
-        <w:spacing w:lineRule="atLeast" w:line="0"/>
-        <w:rPr>
-          <w:rFonts w:ascii="ＭＳ ゴシック;MS Gothic" w:hAnsi="ＭＳ ゴシック;MS Gothic" w:eastAsia="ＭＳ ゴシック;MS Gothic" w:cs="ＭＳ ゴシック;MS Gothic"/>
-          <w:sz w:val="8"/>
-        </w:rPr>
-      </w:pPr>
+        <w:numPr>
+          <w:ilvl w:val="0"/>
+          <w:numId w:val="1"/>
+        </w:numPr>
+        <w:rPr>
+          <w:rFonts w:ascii="ＭＳ ゴシック;MS Gothic" w:hAnsi="ＭＳ ゴシック;MS Gothic" w:eastAsia="ＭＳ ゴシック;MS Gothic" w:cs="ＭＳ ゴシック;MS Gothic"/>
+          <w:b/>
+          <w:bCs/>
+        </w:rPr>
+      </w:pPr>
+      <w:r>
+        <w:rPr>
+          <w:rFonts w:ascii="ＭＳ ゴシック;MS Gothic" w:hAnsi="ＭＳ ゴシック;MS Gothic" w:cs="ＭＳ ゴシック;MS Gothic" w:eastAsia="ＭＳ ゴシック;MS Gothic"/>
+          <w:b/>
+          <w:bCs/>
+        </w:rPr>
+        <w:t>なお、お手数ですが、当日取材を希望される方は、事務局</w:t>
+      </w:r>
       <w:r>
         <w:rPr>
           <w:rFonts w:eastAsia="ＭＳ ゴシック;MS Gothic" w:cs="ＭＳ ゴシック;MS Gothic" w:ascii="ＭＳ ゴシック;MS Gothic" w:hAnsi="ＭＳ ゴシック;MS Gothic"/>
-          <w:sz w:val="8"/>
-        </w:rPr>
-      </w:r>
-    </w:p>
-    <w:p>
-      <w:pPr>
-        <w:pStyle w:val="Normal"/>
-        <w:spacing w:lineRule="atLeast" w:line="0"/>
+          <w:b/>
+          <w:bCs/>
+        </w:rPr>
+        <w:t>(</w:t>
+      </w:r>
+      <w:r>
+        <w:rPr>
+          <w:rFonts w:ascii="ＭＳ ゴシック;MS Gothic" w:hAnsi="ＭＳ ゴシック;MS Gothic" w:cs="ＭＳ ゴシック;MS Gothic" w:eastAsia="ＭＳ ゴシック;MS Gothic"/>
+          <w:b/>
+          <w:bCs/>
+        </w:rPr>
+        <w:t>一般財団法人アジア防災センター</w:t>
+      </w:r>
+      <w:r>
+        <w:rPr>
+          <w:rFonts w:eastAsia="ＭＳ ゴシック;MS Gothic" w:cs="ＭＳ ゴシック;MS Gothic" w:ascii="ＭＳ ゴシック;MS Gothic" w:hAnsi="ＭＳ ゴシック;MS Gothic"/>
+          <w:b/>
+          <w:bCs/>
+        </w:rPr>
+        <w:t>)</w:t>
+      </w:r>
+      <w:r>
+        <w:rPr>
+          <w:rFonts w:ascii="ＭＳ ゴシック;MS Gothic" w:hAnsi="ＭＳ ゴシック;MS Gothic" w:cs="ＭＳ ゴシック;MS Gothic" w:eastAsia="ＭＳ ゴシック;MS Gothic"/>
+          <w:b/>
+          <w:bCs/>
+        </w:rPr>
+        <w:t>に電話・メール等でご連絡をお願いします。</w:t>
+      </w:r>
+    </w:p>
+    <w:p>
+      <w:pPr>
+        <w:pStyle w:val="Normal"/>
+        <w:widowControl w:val="false"/>
+        <w:numPr>
+          <w:ilvl w:val="0"/>
+          <w:numId w:val="0"/>
+        </w:numPr>
+        <w:suppressAutoHyphens w:val="true"/>
+        <w:bidi w:val="0"/>
+        <w:spacing w:lineRule="atLeast" w:line="0" w:before="0" w:after="0"/>
+        <w:ind w:hanging="0" w:left="0"/>
+        <w:jc w:val="both"/>
         <w:rPr>
           <w:rFonts w:ascii="ＭＳ ゴシック;MS Gothic" w:hAnsi="ＭＳ ゴシック;MS Gothic" w:eastAsia="ＭＳ ゴシック;MS Gothic" w:cs="ＭＳ ゴシック;MS Gothic"/>
           <w:sz w:val="8"/>
@@ -619,429 +708,15 @@
           <w:sz w:val="8"/>
           <w:lang w:val="en-US" w:eastAsia="en-US"/>
         </w:rPr>
-        <mc:AlternateContent>
-          <mc:Choice Requires="wps">
-            <w:drawing>
-              <wp:anchor behindDoc="0" distT="0" distB="0" distL="0" distR="0" simplePos="0" locked="0" layoutInCell="1" allowOverlap="1" relativeHeight="3">
-                <wp:simplePos x="0" y="0"/>
-                <wp:positionH relativeFrom="column">
-                  <wp:posOffset>287020</wp:posOffset>
-                </wp:positionH>
-                <wp:positionV relativeFrom="paragraph">
-                  <wp:posOffset>49530</wp:posOffset>
-                </wp:positionV>
-                <wp:extent cx="5638800" cy="1524000"/>
-                <wp:effectExtent l="5080" t="5080" r="5080" b="5080"/>
-                <wp:wrapNone/>
-                <wp:docPr id="2" name="Frame1"/>
-                <a:graphic xmlns:a="http://schemas.openxmlformats.org/drawingml/2006/main">
-                  <a:graphicData uri="http://schemas.microsoft.com/office/word/2010/wordprocessingShape">
-                    <wps:wsp>
-                      <wps:cNvSpPr/>
-                      <wps:spPr>
-                        <a:xfrm>
-                          <a:off x="0" y="0"/>
-                          <a:ext cx="5638680" cy="1523880"/>
-                        </a:xfrm>
-                        <a:prstGeom prst="rect">
-                          <a:avLst/>
-                        </a:prstGeom>
-                        <a:noFill/>
-                        <a:ln w="9525">
-                          <a:solidFill>
-                            <a:srgbClr val="000000"/>
-                          </a:solidFill>
-                          <a:round/>
-                        </a:ln>
-                      </wps:spPr>
-                      <wps:style>
-                        <a:lnRef idx="0"/>
-                        <a:fillRef idx="0"/>
-                        <a:effectRef idx="0"/>
-                        <a:fontRef idx="minor"/>
-                      </wps:style>
-                      <wps:txbx>
-                        <w:txbxContent>
-                          <w:p>
-                            <w:pPr>
-                              <w:pStyle w:val="Normal"/>
-                              <w:spacing w:lineRule="exact" w:line="280"/>
-                              <w:ind w:firstLine="235" w:right="0"/>
-                              <w:jc w:val="left"/>
-                              <w:rPr>
-                                <w:rFonts w:ascii="ＭＳ ゴシック;MS Gothic" w:hAnsi="ＭＳ ゴシック;MS Gothic" w:eastAsia="ＭＳ ゴシック;MS Gothic" w:cs="ＭＳ ゴシック;MS Gothic"/>
-                                <w:b/>
-                                <w:color w:val="000000"/>
-                              </w:rPr>
-                            </w:pPr>
-                            <w:r>
-                              <w:rPr>
-                                <w:rFonts w:ascii="ＭＳ ゴシック;MS Gothic" w:hAnsi="ＭＳ ゴシック;MS Gothic" w:cs="ＭＳ ゴシック;MS Gothic" w:eastAsia="ＭＳ ゴシック;MS Gothic"/>
-                                <w:color w:val="000000"/>
-                              </w:rPr>
-                              <w:t>＜本件問合せ先＞　　</w:t>
-                            </w:r>
-                          </w:p>
-                          <w:p>
-                            <w:pPr>
-                              <w:pStyle w:val="Normal"/>
-                              <w:spacing w:lineRule="exact" w:line="280"/>
-                              <w:ind w:firstLine="235" w:right="0"/>
-                              <w:jc w:val="left"/>
-                              <w:rPr>
-                                <w:rFonts w:ascii="ＭＳ ゴシック;MS Gothic" w:hAnsi="ＭＳ ゴシック;MS Gothic" w:eastAsia="ＭＳ ゴシック;MS Gothic" w:cs="ＭＳ ゴシック;MS Gothic"/>
-                                <w:color w:val="000000"/>
-                              </w:rPr>
-                            </w:pPr>
-                            <w:r>
-                              <w:rPr>
-                                <w:rFonts w:eastAsia="ＭＳ ゴシック;MS Gothic" w:cs="ＭＳ ゴシック;MS Gothic" w:ascii="ＭＳ ゴシック;MS Gothic" w:hAnsi="ＭＳ ゴシック;MS Gothic"/>
-                                <w:color w:val="000000"/>
-                              </w:rPr>
-                              <w:t>●</w:t>
-                            </w:r>
-                            <w:r>
-                              <w:rPr>
-                                <w:rFonts w:ascii="ＭＳ ゴシック;MS Gothic" w:hAnsi="ＭＳ ゴシック;MS Gothic" w:cs="ＭＳ ゴシック;MS Gothic" w:eastAsia="ＭＳ ゴシック;MS Gothic"/>
-                                <w:color w:val="000000"/>
-                              </w:rPr>
-                              <w:t>会議に関すること</w:t>
-                            </w:r>
-                          </w:p>
-                          <w:p>
-                            <w:pPr>
-                              <w:pStyle w:val="Normal"/>
-                              <w:spacing w:lineRule="exact" w:line="280"/>
-                              <w:ind w:firstLine="705" w:right="0"/>
-                              <w:jc w:val="left"/>
-                              <w:rPr>
-                                <w:rFonts w:ascii="ＭＳ ゴシック;MS Gothic" w:hAnsi="ＭＳ ゴシック;MS Gothic" w:eastAsia="ＭＳ ゴシック;MS Gothic" w:cs="ＭＳ ゴシック;MS Gothic"/>
-                              </w:rPr>
-                            </w:pPr>
-                            <w:r>
-                              <w:rPr>
-                                <w:rFonts w:ascii="ＭＳ ゴシック;MS Gothic" w:hAnsi="ＭＳ ゴシック;MS Gothic" w:cs="ＭＳ ゴシック;MS Gothic" w:eastAsia="ＭＳ ゴシック;MS Gothic"/>
-                                <w:color w:val="000000"/>
-                              </w:rPr>
-                              <w:t xml:space="preserve">事務局（一般財団法人アジア防災センター）担当：荒木田</w:t>
-                            </w:r>
-                            <w:r>
-                              <w:rPr>
-                                <w:rFonts w:ascii="ＭＳ ゴシック;MS Gothic" w:hAnsi="ＭＳ ゴシック;MS Gothic" w:cs="ＭＳ ゴシック;MS Gothic" w:eastAsia="ＭＳ ゴシック;MS Gothic"/>
-                              </w:rPr>
-                              <w:t/>
-                            </w:r>
-                          </w:p>
-                          <w:p>
-                            <w:pPr>
-                              <w:pStyle w:val="Normal"/>
-                              <w:spacing w:lineRule="exact" w:line="280"/>
-                              <w:ind w:firstLine="705" w:right="0"/>
-                              <w:jc w:val="left"/>
-                              <w:rPr>
-                                <w:rFonts w:ascii="ＭＳ ゴシック;MS Gothic" w:hAnsi="ＭＳ ゴシック;MS Gothic" w:eastAsia="ＭＳ ゴシック;MS Gothic" w:cs="ＭＳ ゴシック;MS Gothic"/>
-                              </w:rPr>
-                            </w:pPr>
-                            <w:r>
-                              <w:rPr>
-                                <w:rFonts w:eastAsia="ＭＳ ゴシック;MS Gothic" w:cs="ＭＳ ゴシック;MS Gothic" w:ascii="ＭＳ ゴシック;MS Gothic" w:hAnsi="ＭＳ ゴシック;MS Gothic"/>
-                              </w:rPr>
-                              <w:t xml:space="preserve">E-mail　ma-arakida@adrc.asia, acdr2026sgp@adrc.asia</w:t>
-                            </w:r>
-                            <w:r>
-                              <w:rPr>
-                                <w:rFonts w:ascii="ＭＳ ゴシック;MS Gothic" w:hAnsi="ＭＳ ゴシック;MS Gothic" w:cs="ＭＳ ゴシック;MS Gothic" w:eastAsia="ＭＳ ゴシック;MS Gothic"/>
-                              </w:rPr>
-                              <w:t/>
-                            </w:r>
-                            <w:r>
-                              <w:rPr>
-                                <w:rFonts w:eastAsia="ＭＳ ゴシック;MS Gothic" w:cs="ＭＳ ゴシック;MS Gothic" w:ascii="ＭＳ ゴシック;MS Gothic" w:hAnsi="ＭＳ ゴシック;MS Gothic"/>
-                              </w:rPr>
-                              <w:t/>
-                            </w:r>
-                          </w:p>
-                          <w:p>
-                            <w:pPr>
-                              <w:pStyle w:val="Normal"/>
-                              <w:spacing w:lineRule="exact" w:line="280"/>
-                              <w:ind w:firstLine="705" w:right="0"/>
-                              <w:jc w:val="left"/>
-                              <w:rPr>
-                                <w:rFonts w:ascii="ＭＳ ゴシック;MS Gothic" w:hAnsi="ＭＳ ゴシック;MS Gothic" w:eastAsia="ＭＳ ゴシック;MS Gothic" w:cs="ＭＳ ゴシック;MS Gothic"/>
-                              </w:rPr>
-                            </w:pPr>
-                            <w:r>
-                              <w:rPr>
-                                <w:rFonts w:eastAsia="ＭＳ ゴシック;MS Gothic" w:cs="ＭＳ ゴシック;MS Gothic" w:ascii="ＭＳ ゴシック;MS Gothic" w:hAnsi="ＭＳ ゴシック;MS Gothic"/>
-                              </w:rPr>
-                              <w:t>TEL 078-262-5540 FAX 078-262-5546</w:t>
-                            </w:r>
-                          </w:p>
-                          <w:p>
-                            <w:pPr>
-                              <w:pStyle w:val="Normal"/>
-                              <w:spacing w:lineRule="exact" w:line="280"/>
-                              <w:jc w:val="left"/>
-                              <w:rPr>
-                                <w:rFonts w:ascii="ＭＳ ゴシック;MS Gothic" w:hAnsi="ＭＳ ゴシック;MS Gothic" w:eastAsia="ＭＳ ゴシック;MS Gothic" w:cs="ＭＳ ゴシック;MS Gothic"/>
-                              </w:rPr>
-                            </w:pPr>
-                            <w:r>
-                              <w:rPr>
-                                <w:rFonts w:ascii="ＭＳ ゴシック;MS Gothic" w:hAnsi="ＭＳ ゴシック;MS Gothic" w:cs="ＭＳ ゴシック;MS Gothic" w:eastAsia="ＭＳ ゴシック;MS Gothic"/>
-                              </w:rPr>
-                              <w:t>　●その他全般に関すること</w:t>
-                            </w:r>
-                          </w:p>
-                          <w:p>
-                            <w:pPr>
-                              <w:pStyle w:val="Normal"/>
-                              <w:spacing w:lineRule="exact" w:line="280"/>
-                              <w:ind w:firstLine="705" w:right="0"/>
-                              <w:jc w:val="left"/>
-                              <w:rPr>
-                                <w:rFonts w:ascii="ＭＳ ゴシック;MS Gothic" w:hAnsi="ＭＳ ゴシック;MS Gothic" w:eastAsia="ＭＳ ゴシック;MS Gothic" w:cs="ＭＳ ゴシック;MS Gothic"/>
-                                <w:color w:val="000000"/>
-                              </w:rPr>
-                            </w:pPr>
-                            <w:r>
-                              <w:rPr>
-                                <w:rFonts w:ascii="ＭＳ ゴシック;MS Gothic" w:hAnsi="ＭＳ ゴシック;MS Gothic" w:cs="ＭＳ ゴシック;MS Gothic" w:eastAsia="ＭＳ ゴシック;MS Gothic"/>
-                                <w:color w:val="000000"/>
-                              </w:rPr>
-                              <w:t>内閣府政策統括官（防災担当）付参事官（普及啓発・連携担当）付</w:t>
-                            </w:r>
-                          </w:p>
-                          <w:p>
-                            <w:pPr>
-                              <w:pStyle w:val="Normal"/>
-                              <w:spacing w:lineRule="exact" w:line="280"/>
-                              <w:jc w:val="left"/>
-                              <w:rPr/>
-                            </w:pPr>
-                            <w:r>
-                              <w:rPr>
-                                <w:rFonts w:ascii="ＭＳ ゴシック;MS Gothic" w:hAnsi="ＭＳ ゴシック;MS Gothic" w:cs="ＭＳ ゴシック;MS Gothic" w:eastAsia="ＭＳ ゴシック;MS Gothic"/>
-                                <w:color w:val="000000"/>
-                              </w:rPr>
-                              <w:t xml:space="preserve">　　　担当：〇〇　TEL 03-3502-6984 FAX 03-3581-7510</w:t>
-                            </w:r>
-                            <w:r>
-                              <w:rPr>
-                                <w:rFonts w:eastAsia="ＭＳ ゴシック;MS Gothic" w:cs="ＭＳ ゴシック;MS Gothic" w:ascii="ＭＳ ゴシック;MS Gothic" w:hAnsi="ＭＳ ゴシック;MS Gothic"/>
-                                <w:color w:val="000000"/>
-                              </w:rPr>
-                              <w:t/>
-                            </w:r>
-                          </w:p>
-                        </w:txbxContent>
-                      </wps:txbx>
-                      <wps:bodyPr lIns="74160" rIns="74160" tIns="9000" bIns="9000" anchor="t">
-                        <a:noAutofit/>
-                      </wps:bodyPr>
-                    </wps:wsp>
-                  </a:graphicData>
-                </a:graphic>
-              </wp:anchor>
-            </w:drawing>
-          </mc:Choice>
-          <mc:Fallback>
-            <w:pict>
-              <v:rect id="shape_0" ID="Frame1" path="m0,0l-2147483645,0l-2147483645,-2147483646l0,-2147483646xe" fillcolor="white" stroked="t" o:allowincell="f" style="position:absolute;margin-left:22.6pt;margin-top:3.9pt;width:443.95pt;height:119.95pt;mso-wrap-style:square;v-text-anchor:top">
-                <v:fill o:detectmouseclick="t" type="solid" color2="black" opacity="0"/>
-                <v:stroke color="black" weight="9360" joinstyle="round" endcap="flat"/>
-                <v:textbox>
-                  <w:txbxContent>
-                    <w:p>
-                      <w:pPr>
-                        <w:pStyle w:val="Normal"/>
-                        <w:spacing w:lineRule="exact" w:line="280"/>
-                        <w:ind w:firstLine="235" w:right="0"/>
-                        <w:jc w:val="left"/>
-                        <w:rPr>
-                          <w:rFonts w:ascii="ＭＳ ゴシック;MS Gothic" w:hAnsi="ＭＳ ゴシック;MS Gothic" w:eastAsia="ＭＳ ゴシック;MS Gothic" w:cs="ＭＳ ゴシック;MS Gothic"/>
-                          <w:b/>
-                          <w:color w:val="000000"/>
-                        </w:rPr>
-                      </w:pPr>
-                      <w:r>
-                        <w:rPr>
-                          <w:rFonts w:ascii="ＭＳ ゴシック;MS Gothic" w:hAnsi="ＭＳ ゴシック;MS Gothic" w:cs="ＭＳ ゴシック;MS Gothic" w:eastAsia="ＭＳ ゴシック;MS Gothic"/>
-                          <w:color w:val="000000"/>
-                        </w:rPr>
-                        <w:t>＜本件問合せ先＞　　</w:t>
-                      </w:r>
-                    </w:p>
-                    <w:p>
-                      <w:pPr>
-                        <w:pStyle w:val="Normal"/>
-                        <w:spacing w:lineRule="exact" w:line="280"/>
-                        <w:ind w:firstLine="235" w:right="0"/>
-                        <w:jc w:val="left"/>
-                        <w:rPr>
-                          <w:rFonts w:ascii="ＭＳ ゴシック;MS Gothic" w:hAnsi="ＭＳ ゴシック;MS Gothic" w:eastAsia="ＭＳ ゴシック;MS Gothic" w:cs="ＭＳ ゴシック;MS Gothic"/>
-                          <w:color w:val="000000"/>
-                        </w:rPr>
-                      </w:pPr>
-                      <w:r>
-                        <w:rPr>
-                          <w:rFonts w:eastAsia="ＭＳ ゴシック;MS Gothic" w:cs="ＭＳ ゴシック;MS Gothic" w:ascii="ＭＳ ゴシック;MS Gothic" w:hAnsi="ＭＳ ゴシック;MS Gothic"/>
-                          <w:color w:val="000000"/>
-                        </w:rPr>
-                        <w:t>●</w:t>
-                      </w:r>
-                      <w:r>
-                        <w:rPr>
-                          <w:rFonts w:ascii="ＭＳ ゴシック;MS Gothic" w:hAnsi="ＭＳ ゴシック;MS Gothic" w:cs="ＭＳ ゴシック;MS Gothic" w:eastAsia="ＭＳ ゴシック;MS Gothic"/>
-                          <w:color w:val="000000"/>
-                        </w:rPr>
-                        <w:t>会議に関すること</w:t>
-                      </w:r>
-                    </w:p>
-                    <w:p>
-                      <w:pPr>
-                        <w:pStyle w:val="Normal"/>
-                        <w:spacing w:lineRule="exact" w:line="280"/>
-                        <w:ind w:firstLine="705" w:right="0"/>
-                        <w:jc w:val="left"/>
-                        <w:rPr>
-                          <w:rFonts w:ascii="ＭＳ ゴシック;MS Gothic" w:hAnsi="ＭＳ ゴシック;MS Gothic" w:eastAsia="ＭＳ ゴシック;MS Gothic" w:cs="ＭＳ ゴシック;MS Gothic"/>
-                        </w:rPr>
-                      </w:pPr>
-                      <w:r>
-                        <w:rPr>
-                          <w:rFonts w:ascii="ＭＳ ゴシック;MS Gothic" w:hAnsi="ＭＳ ゴシック;MS Gothic" w:cs="ＭＳ ゴシック;MS Gothic" w:eastAsia="ＭＳ ゴシック;MS Gothic"/>
-                          <w:color w:val="000000"/>
-                        </w:rPr>
-                        <w:t xml:space="preserve">事務局（一般財団法人アジア防災センター）担当：荒木田</w:t>
-                      </w:r>
-                      <w:r>
-                        <w:rPr>
-                          <w:rFonts w:ascii="ＭＳ ゴシック;MS Gothic" w:hAnsi="ＭＳ ゴシック;MS Gothic" w:cs="ＭＳ ゴシック;MS Gothic" w:eastAsia="ＭＳ ゴシック;MS Gothic"/>
-                        </w:rPr>
-                        <w:t/>
-                      </w:r>
-                    </w:p>
-                    <w:p>
-                      <w:pPr>
-                        <w:pStyle w:val="Normal"/>
-                        <w:spacing w:lineRule="exact" w:line="280"/>
-                        <w:ind w:firstLine="705" w:right="0"/>
-                        <w:jc w:val="left"/>
-                        <w:rPr>
-                          <w:rFonts w:ascii="ＭＳ ゴシック;MS Gothic" w:hAnsi="ＭＳ ゴシック;MS Gothic" w:eastAsia="ＭＳ ゴシック;MS Gothic" w:cs="ＭＳ ゴシック;MS Gothic"/>
-                        </w:rPr>
-                      </w:pPr>
-                      <w:r>
-                        <w:rPr>
-                          <w:rFonts w:eastAsia="ＭＳ ゴシック;MS Gothic" w:cs="ＭＳ ゴシック;MS Gothic" w:ascii="ＭＳ ゴシック;MS Gothic" w:hAnsi="ＭＳ ゴシック;MS Gothic"/>
-                        </w:rPr>
-                        <w:t xml:space="preserve">E-mail　ma-arakida@adrc.asia, acdr2026sgp@adrc.asia</w:t>
-                      </w:r>
-                      <w:r>
-                        <w:rPr>
-                          <w:rFonts w:ascii="ＭＳ ゴシック;MS Gothic" w:hAnsi="ＭＳ ゴシック;MS Gothic" w:cs="ＭＳ ゴシック;MS Gothic" w:eastAsia="ＭＳ ゴシック;MS Gothic"/>
-                        </w:rPr>
-                        <w:t/>
-                      </w:r>
-                      <w:r>
-                        <w:rPr>
-                          <w:rFonts w:eastAsia="ＭＳ ゴシック;MS Gothic" w:cs="ＭＳ ゴシック;MS Gothic" w:ascii="ＭＳ ゴシック;MS Gothic" w:hAnsi="ＭＳ ゴシック;MS Gothic"/>
-                        </w:rPr>
-                        <w:t/>
-                      </w:r>
-                    </w:p>
-                    <w:p>
-                      <w:pPr>
-                        <w:pStyle w:val="Normal"/>
-                        <w:spacing w:lineRule="exact" w:line="280"/>
-                        <w:ind w:firstLine="705" w:right="0"/>
-                        <w:jc w:val="left"/>
-                        <w:rPr>
-                          <w:rFonts w:ascii="ＭＳ ゴシック;MS Gothic" w:hAnsi="ＭＳ ゴシック;MS Gothic" w:eastAsia="ＭＳ ゴシック;MS Gothic" w:cs="ＭＳ ゴシック;MS Gothic"/>
-                        </w:rPr>
-                      </w:pPr>
-                      <w:r>
-                        <w:rPr>
-                          <w:rFonts w:eastAsia="ＭＳ ゴシック;MS Gothic" w:cs="ＭＳ ゴシック;MS Gothic" w:ascii="ＭＳ ゴシック;MS Gothic" w:hAnsi="ＭＳ ゴシック;MS Gothic"/>
-                        </w:rPr>
-                        <w:t>TEL 078-262-5540 FAX 078-262-5546</w:t>
-                      </w:r>
-                    </w:p>
-                    <w:p>
-                      <w:pPr>
-                        <w:pStyle w:val="Normal"/>
-                        <w:spacing w:lineRule="exact" w:line="280"/>
-                        <w:jc w:val="left"/>
-                        <w:rPr>
-                          <w:rFonts w:ascii="ＭＳ ゴシック;MS Gothic" w:hAnsi="ＭＳ ゴシック;MS Gothic" w:eastAsia="ＭＳ ゴシック;MS Gothic" w:cs="ＭＳ ゴシック;MS Gothic"/>
-                        </w:rPr>
-                      </w:pPr>
-                      <w:r>
-                        <w:rPr>
-                          <w:rFonts w:ascii="ＭＳ ゴシック;MS Gothic" w:hAnsi="ＭＳ ゴシック;MS Gothic" w:cs="ＭＳ ゴシック;MS Gothic" w:eastAsia="ＭＳ ゴシック;MS Gothic"/>
-                        </w:rPr>
-                        <w:t>　●その他全般に関すること</w:t>
-                      </w:r>
-                    </w:p>
-                    <w:p>
-                      <w:pPr>
-                        <w:pStyle w:val="Normal"/>
-                        <w:spacing w:lineRule="exact" w:line="280"/>
-                        <w:ind w:firstLine="705" w:right="0"/>
-                        <w:jc w:val="left"/>
-                        <w:rPr>
-                          <w:rFonts w:ascii="ＭＳ ゴシック;MS Gothic" w:hAnsi="ＭＳ ゴシック;MS Gothic" w:eastAsia="ＭＳ ゴシック;MS Gothic" w:cs="ＭＳ ゴシック;MS Gothic"/>
-                          <w:color w:val="000000"/>
-                        </w:rPr>
-                      </w:pPr>
-                      <w:r>
-                        <w:rPr>
-                          <w:rFonts w:ascii="ＭＳ ゴシック;MS Gothic" w:hAnsi="ＭＳ ゴシック;MS Gothic" w:cs="ＭＳ ゴシック;MS Gothic" w:eastAsia="ＭＳ ゴシック;MS Gothic"/>
-                          <w:color w:val="000000"/>
-                        </w:rPr>
-                        <w:t>内閣府政策統括官（防災担当）付参事官（普及啓発・連携担当）付</w:t>
-                      </w:r>
-                    </w:p>
-                    <w:p>
-                      <w:pPr>
-                        <w:pStyle w:val="Normal"/>
-                        <w:spacing w:lineRule="exact" w:line="280"/>
-                        <w:jc w:val="left"/>
-                        <w:rPr/>
-                      </w:pPr>
-                      <w:r>
-                        <w:rPr>
-                          <w:rFonts w:ascii="ＭＳ ゴシック;MS Gothic" w:hAnsi="ＭＳ ゴシック;MS Gothic" w:cs="ＭＳ ゴシック;MS Gothic" w:eastAsia="ＭＳ ゴシック;MS Gothic"/>
-                          <w:color w:val="000000"/>
-                        </w:rPr>
-                        <w:t xml:space="preserve">　　　担当：〇〇　TEL 03-3502-6984 FAX 03-3581-7510</w:t>
-                      </w:r>
-                      <w:r>
-                        <w:rPr>
-                          <w:rFonts w:eastAsia="ＭＳ ゴシック;MS Gothic" w:cs="ＭＳ ゴシック;MS Gothic" w:ascii="ＭＳ ゴシック;MS Gothic" w:hAnsi="ＭＳ ゴシック;MS Gothic"/>
-                          <w:color w:val="000000"/>
-                        </w:rPr>
-                        <w:t/>
-                      </w:r>
-                    </w:p>
-                  </w:txbxContent>
-                </v:textbox>
-                <w10:wrap type="none"/>
-              </v:rect>
-            </w:pict>
-          </mc:Fallback>
-        </mc:AlternateContent>
       </w:r>
     </w:p>
     <w:sectPr>
-      <w:headerReference w:type="even" r:id="rId5"/>
-      <w:headerReference w:type="default" r:id="rId6"/>
-      <w:headerReference w:type="first" r:id="rId7"/>
-      <w:footerReference w:type="even" r:id="rId8"/>
-      <w:footerReference w:type="default" r:id="rId9"/>
-      <w:footerReference w:type="first" r:id="rId10"/>
+      <w:headerReference w:type="even" r:id="rId6"/>
+      <w:headerReference w:type="default" r:id="rId7"/>
+      <w:headerReference w:type="first" r:id="rId8"/>
+      <w:footerReference w:type="even" r:id="rId9"/>
+      <w:footerReference w:type="default" r:id="rId10"/>
+      <w:footerReference w:type="first" r:id="rId11"/>
       <w:type w:val="nextPage"/>
       <w:pgSz w:w="11906" w:h="16838"/>
       <w:pgMar w:left="1134" w:right="1134" w:gutter="0" w:header="720" w:top="777" w:footer="720" w:bottom="777"/>
@@ -1158,6 +833,248 @@
 </w:hdr>
 </file>
 
+<file path=word/numbering.xml><?xml version="1.0" encoding="utf-8"?>
+<w:numbering xmlns:w="http://schemas.openxmlformats.org/wordprocessingml/2006/main" xmlns:o="urn:schemas-microsoft-com:office:office" xmlns:r="http://schemas.openxmlformats.org/officeDocument/2006/relationships" xmlns:v="urn:schemas-microsoft-com:vml" xmlns:mc="http://schemas.openxmlformats.org/markup-compatibility/2006" xmlns:w14="http://schemas.microsoft.com/office/word/2010/wordml" mc:Ignorable="w14">
+  <w:abstractNum w:abstractNumId="1">
+    <w:lvl w:ilvl="0">
+      <w:numFmt w:val="bullet"/>
+      <w:lvlText w:val="※"/>
+      <w:lvlJc w:val="left"/>
+      <w:pPr>
+        <w:tabs>
+          <w:tab w:val="num" w:pos="0"/>
+        </w:tabs>
+        <w:ind w:left="595" w:hanging="360"/>
+      </w:pPr>
+      <w:rPr>
+        <w:rFonts w:ascii="ＭＳ ゴシック" w:hAnsi="ＭＳ ゴシック" w:cs="ＭＳ ゴシック" w:hint="default"/>
+      </w:rPr>
+    </w:lvl>
+    <w:lvl w:ilvl="1">
+      <w:start w:val="1"/>
+      <w:numFmt w:val="decimal"/>
+      <w:lvlText w:val="%2."/>
+      <w:lvlJc w:val="left"/>
+      <w:pPr>
+        <w:tabs>
+          <w:tab w:val="num" w:pos="1080"/>
+        </w:tabs>
+        <w:ind w:left="1080" w:hanging="360"/>
+      </w:pPr>
+    </w:lvl>
+    <w:lvl w:ilvl="2">
+      <w:start w:val="1"/>
+      <w:numFmt w:val="decimal"/>
+      <w:lvlText w:val="%3."/>
+      <w:lvlJc w:val="left"/>
+      <w:pPr>
+        <w:tabs>
+          <w:tab w:val="num" w:pos="1440"/>
+        </w:tabs>
+        <w:ind w:left="1440" w:hanging="360"/>
+      </w:pPr>
+    </w:lvl>
+    <w:lvl w:ilvl="3">
+      <w:start w:val="1"/>
+      <w:numFmt w:val="decimal"/>
+      <w:lvlText w:val="%4."/>
+      <w:lvlJc w:val="left"/>
+      <w:pPr>
+        <w:tabs>
+          <w:tab w:val="num" w:pos="1800"/>
+        </w:tabs>
+        <w:ind w:left="1800" w:hanging="360"/>
+      </w:pPr>
+    </w:lvl>
+    <w:lvl w:ilvl="4">
+      <w:start w:val="1"/>
+      <w:numFmt w:val="decimal"/>
+      <w:lvlText w:val="%5."/>
+      <w:lvlJc w:val="left"/>
+      <w:pPr>
+        <w:tabs>
+          <w:tab w:val="num" w:pos="2160"/>
+        </w:tabs>
+        <w:ind w:left="2160" w:hanging="360"/>
+      </w:pPr>
+    </w:lvl>
+    <w:lvl w:ilvl="5">
+      <w:start w:val="1"/>
+      <w:numFmt w:val="decimal"/>
+      <w:lvlText w:val="%6."/>
+      <w:lvlJc w:val="left"/>
+      <w:pPr>
+        <w:tabs>
+          <w:tab w:val="num" w:pos="2520"/>
+        </w:tabs>
+        <w:ind w:left="2520" w:hanging="360"/>
+      </w:pPr>
+    </w:lvl>
+    <w:lvl w:ilvl="6">
+      <w:start w:val="1"/>
+      <w:numFmt w:val="decimal"/>
+      <w:lvlText w:val="%7."/>
+      <w:lvlJc w:val="left"/>
+      <w:pPr>
+        <w:tabs>
+          <w:tab w:val="num" w:pos="2880"/>
+        </w:tabs>
+        <w:ind w:left="2880" w:hanging="360"/>
+      </w:pPr>
+    </w:lvl>
+    <w:lvl w:ilvl="7">
+      <w:start w:val="1"/>
+      <w:numFmt w:val="decimal"/>
+      <w:lvlText w:val="%8."/>
+      <w:lvlJc w:val="left"/>
+      <w:pPr>
+        <w:tabs>
+          <w:tab w:val="num" w:pos="3240"/>
+        </w:tabs>
+        <w:ind w:left="3240" w:hanging="360"/>
+      </w:pPr>
+    </w:lvl>
+    <w:lvl w:ilvl="8">
+      <w:start w:val="1"/>
+      <w:numFmt w:val="decimal"/>
+      <w:lvlText w:val="%9."/>
+      <w:lvlJc w:val="left"/>
+      <w:pPr>
+        <w:tabs>
+          <w:tab w:val="num" w:pos="3600"/>
+        </w:tabs>
+        <w:ind w:left="3600" w:hanging="360"/>
+      </w:pPr>
+    </w:lvl>
+  </w:abstractNum>
+  <w:abstractNum w:abstractNumId="2">
+    <w:lvl w:ilvl="0">
+      <w:start w:val="1"/>
+      <w:numFmt w:val="none"/>
+      <w:suff w:val="nothing"/>
+      <w:lvlText w:val=""/>
+      <w:lvlJc w:val="left"/>
+      <w:pPr>
+        <w:tabs>
+          <w:tab w:val="num" w:pos="0"/>
+        </w:tabs>
+        <w:ind w:left="0" w:hanging="0"/>
+      </w:pPr>
+    </w:lvl>
+    <w:lvl w:ilvl="1">
+      <w:start w:val="1"/>
+      <w:numFmt w:val="none"/>
+      <w:suff w:val="nothing"/>
+      <w:lvlText w:val=""/>
+      <w:lvlJc w:val="left"/>
+      <w:pPr>
+        <w:tabs>
+          <w:tab w:val="num" w:pos="0"/>
+        </w:tabs>
+        <w:ind w:left="0" w:hanging="0"/>
+      </w:pPr>
+    </w:lvl>
+    <w:lvl w:ilvl="2">
+      <w:start w:val="1"/>
+      <w:numFmt w:val="none"/>
+      <w:suff w:val="nothing"/>
+      <w:lvlText w:val=""/>
+      <w:lvlJc w:val="left"/>
+      <w:pPr>
+        <w:tabs>
+          <w:tab w:val="num" w:pos="0"/>
+        </w:tabs>
+        <w:ind w:left="0" w:hanging="0"/>
+      </w:pPr>
+    </w:lvl>
+    <w:lvl w:ilvl="3">
+      <w:start w:val="1"/>
+      <w:numFmt w:val="none"/>
+      <w:suff w:val="nothing"/>
+      <w:lvlText w:val=""/>
+      <w:lvlJc w:val="left"/>
+      <w:pPr>
+        <w:tabs>
+          <w:tab w:val="num" w:pos="0"/>
+        </w:tabs>
+        <w:ind w:left="0" w:hanging="0"/>
+      </w:pPr>
+    </w:lvl>
+    <w:lvl w:ilvl="4">
+      <w:start w:val="1"/>
+      <w:numFmt w:val="none"/>
+      <w:suff w:val="nothing"/>
+      <w:lvlText w:val=""/>
+      <w:lvlJc w:val="left"/>
+      <w:pPr>
+        <w:tabs>
+          <w:tab w:val="num" w:pos="0"/>
+        </w:tabs>
+        <w:ind w:left="0" w:hanging="0"/>
+      </w:pPr>
+    </w:lvl>
+    <w:lvl w:ilvl="5">
+      <w:start w:val="1"/>
+      <w:numFmt w:val="none"/>
+      <w:suff w:val="nothing"/>
+      <w:lvlText w:val=""/>
+      <w:lvlJc w:val="left"/>
+      <w:pPr>
+        <w:tabs>
+          <w:tab w:val="num" w:pos="0"/>
+        </w:tabs>
+        <w:ind w:left="0" w:hanging="0"/>
+      </w:pPr>
+    </w:lvl>
+    <w:lvl w:ilvl="6">
+      <w:start w:val="1"/>
+      <w:numFmt w:val="none"/>
+      <w:suff w:val="nothing"/>
+      <w:lvlText w:val=""/>
+      <w:lvlJc w:val="left"/>
+      <w:pPr>
+        <w:tabs>
+          <w:tab w:val="num" w:pos="0"/>
+        </w:tabs>
+        <w:ind w:left="0" w:hanging="0"/>
+      </w:pPr>
+    </w:lvl>
+    <w:lvl w:ilvl="7">
+      <w:start w:val="1"/>
+      <w:numFmt w:val="none"/>
+      <w:suff w:val="nothing"/>
+      <w:lvlText w:val=""/>
+      <w:lvlJc w:val="left"/>
+      <w:pPr>
+        <w:tabs>
+          <w:tab w:val="num" w:pos="0"/>
+        </w:tabs>
+        <w:ind w:left="0" w:hanging="0"/>
+      </w:pPr>
+    </w:lvl>
+    <w:lvl w:ilvl="8">
+      <w:start w:val="1"/>
+      <w:numFmt w:val="none"/>
+      <w:suff w:val="nothing"/>
+      <w:lvlText w:val=""/>
+      <w:lvlJc w:val="left"/>
+      <w:pPr>
+        <w:tabs>
+          <w:tab w:val="num" w:pos="0"/>
+        </w:tabs>
+        <w:ind w:left="0" w:hanging="0"/>
+      </w:pPr>
+    </w:lvl>
+  </w:abstractNum>
+  <w:num w:numId="1">
+    <w:abstractNumId w:val="1"/>
+  </w:num>
+  <w:num w:numId="2">
+    <w:abstractNumId w:val="2"/>
+  </w:num>
+</w:numbering>
+</file>
+
 <file path=word/styles.xml><?xml version="1.0" encoding="utf-8"?>
 <w:styles xmlns:w="http://schemas.openxmlformats.org/wordprocessingml/2006/main" xmlns:w14="http://schemas.microsoft.com/office/word/2010/wordml" xmlns:mc="http://schemas.openxmlformats.org/markup-compatibility/2006" mc:Ignorable="w14">
   <w:docDefaults>
@@ -1212,7 +1129,7 @@
     <w:name w:val="WW8Num2z0"/>
     <w:qFormat/>
     <w:rPr>
-      <w:rFonts w:ascii="Calibri" w:hAnsi="Calibri" w:eastAsia="ＭＳ Ｐゴシック" w:cs="Calibri"/>
+      <w:rFonts w:ascii="ＭＳ ゴシック;MS Gothic" w:hAnsi="ＭＳ ゴシック;MS Gothic" w:eastAsia="ＭＳ ゴシック;MS Gothic" w:cs="ＭＳ ゴシック;MS Gothic"/>
     </w:rPr>
   </w:style>
   <w:style w:type="character" w:styleId="WW8Num2z1">
@@ -1226,11 +1143,25 @@
     <w:name w:val="WW8Num3z0"/>
     <w:qFormat/>
     <w:rPr>
-      <w:rFonts w:ascii="ＭＳ ゴシック;MS Gothic" w:hAnsi="ＭＳ ゴシック;MS Gothic" w:eastAsia="ＭＳ ゴシック;MS Gothic" w:cs="ＭＳ ゴシック;MS Gothic"/>
+      <w:rFonts w:ascii="Calibri" w:hAnsi="Calibri" w:eastAsia="ＭＳ Ｐゴシック" w:cs="Calibri"/>
     </w:rPr>
   </w:style>
   <w:style w:type="character" w:styleId="WW8Num3z1">
     <w:name w:val="WW8Num3z1"/>
+    <w:qFormat/>
+    <w:rPr>
+      <w:rFonts w:ascii="Wingdings" w:hAnsi="Wingdings" w:cs="Wingdings"/>
+    </w:rPr>
+  </w:style>
+  <w:style w:type="character" w:styleId="WW8Num4z0">
+    <w:name w:val="WW8Num4z0"/>
+    <w:qFormat/>
+    <w:rPr>
+      <w:rFonts w:ascii="ＭＳ ゴシック;MS Gothic" w:hAnsi="ＭＳ ゴシック;MS Gothic" w:eastAsia="ＭＳ ゴシック;MS Gothic" w:cs="ＭＳ ゴシック;MS Gothic"/>
+    </w:rPr>
+  </w:style>
+  <w:style w:type="character" w:styleId="WW8Num4z1">
+    <w:name w:val="WW8Num4z1"/>
     <w:qFormat/>
     <w:rPr>
       <w:rFonts w:ascii="Wingdings" w:hAnsi="Wingdings" w:cs="Wingdings"/>
@@ -1540,6 +1471,10 @@
   </w:style>
   <w:style w:type="numbering" w:styleId="WW8Num3">
     <w:name w:val="WW8Num3"/>
+    <w:qFormat/>
+  </w:style>
+  <w:style w:type="numbering" w:styleId="WW8Num4">
+    <w:name w:val="WW8Num4"/>
     <w:qFormat/>
   </w:style>
 </w:styles>

</xml_diff>

<commit_message>
Cabinet Office paper: restore the contact textbox, keep the 2025 line structure
Co-Authored-By: Claude Fable 5.1 <noreply@anthropic.com>
Claude-Session: https://claude.ai/code/session_01BHBsW6jxyH2X7L51FtZqxc
</commit_message>
<xml_diff>
--- a/reports/acdr2026_staff_deployment/広報資料_ACDR2026_0928/内閣府記者発表資料_ACDR2026_案_0928.docx
+++ b/reports/acdr2026_staff_deployment/広報資料_ACDR2026_0928/内閣府記者発表資料_ACDR2026_案_0928.docx
@@ -253,7 +253,7 @@
           <w:rFonts w:ascii="ＭＳ ゴシック;MS Gothic" w:hAnsi="ＭＳ ゴシック;MS Gothic" w:cs="ＭＳ Ｐゴシック" w:eastAsia="ＭＳ ゴシック;MS Gothic"/>
           <w:kern w:val="0"/>
         </w:rPr>
-        <w:t>内閣府政策統括官（防災担当）は、一般財団法人アジア防災センター（ADRC）と共同して、毎年「アジア防災会議」を開催しています。今回はシンガポール共和国において、シンガポール民間防衛庁（SCDF）を共同ホストとして、シンガポール国際防災・危機管理エキスポ（SIDEX）との合同開催「SIDEX-ACDR2026」の中で開催しますのでお知らせします。</w:t>
+        <w:t>内閣府政策統括官（防災担当）は、一般財団法人アジア防災センター（ADRC）と共同して、毎年「アジア防災会議」を開催しています。今回はシンガポール共和国において、シンガポール民間防衛庁（SCDF）を共同ホストとして、シンガポール国際防災・危機管理エキスポ（SIDEX）との合同開催「SIDEX-ACDR2026」（10月27日（火）から30日（金）まで）の中で開催しますのでお知らせします。</w:t>
       </w:r>
       <w:bookmarkEnd w:id="0"/>
     </w:p>
@@ -279,6 +279,25 @@
         <w:jc w:val="left"/>
         <w:rPr>
           <w:rFonts w:ascii="ＭＳ ゴシック;MS Gothic" w:hAnsi="ＭＳ ゴシック;MS Gothic" w:eastAsia="ＭＳ ゴシック;MS Gothic" w:cs="ＭＳ ゴシック;MS Gothic"/>
+          <w:kern w:val="0"/>
+        </w:rPr>
+      </w:pPr>
+      <w:r>
+        <w:rPr>
+          <w:rFonts w:eastAsia="ＭＳ ゴシック;MS Gothic" w:cs="ＭＳ ゴシック;MS Gothic" w:ascii="ＭＳ ゴシック;MS Gothic" w:hAnsi="ＭＳ ゴシック;MS Gothic"/>
+          <w:kern w:val="0"/>
+        </w:rPr>
+      </w:r>
+      <w:bookmarkStart w:id="2" w:name="_Hlk215587818_Copy_1"/>
+      <w:bookmarkStart w:id="3" w:name="_Hlk215587818_Copy_1"/>
+      <w:bookmarkEnd w:id="3"/>
+    </w:p>
+    <w:p>
+      <w:pPr>
+        <w:pStyle w:val="Normal"/>
+        <w:jc w:val="left"/>
+        <w:rPr>
+          <w:rFonts w:ascii="ＭＳ ゴシック;MS Gothic" w:hAnsi="ＭＳ ゴシック;MS Gothic" w:eastAsia="ＭＳ ゴシック;MS Gothic" w:cs="ＭＳ ゴシック;MS Gothic"/>
         </w:rPr>
       </w:pPr>
       <w:r>
@@ -333,73 +352,75 @@
     <w:p>
       <w:pPr>
         <w:pStyle w:val="Normal"/>
+        <w:rPr>
+          <w:rFonts w:ascii="ＭＳ ゴシック;MS Gothic" w:hAnsi="ＭＳ ゴシック;MS Gothic" w:eastAsia="ＭＳ ゴシック;MS Gothic" w:cs="ＭＳ ゴシック;MS Gothic"/>
+          <w:color w:val="000000"/>
+        </w:rPr>
+      </w:pPr>
+      <w:r>
+        <w:rPr>
+          <w:rFonts w:ascii="ＭＳ ゴシック;MS Gothic" w:hAnsi="ＭＳ ゴシック;MS Gothic" w:cs="ＭＳ ゴシック;MS Gothic" w:eastAsia="ＭＳ ゴシック;MS Gothic"/>
+          <w:color w:val="000000"/>
+        </w:rPr>
+        <w:t>２　場所  　シンガポールEXPO（シンガポール共和国）</w:t>
+      </w:r>
+      <w:bookmarkStart w:id="4" w:name="_Hlk215128959"/>
+      <w:bookmarkEnd w:id="4"/>
+    </w:p>
+    <w:p>
+      <w:pPr>
+        <w:pStyle w:val="Normal"/>
+        <w:rPr>
+          <w:rFonts w:ascii="ＭＳ ゴシック;MS Gothic" w:hAnsi="ＭＳ ゴシック;MS Gothic" w:eastAsia="ＭＳ ゴシック;MS Gothic" w:cs="ＭＳ ゴシック;MS Gothic"/>
+          <w:color w:val="000000"/>
+        </w:rPr>
+      </w:pPr>
+      <w:r>
+        <w:rPr>
+          <w:rFonts w:ascii="ＭＳ ゴシック;MS Gothic" w:hAnsi="ＭＳ ゴシック;MS Gothic" w:cs="ＭＳ ゴシック;MS Gothic" w:eastAsia="ＭＳ ゴシック;MS Gothic"/>
+          <w:color w:val="000000"/>
+        </w:rPr>
+        <w:t>　　　　　　　　（現地及びオンライン配信を組み合わせたハイブリッド形式）</w:t>
+      </w:r>
+    </w:p>
+    <w:p>
+      <w:pPr>
+        <w:pStyle w:val="Normal"/>
+        <w:rPr>
+          <w:rFonts w:ascii="ＭＳ ゴシック;MS Gothic" w:hAnsi="ＭＳ ゴシック;MS Gothic" w:eastAsia="ＭＳ ゴシック;MS Gothic" w:cs="ＭＳ ゴシック;MS Gothic"/>
+          <w:color w:val="000000"/>
+        </w:rPr>
+      </w:pPr>
+      <w:r>
+        <w:rPr>
+          <w:rFonts w:ascii="ＭＳ ゴシック;MS Gothic" w:hAnsi="ＭＳ ゴシック;MS Gothic" w:cs="ＭＳ ゴシック;MS Gothic" w:eastAsia="ＭＳ ゴシック;MS Gothic"/>
+          <w:color w:val="000000"/>
+        </w:rPr>
+        <w:t xml:space="preserve">　　　　　　　　（ACDR2026ウェビナー（URLは確定後に記載））</w:t>
+      </w:r>
+    </w:p>
+    <w:p>
+      <w:pPr>
+        <w:pStyle w:val="Normal"/>
         <w:tabs>
           <w:tab w:val="clear" w:pos="840"/>
           <w:tab w:val="left" w:pos="1100" w:leader="none"/>
         </w:tabs>
-        <w:ind w:hanging="1229" w:left="1229" w:right="0"/>
-        <w:rPr>
-          <w:rFonts w:ascii="ＭＳ ゴシック;MS Gothic" w:hAnsi="ＭＳ ゴシック;MS Gothic" w:eastAsia="ＭＳ ゴシック;MS Gothic" w:cs="ＭＳ ゴシック;MS Gothic"/>
-          <w:color w:val="000000"/>
-        </w:rPr>
-      </w:pPr>
-      <w:r>
-        <w:rPr>
-          <w:rFonts w:ascii="ＭＳ ゴシック;MS Gothic" w:hAnsi="ＭＳ ゴシック;MS Gothic" w:cs="ＭＳ ゴシック;MS Gothic" w:eastAsia="ＭＳ ゴシック;MS Gothic"/>
-          <w:color w:val="000000"/>
-        </w:rPr>
-        <w:t xml:space="preserve">　　　　　　　　（SIDEX-ACDR2026全体は10月27日（火）から30日（金）まで）</w:t>
-      </w:r>
-    </w:p>
-    <w:p>
-      <w:pPr>
-        <w:pStyle w:val="Normal"/>
-        <w:rPr>
-          <w:rFonts w:ascii="ＭＳ ゴシック;MS Gothic" w:hAnsi="ＭＳ ゴシック;MS Gothic" w:eastAsia="ＭＳ ゴシック;MS Gothic" w:cs="ＭＳ ゴシック;MS Gothic"/>
-          <w:color w:val="000000"/>
-        </w:rPr>
-      </w:pPr>
-      <w:r>
-        <w:rPr>
-          <w:rFonts w:ascii="ＭＳ ゴシック;MS Gothic" w:hAnsi="ＭＳ ゴシック;MS Gothic" w:cs="ＭＳ ゴシック;MS Gothic" w:eastAsia="ＭＳ ゴシック;MS Gothic"/>
-          <w:color w:val="000000"/>
-        </w:rPr>
-        <w:t>２　場所  　シンガポールEXPO（シンガポール共和国）</w:t>
-      </w:r>
-      <w:bookmarkStart w:id="4" w:name="_Hlk215128959"/>
-      <w:bookmarkEnd w:id="4"/>
-    </w:p>
-    <w:p>
-      <w:pPr>
-        <w:pStyle w:val="Normal"/>
-        <w:rPr>
-          <w:rFonts w:ascii="ＭＳ ゴシック;MS Gothic" w:hAnsi="ＭＳ ゴシック;MS Gothic" w:eastAsia="ＭＳ ゴシック;MS Gothic" w:cs="ＭＳ ゴシック;MS Gothic"/>
-          <w:color w:val="000000"/>
-        </w:rPr>
-      </w:pPr>
-      <w:r>
-        <w:rPr>
-          <w:rFonts w:ascii="ＭＳ ゴシック;MS Gothic" w:hAnsi="ＭＳ ゴシック;MS Gothic" w:cs="ＭＳ ゴシック;MS Gothic" w:eastAsia="ＭＳ ゴシック;MS Gothic"/>
-          <w:color w:val="000000"/>
-        </w:rPr>
-        <w:t>　　　　　　　　（現地及びオンライン配信を組み合わせたハイブリッド形式）</w:t>
-      </w:r>
-    </w:p>
-    <w:p>
-      <w:pPr>
-        <w:pStyle w:val="Normal"/>
-        <w:rPr>
-          <w:rFonts w:ascii="ＭＳ ゴシック;MS Gothic" w:hAnsi="ＭＳ ゴシック;MS Gothic" w:eastAsia="ＭＳ ゴシック;MS Gothic" w:cs="ＭＳ ゴシック;MS Gothic"/>
-          <w:color w:val="000000"/>
-        </w:rPr>
-      </w:pPr>
-      <w:r>
-        <w:rPr>
-          <w:rFonts w:ascii="ＭＳ ゴシック;MS Gothic" w:hAnsi="ＭＳ ゴシック;MS Gothic" w:cs="ＭＳ ゴシック;MS Gothic" w:eastAsia="ＭＳ ゴシック;MS Gothic"/>
-          <w:color w:val="000000"/>
-        </w:rPr>
-        <w:t xml:space="preserve">　　　　　　　　（ACDR2026ウェビナー（URLは確定後に記載））</w:t>
-      </w:r>
+        <w:ind w:hanging="1881" w:left="1881" w:right="0"/>
+        <w:rPr>
+          <w:rFonts w:ascii="ＭＳ ゴシック;MS Gothic" w:hAnsi="ＭＳ ゴシック;MS Gothic" w:eastAsia="ＭＳ ゴシック;MS Gothic" w:cs="ＭＳ ゴシック;MS Gothic"/>
+          <w:color w:val="000000"/>
+        </w:rPr>
+      </w:pPr>
+      <w:r>
+        <w:rPr>
+          <w:rFonts w:ascii="ＭＳ ゴシック;MS Gothic" w:hAnsi="ＭＳ ゴシック;MS Gothic" w:cs="ＭＳ ゴシック;MS Gothic" w:eastAsia="ＭＳ ゴシック;MS Gothic"/>
+          <w:color w:val="000000"/>
+        </w:rPr>
+        <w:t>３　主催　　内閣府政策統括官（防災担当）、一般財団法人アジア防災センター（ADRC）、</w:t>
+      </w:r>
+      <w:bookmarkStart w:id="5" w:name="_Hlk215587965"/>
+      <w:bookmarkEnd w:id="5"/>
     </w:p>
     <w:p>
       <w:pPr>
@@ -419,51 +440,7 @@
           <w:rFonts w:ascii="ＭＳ ゴシック;MS Gothic" w:hAnsi="ＭＳ ゴシック;MS Gothic" w:cs="ＭＳ ゴシック;MS Gothic" w:eastAsia="ＭＳ ゴシック;MS Gothic"/>
           <w:color w:val="000000"/>
         </w:rPr>
-        <w:t>３　主催　　内閣府政策統括官（防災担当）、一般財団法人アジア防災センター（ADRC）、</w:t>
-      </w:r>
-      <w:bookmarkStart w:id="5" w:name="_Hlk215587965"/>
-      <w:bookmarkEnd w:id="5"/>
-    </w:p>
-    <w:p>
-      <w:pPr>
-        <w:pStyle w:val="Normal"/>
-        <w:tabs>
-          <w:tab w:val="clear" w:pos="840"/>
-          <w:tab w:val="left" w:pos="1100" w:leader="none"/>
-        </w:tabs>
-        <w:ind w:hanging="1881" w:left="1881" w:right="0"/>
-        <w:rPr>
-          <w:rFonts w:ascii="ＭＳ ゴシック;MS Gothic" w:hAnsi="ＭＳ ゴシック;MS Gothic" w:eastAsia="ＭＳ ゴシック;MS Gothic" w:cs="ＭＳ ゴシック;MS Gothic"/>
-          <w:color w:val="000000"/>
-        </w:rPr>
-      </w:pPr>
-      <w:r>
-        <w:rPr>
-          <w:rFonts w:ascii="ＭＳ ゴシック;MS Gothic" w:hAnsi="ＭＳ ゴシック;MS Gothic" w:cs="ＭＳ ゴシック;MS Gothic" w:eastAsia="ＭＳ ゴシック;MS Gothic"/>
-          <w:color w:val="000000"/>
-        </w:rPr>
-        <w:t xml:space="preserve">　　　　　　　　シンガポール民間防衛庁（SCDF）（共同ホスト）</w:t>
-      </w:r>
-    </w:p>
-    <w:p>
-      <w:pPr>
-        <w:pStyle w:val="Normal"/>
-        <w:tabs>
-          <w:tab w:val="clear" w:pos="840"/>
-          <w:tab w:val="left" w:pos="1100" w:leader="none"/>
-        </w:tabs>
-        <w:ind w:hanging="1881" w:left="1881" w:right="0"/>
-        <w:rPr>
-          <w:rFonts w:ascii="ＭＳ ゴシック;MS Gothic" w:hAnsi="ＭＳ ゴシック;MS Gothic" w:eastAsia="ＭＳ ゴシック;MS Gothic" w:cs="ＭＳ ゴシック;MS Gothic"/>
-          <w:color w:val="000000"/>
-        </w:rPr>
-      </w:pPr>
-      <w:r>
-        <w:rPr>
-          <w:rFonts w:ascii="ＭＳ ゴシック;MS Gothic" w:hAnsi="ＭＳ ゴシック;MS Gothic" w:cs="ＭＳ ゴシック;MS Gothic" w:eastAsia="ＭＳ ゴシック;MS Gothic"/>
-          <w:color w:val="000000"/>
-        </w:rPr>
-        <w:t xml:space="preserve">　　　　　　　　※SIDEX（主催：COSEM）との合同開催「SIDEX-ACDR2026」として実施</w:t>
+        <w:t xml:space="preserve">　　　　　　　　シンガポール民間防衛庁（SCDF）（共同ホスト）　※SIDEX（主催：COSEM）と合同開催</w:t>
       </w:r>
     </w:p>
     <w:p>
@@ -628,6 +605,23 @@
         </w:rPr>
         <w:t>別紙２：過去のアジア防災会議開催地</w:t>
       </w:r>
+    </w:p>
+    <w:p>
+      <w:pPr>
+        <w:pStyle w:val="Normal"/>
+        <w:ind w:firstLine="235" w:right="0"/>
+        <w:rPr>
+          <w:rFonts w:ascii="ＭＳ ゴシック;MS Gothic" w:hAnsi="ＭＳ ゴシック;MS Gothic" w:eastAsia="ＭＳ ゴシック;MS Gothic" w:cs="ＭＳ ゴシック;MS Gothic"/>
+        </w:rPr>
+      </w:pPr>
+      <w:r>
+        <w:rPr>
+          <w:rFonts w:eastAsia="ＭＳ ゴシック;MS Gothic" w:cs="ＭＳ ゴシック;MS Gothic" w:ascii="ＭＳ ゴシック;MS Gothic" w:hAnsi="ＭＳ ゴシック;MS Gothic"/>
+        </w:rPr>
+      </w:r>
+      <w:bookmarkStart w:id="10" w:name="_Hlk215129901_Copy_1"/>
+      <w:bookmarkStart w:id="11" w:name="_Hlk215129901_Copy_1"/>
+      <w:bookmarkEnd w:id="11"/>
     </w:p>
     <w:p>
       <w:pPr>
@@ -681,6 +675,436 @@
           <w:bCs/>
         </w:rPr>
         <w:t>に電話・メール等でご連絡をお願いします。</w:t>
+      </w:r>
+    </w:p>
+    <w:p>
+      <w:pPr>
+        <w:pStyle w:val="Normal"/>
+        <w:rPr>
+          <w:rFonts w:ascii="ＭＳ ゴシック;MS Gothic" w:hAnsi="ＭＳ ゴシック;MS Gothic" w:eastAsia="ＭＳ ゴシック;MS Gothic" w:cs="ＭＳ ゴシック;MS Gothic"/>
+          <w:sz w:val="32"/>
+        </w:rPr>
+      </w:pPr>
+      <w:r>
+        <w:rPr>
+          <w:rFonts w:eastAsia="ＭＳ ゴシック;MS Gothic" w:cs="ＭＳ ゴシック;MS Gothic" w:ascii="ＭＳ ゴシック;MS Gothic" w:hAnsi="ＭＳ ゴシック;MS Gothic"/>
+          <w:sz w:val="8"/>
+          <w:lang w:val="en-US" w:eastAsia="en-US"/>
+        </w:rPr>
+        <mc:AlternateContent>
+          <mc:Choice Requires="wps">
+            <w:drawing>
+              <wp:anchor behindDoc="0" distT="0" distB="0" distL="0" distR="0" simplePos="0" locked="0" layoutInCell="1" allowOverlap="1" relativeHeight="3">
+                <wp:simplePos x="0" y="0"/>
+                <wp:positionH relativeFrom="column">
+                  <wp:posOffset>287020</wp:posOffset>
+                </wp:positionH>
+                <wp:positionV relativeFrom="paragraph">
+                  <wp:posOffset>49530</wp:posOffset>
+                </wp:positionV>
+                <wp:extent cx="5638800" cy="1250000"/>
+                <wp:effectExtent l="5080" t="5080" r="5080" b="5080"/>
+                <wp:wrapNone/>
+                <wp:docPr id="2" name="Frame1"/>
+                <a:graphic xmlns:a="http://schemas.openxmlformats.org/drawingml/2006/main">
+                  <a:graphicData uri="http://schemas.microsoft.com/office/word/2010/wordprocessingShape">
+                    <wps:wsp>
+                      <wps:cNvSpPr/>
+                      <wps:spPr>
+                        <a:xfrm>
+                          <a:off x="0" y="0"/>
+                          <a:ext cx="5638680" cy="1250000"/>
+                        </a:xfrm>
+                        <a:prstGeom prst="rect">
+                          <a:avLst/>
+                        </a:prstGeom>
+                        <a:noFill/>
+                        <a:ln w="9525">
+                          <a:solidFill>
+                            <a:srgbClr val="000000"/>
+                          </a:solidFill>
+                          <a:round/>
+                        </a:ln>
+                      </wps:spPr>
+                      <wps:style>
+                        <a:lnRef idx="0"/>
+                        <a:fillRef idx="0"/>
+                        <a:effectRef idx="0"/>
+                        <a:fontRef idx="minor"/>
+                      </wps:style>
+                      <wps:txbx>
+                        <w:txbxContent>
+                          <w:p>
+                            <w:pPr>
+                              <w:pStyle w:val="Normal"/>
+                              <w:spacing w:lineRule="exact" w:line="280"/>
+                              <w:ind w:firstLine="235" w:right="0"/>
+                              <w:jc w:val="left"/>
+                              <w:rPr>
+                                <w:rFonts w:ascii="ＭＳ ゴシック;MS Gothic" w:hAnsi="ＭＳ ゴシック;MS Gothic" w:eastAsia="ＭＳ ゴシック;MS Gothic" w:cs="ＭＳ ゴシック;MS Gothic"/>
+                                <w:b/>
+                                <w:color w:val="000000"/>
+                              </w:rPr>
+                            </w:pPr>
+                            <w:r>
+                              <w:rPr>
+                                <w:rFonts w:ascii="ＭＳ ゴシック;MS Gothic" w:hAnsi="ＭＳ ゴシック;MS Gothic" w:cs="ＭＳ ゴシック;MS Gothic" w:eastAsia="ＭＳ ゴシック;MS Gothic"/>
+                                <w:color w:val="000000"/>
+                              </w:rPr>
+                              <w:t>＜本件問合せ先＞　　</w:t>
+                            </w:r>
+                          </w:p>
+                          <w:p>
+                            <w:pPr>
+                              <w:pStyle w:val="Normal"/>
+                              <w:spacing w:lineRule="exact" w:line="280"/>
+                              <w:ind w:firstLine="235" w:right="0"/>
+                              <w:jc w:val="left"/>
+                              <w:rPr>
+                                <w:rFonts w:ascii="ＭＳ ゴシック;MS Gothic" w:hAnsi="ＭＳ ゴシック;MS Gothic" w:eastAsia="ＭＳ ゴシック;MS Gothic" w:cs="ＭＳ ゴシック;MS Gothic"/>
+                                <w:color w:val="000000"/>
+                              </w:rPr>
+                            </w:pPr>
+                            <w:r>
+                              <w:rPr>
+                                <w:rFonts w:eastAsia="ＭＳ ゴシック;MS Gothic" w:cs="ＭＳ ゴシック;MS Gothic" w:ascii="ＭＳ ゴシック;MS Gothic" w:hAnsi="ＭＳ ゴシック;MS Gothic"/>
+                                <w:color w:val="000000"/>
+                              </w:rPr>
+                              <w:t>●</w:t>
+                            </w:r>
+                            <w:r>
+                              <w:rPr>
+                                <w:rFonts w:ascii="ＭＳ ゴシック;MS Gothic" w:hAnsi="ＭＳ ゴシック;MS Gothic" w:cs="ＭＳ ゴシック;MS Gothic" w:eastAsia="ＭＳ ゴシック;MS Gothic"/>
+                                <w:color w:val="000000"/>
+                              </w:rPr>
+                              <w:t>会議に関すること</w:t>
+                            </w:r>
+                          </w:p>
+                          <w:p>
+                            <w:pPr>
+                              <w:pStyle w:val="Normal"/>
+                              <w:spacing w:lineRule="exact" w:line="280"/>
+                              <w:ind w:firstLine="705" w:right="0"/>
+                              <w:jc w:val="left"/>
+                              <w:rPr>
+                                <w:rFonts w:ascii="ＭＳ ゴシック;MS Gothic" w:hAnsi="ＭＳ ゴシック;MS Gothic" w:eastAsia="ＭＳ ゴシック;MS Gothic" w:cs="ＭＳ ゴシック;MS Gothic"/>
+                              </w:rPr>
+                            </w:pPr>
+                            <w:r>
+                              <w:rPr>
+                                <w:rFonts w:ascii="ＭＳ ゴシック;MS Gothic" w:hAnsi="ＭＳ ゴシック;MS Gothic" w:cs="ＭＳ ゴシック;MS Gothic" w:eastAsia="ＭＳ ゴシック;MS Gothic"/>
+                                <w:color w:val="000000"/>
+                              </w:rPr>
+                              <w:t xml:space="preserve">事務局（一般財団法人アジア防災センター）担当：荒木田、池田</w:t>
+                            </w:r>
+                            <w:r>
+                              <w:rPr>
+                                <w:rFonts w:ascii="ＭＳ ゴシック;MS Gothic" w:hAnsi="ＭＳ ゴシック;MS Gothic" w:cs="ＭＳ ゴシック;MS Gothic" w:eastAsia="ＭＳ ゴシック;MS Gothic"/>
+                              </w:rPr>
+                              <w:t/>
+                            </w:r>
+                          </w:p>
+                          <w:p>
+                            <w:pPr>
+                              <w:pStyle w:val="Normal"/>
+                              <w:spacing w:lineRule="exact" w:line="280"/>
+                              <w:ind w:firstLine="705" w:right="0"/>
+                              <w:jc w:val="left"/>
+                              <w:rPr>
+                                <w:rFonts w:ascii="ＭＳ ゴシック;MS Gothic" w:hAnsi="ＭＳ ゴシック;MS Gothic" w:eastAsia="ＭＳ ゴシック;MS Gothic" w:cs="ＭＳ ゴシック;MS Gothic"/>
+                              </w:rPr>
+                            </w:pPr>
+                            <w:r>
+                              <w:rPr>
+                                <w:rFonts w:eastAsia="ＭＳ ゴシック;MS Gothic" w:cs="ＭＳ ゴシック;MS Gothic" w:ascii="ＭＳ ゴシック;MS Gothic" w:hAnsi="ＭＳ ゴシック;MS Gothic"/>
+                              </w:rPr>
+                              <w:t xml:space="preserve">E-mail　ma-arakida@adrc.asia, mi-ikeda@adrc.asia</w:t>
+                            </w:r>
+                            <w:r>
+                              <w:rPr>
+                                <w:rFonts w:ascii="ＭＳ ゴシック;MS Gothic" w:hAnsi="ＭＳ ゴシック;MS Gothic" w:cs="ＭＳ ゴシック;MS Gothic" w:eastAsia="ＭＳ ゴシック;MS Gothic"/>
+                              </w:rPr>
+                              <w:t/>
+                            </w:r>
+                            <w:r>
+                              <w:rPr>
+                                <w:rFonts w:eastAsia="ＭＳ ゴシック;MS Gothic" w:cs="ＭＳ ゴシック;MS Gothic" w:ascii="ＭＳ ゴシック;MS Gothic" w:hAnsi="ＭＳ ゴシック;MS Gothic"/>
+                              </w:rPr>
+                              <w:t/>
+                            </w:r>
+                          </w:p>
+                          <w:p>
+                            <w:pPr>
+                              <w:pStyle w:val="Normal"/>
+                              <w:spacing w:lineRule="exact" w:line="280"/>
+                              <w:ind w:firstLine="705" w:right="0"/>
+                              <w:jc w:val="left"/>
+                              <w:rPr>
+                                <w:rFonts w:ascii="ＭＳ ゴシック;MS Gothic" w:hAnsi="ＭＳ ゴシック;MS Gothic" w:eastAsia="ＭＳ ゴシック;MS Gothic" w:cs="ＭＳ ゴシック;MS Gothic"/>
+                              </w:rPr>
+                            </w:pPr>
+                            <w:r>
+                              <w:rPr>
+                                <w:rFonts w:eastAsia="ＭＳ ゴシック;MS Gothic" w:cs="ＭＳ ゴシック;MS Gothic" w:ascii="ＭＳ ゴシック;MS Gothic" w:hAnsi="ＭＳ ゴシック;MS Gothic"/>
+                              </w:rPr>
+                              <w:t>TEL 078-262-5540 FAX 078-262-5546</w:t>
+                            </w:r>
+                          </w:p>
+                          <w:p>
+                            <w:pPr>
+                              <w:pStyle w:val="Normal"/>
+                              <w:spacing w:lineRule="exact" w:line="280"/>
+                              <w:jc w:val="left"/>
+                              <w:rPr>
+                                <w:rFonts w:ascii="ＭＳ ゴシック;MS Gothic" w:hAnsi="ＭＳ ゴシック;MS Gothic" w:eastAsia="ＭＳ ゴシック;MS Gothic" w:cs="ＭＳ ゴシック;MS Gothic"/>
+                              </w:rPr>
+                            </w:pPr>
+                            <w:r>
+                              <w:rPr>
+                                <w:rFonts w:ascii="ＭＳ ゴシック;MS Gothic" w:hAnsi="ＭＳ ゴシック;MS Gothic" w:cs="ＭＳ ゴシック;MS Gothic" w:eastAsia="ＭＳ ゴシック;MS Gothic"/>
+                              </w:rPr>
+                              <w:t>　●その他全般に関すること</w:t>
+                            </w:r>
+                          </w:p>
+                          <w:p>
+                            <w:pPr>
+                              <w:pStyle w:val="Normal"/>
+                              <w:spacing w:lineRule="exact" w:line="280"/>
+                              <w:ind w:firstLine="705" w:right="0"/>
+                              <w:jc w:val="left"/>
+                              <w:rPr>
+                                <w:rFonts w:ascii="ＭＳ ゴシック;MS Gothic" w:hAnsi="ＭＳ ゴシック;MS Gothic" w:eastAsia="ＭＳ ゴシック;MS Gothic" w:cs="ＭＳ ゴシック;MS Gothic"/>
+                                <w:color w:val="000000"/>
+                              </w:rPr>
+                            </w:pPr>
+                            <w:r>
+                              <w:rPr>
+                                <w:rFonts w:ascii="ＭＳ ゴシック;MS Gothic" w:hAnsi="ＭＳ ゴシック;MS Gothic" w:cs="ＭＳ ゴシック;MS Gothic" w:eastAsia="ＭＳ ゴシック;MS Gothic"/>
+                                <w:color w:val="000000"/>
+                              </w:rPr>
+                              <w:t>内閣府政策統括官（防災担当）付参事官（普及啓発・連携担当）付</w:t>
+                            </w:r>
+                          </w:p>
+                          <w:p>
+                            <w:pPr>
+                              <w:pStyle w:val="Normal"/>
+                              <w:spacing w:lineRule="exact" w:line="280"/>
+                              <w:jc w:val="left"/>
+                              <w:rPr/>
+                            </w:pPr>
+                            <w:r>
+                              <w:rPr>
+                                <w:rFonts w:ascii="ＭＳ ゴシック;MS Gothic" w:hAnsi="ＭＳ ゴシック;MS Gothic" w:cs="ＭＳ ゴシック;MS Gothic" w:eastAsia="ＭＳ ゴシック;MS Gothic"/>
+                                <w:color w:val="000000"/>
+                              </w:rPr>
+                              <w:t xml:space="preserve">　　　担当：〇〇　TEL 03-5797-7543 FAX 03-3581-7510</w:t>
+                            </w:r>
+                            <w:r>
+                              <w:rPr>
+                                <w:rFonts w:eastAsia="ＭＳ ゴシック;MS Gothic" w:cs="ＭＳ ゴシック;MS Gothic" w:ascii="ＭＳ ゴシック;MS Gothic" w:hAnsi="ＭＳ ゴシック;MS Gothic"/>
+                                <w:color w:val="000000"/>
+                              </w:rPr>
+                              <w:t/>
+                            </w:r>
+                          </w:p>
+                        </w:txbxContent>
+                      </wps:txbx>
+                      <wps:bodyPr lIns="74160" rIns="74160" tIns="9000" bIns="9000" anchor="t">
+                        <a:noAutofit/>
+                      </wps:bodyPr>
+                    </wps:wsp>
+                  </a:graphicData>
+                </a:graphic>
+              </wp:anchor>
+            </w:drawing>
+          </mc:Choice>
+          <mc:Fallback>
+            <w:pict>
+              <v:rect id="shape_0" ID="Frame1" path="m0,0l-2147483645,0l-2147483645,-2147483646l0,-2147483646xe" fillcolor="white" stroked="t" o:allowincell="f" style="position:absolute;margin-left:22.6pt;margin-top:3.9pt;width:443.95pt;height:119.95pt;mso-wrap-style:square;v-text-anchor:top">
+                <v:fill o:detectmouseclick="t" type="solid" color2="black" opacity="0"/>
+                <v:stroke color="black" weight="9360" joinstyle="round" endcap="flat"/>
+                <v:textbox>
+                  <w:txbxContent>
+                    <w:p>
+                      <w:pPr>
+                        <w:pStyle w:val="Normal"/>
+                        <w:spacing w:lineRule="exact" w:line="280"/>
+                        <w:ind w:firstLine="235" w:right="0"/>
+                        <w:jc w:val="left"/>
+                        <w:rPr>
+                          <w:rFonts w:ascii="ＭＳ ゴシック;MS Gothic" w:hAnsi="ＭＳ ゴシック;MS Gothic" w:eastAsia="ＭＳ ゴシック;MS Gothic" w:cs="ＭＳ ゴシック;MS Gothic"/>
+                          <w:b/>
+                          <w:color w:val="000000"/>
+                        </w:rPr>
+                      </w:pPr>
+                      <w:r>
+                        <w:rPr>
+                          <w:rFonts w:ascii="ＭＳ ゴシック;MS Gothic" w:hAnsi="ＭＳ ゴシック;MS Gothic" w:cs="ＭＳ ゴシック;MS Gothic" w:eastAsia="ＭＳ ゴシック;MS Gothic"/>
+                          <w:color w:val="000000"/>
+                        </w:rPr>
+                        <w:t>＜本件問合せ先＞　　</w:t>
+                      </w:r>
+                    </w:p>
+                    <w:p>
+                      <w:pPr>
+                        <w:pStyle w:val="Normal"/>
+                        <w:spacing w:lineRule="exact" w:line="280"/>
+                        <w:ind w:firstLine="235" w:right="0"/>
+                        <w:jc w:val="left"/>
+                        <w:rPr>
+                          <w:rFonts w:ascii="ＭＳ ゴシック;MS Gothic" w:hAnsi="ＭＳ ゴシック;MS Gothic" w:eastAsia="ＭＳ ゴシック;MS Gothic" w:cs="ＭＳ ゴシック;MS Gothic"/>
+                          <w:color w:val="000000"/>
+                        </w:rPr>
+                      </w:pPr>
+                      <w:r>
+                        <w:rPr>
+                          <w:rFonts w:eastAsia="ＭＳ ゴシック;MS Gothic" w:cs="ＭＳ ゴシック;MS Gothic" w:ascii="ＭＳ ゴシック;MS Gothic" w:hAnsi="ＭＳ ゴシック;MS Gothic"/>
+                          <w:color w:val="000000"/>
+                        </w:rPr>
+                        <w:t>●</w:t>
+                      </w:r>
+                      <w:r>
+                        <w:rPr>
+                          <w:rFonts w:ascii="ＭＳ ゴシック;MS Gothic" w:hAnsi="ＭＳ ゴシック;MS Gothic" w:cs="ＭＳ ゴシック;MS Gothic" w:eastAsia="ＭＳ ゴシック;MS Gothic"/>
+                          <w:color w:val="000000"/>
+                        </w:rPr>
+                        <w:t>会議に関すること</w:t>
+                      </w:r>
+                    </w:p>
+                    <w:p>
+                      <w:pPr>
+                        <w:pStyle w:val="Normal"/>
+                        <w:spacing w:lineRule="exact" w:line="280"/>
+                        <w:ind w:firstLine="705" w:right="0"/>
+                        <w:jc w:val="left"/>
+                        <w:rPr>
+                          <w:rFonts w:ascii="ＭＳ ゴシック;MS Gothic" w:hAnsi="ＭＳ ゴシック;MS Gothic" w:eastAsia="ＭＳ ゴシック;MS Gothic" w:cs="ＭＳ ゴシック;MS Gothic"/>
+                        </w:rPr>
+                      </w:pPr>
+                      <w:r>
+                        <w:rPr>
+                          <w:rFonts w:ascii="ＭＳ ゴシック;MS Gothic" w:hAnsi="ＭＳ ゴシック;MS Gothic" w:cs="ＭＳ ゴシック;MS Gothic" w:eastAsia="ＭＳ ゴシック;MS Gothic"/>
+                          <w:color w:val="000000"/>
+                        </w:rPr>
+                        <w:t xml:space="preserve">事務局（一般財団法人アジア防災センター）担当：荒木田、池田</w:t>
+                      </w:r>
+                      <w:r>
+                        <w:rPr>
+                          <w:rFonts w:ascii="ＭＳ ゴシック;MS Gothic" w:hAnsi="ＭＳ ゴシック;MS Gothic" w:cs="ＭＳ ゴシック;MS Gothic" w:eastAsia="ＭＳ ゴシック;MS Gothic"/>
+                        </w:rPr>
+                        <w:t/>
+                      </w:r>
+                    </w:p>
+                    <w:p>
+                      <w:pPr>
+                        <w:pStyle w:val="Normal"/>
+                        <w:spacing w:lineRule="exact" w:line="280"/>
+                        <w:ind w:firstLine="705" w:right="0"/>
+                        <w:jc w:val="left"/>
+                        <w:rPr>
+                          <w:rFonts w:ascii="ＭＳ ゴシック;MS Gothic" w:hAnsi="ＭＳ ゴシック;MS Gothic" w:eastAsia="ＭＳ ゴシック;MS Gothic" w:cs="ＭＳ ゴシック;MS Gothic"/>
+                        </w:rPr>
+                      </w:pPr>
+                      <w:r>
+                        <w:rPr>
+                          <w:rFonts w:eastAsia="ＭＳ ゴシック;MS Gothic" w:cs="ＭＳ ゴシック;MS Gothic" w:ascii="ＭＳ ゴシック;MS Gothic" w:hAnsi="ＭＳ ゴシック;MS Gothic"/>
+                        </w:rPr>
+                        <w:t xml:space="preserve">E-mail　ma-arakida@adrc.asia, mi-ikeda@adrc.asia</w:t>
+                      </w:r>
+                      <w:r>
+                        <w:rPr>
+                          <w:rFonts w:ascii="ＭＳ ゴシック;MS Gothic" w:hAnsi="ＭＳ ゴシック;MS Gothic" w:cs="ＭＳ ゴシック;MS Gothic" w:eastAsia="ＭＳ ゴシック;MS Gothic"/>
+                        </w:rPr>
+                        <w:t/>
+                      </w:r>
+                      <w:r>
+                        <w:rPr>
+                          <w:rFonts w:eastAsia="ＭＳ ゴシック;MS Gothic" w:cs="ＭＳ ゴシック;MS Gothic" w:ascii="ＭＳ ゴシック;MS Gothic" w:hAnsi="ＭＳ ゴシック;MS Gothic"/>
+                        </w:rPr>
+                        <w:t/>
+                      </w:r>
+                    </w:p>
+                    <w:p>
+                      <w:pPr>
+                        <w:pStyle w:val="Normal"/>
+                        <w:spacing w:lineRule="exact" w:line="280"/>
+                        <w:ind w:firstLine="705" w:right="0"/>
+                        <w:jc w:val="left"/>
+                        <w:rPr>
+                          <w:rFonts w:ascii="ＭＳ ゴシック;MS Gothic" w:hAnsi="ＭＳ ゴシック;MS Gothic" w:eastAsia="ＭＳ ゴシック;MS Gothic" w:cs="ＭＳ ゴシック;MS Gothic"/>
+                        </w:rPr>
+                      </w:pPr>
+                      <w:r>
+                        <w:rPr>
+                          <w:rFonts w:eastAsia="ＭＳ ゴシック;MS Gothic" w:cs="ＭＳ ゴシック;MS Gothic" w:ascii="ＭＳ ゴシック;MS Gothic" w:hAnsi="ＭＳ ゴシック;MS Gothic"/>
+                        </w:rPr>
+                        <w:t>TEL 078-262-5540 FAX 078-262-5546</w:t>
+                      </w:r>
+                    </w:p>
+                    <w:p>
+                      <w:pPr>
+                        <w:pStyle w:val="Normal"/>
+                        <w:spacing w:lineRule="exact" w:line="280"/>
+                        <w:jc w:val="left"/>
+                        <w:rPr>
+                          <w:rFonts w:ascii="ＭＳ ゴシック;MS Gothic" w:hAnsi="ＭＳ ゴシック;MS Gothic" w:eastAsia="ＭＳ ゴシック;MS Gothic" w:cs="ＭＳ ゴシック;MS Gothic"/>
+                        </w:rPr>
+                      </w:pPr>
+                      <w:r>
+                        <w:rPr>
+                          <w:rFonts w:ascii="ＭＳ ゴシック;MS Gothic" w:hAnsi="ＭＳ ゴシック;MS Gothic" w:cs="ＭＳ ゴシック;MS Gothic" w:eastAsia="ＭＳ ゴシック;MS Gothic"/>
+                        </w:rPr>
+                        <w:t>　●その他全般に関すること</w:t>
+                      </w:r>
+                    </w:p>
+                    <w:p>
+                      <w:pPr>
+                        <w:pStyle w:val="Normal"/>
+                        <w:spacing w:lineRule="exact" w:line="280"/>
+                        <w:ind w:firstLine="705" w:right="0"/>
+                        <w:jc w:val="left"/>
+                        <w:rPr>
+                          <w:rFonts w:ascii="ＭＳ ゴシック;MS Gothic" w:hAnsi="ＭＳ ゴシック;MS Gothic" w:eastAsia="ＭＳ ゴシック;MS Gothic" w:cs="ＭＳ ゴシック;MS Gothic"/>
+                          <w:color w:val="000000"/>
+                        </w:rPr>
+                      </w:pPr>
+                      <w:r>
+                        <w:rPr>
+                          <w:rFonts w:ascii="ＭＳ ゴシック;MS Gothic" w:hAnsi="ＭＳ ゴシック;MS Gothic" w:cs="ＭＳ ゴシック;MS Gothic" w:eastAsia="ＭＳ ゴシック;MS Gothic"/>
+                          <w:color w:val="000000"/>
+                        </w:rPr>
+                        <w:t>内閣府政策統括官（防災担当）付参事官（普及啓発・連携担当）付</w:t>
+                      </w:r>
+                    </w:p>
+                    <w:p>
+                      <w:pPr>
+                        <w:pStyle w:val="Normal"/>
+                        <w:spacing w:lineRule="exact" w:line="280"/>
+                        <w:jc w:val="left"/>
+                        <w:rPr/>
+                      </w:pPr>
+                      <w:r>
+                        <w:rPr>
+                          <w:rFonts w:ascii="ＭＳ ゴシック;MS Gothic" w:hAnsi="ＭＳ ゴシック;MS Gothic" w:cs="ＭＳ ゴシック;MS Gothic" w:eastAsia="ＭＳ ゴシック;MS Gothic"/>
+                          <w:color w:val="000000"/>
+                        </w:rPr>
+                        <w:t xml:space="preserve">　　　担当：〇〇　TEL 03-5797-7543 FAX 03-3581-7510</w:t>
+                      </w:r>
+                      <w:r>
+                        <w:rPr>
+                          <w:rFonts w:eastAsia="ＭＳ ゴシック;MS Gothic" w:cs="ＭＳ ゴシック;MS Gothic" w:ascii="ＭＳ ゴシック;MS Gothic" w:hAnsi="ＭＳ ゴシック;MS Gothic"/>
+                          <w:color w:val="000000"/>
+                        </w:rPr>
+                        <w:t/>
+                      </w:r>
+                    </w:p>
+                  </w:txbxContent>
+                </v:textbox>
+                <w10:wrap type="none"/>
+              </v:rect>
+            </w:pict>
+          </mc:Fallback>
+        </mc:AlternateContent>
       </w:r>
     </w:p>
     <w:p>

</xml_diff>

<commit_message>
Fix font names mangled by the .doc conversion so Word keeps the 2025 line pitch; restore 12pt subtitle
Co-Authored-By: Claude Fable 5.1 <noreply@anthropic.com>
Claude-Session: https://claude.ai/code/session_01BHBsW6jxyH2X7L51FtZqxc
</commit_message>
<xml_diff>
--- a/reports/acdr2026_staff_deployment/広報資料_ACDR2026_0928/内閣府記者発表資料_ACDR2026_案_0928.docx
+++ b/reports/acdr2026_staff_deployment/広報資料_ACDR2026_0928/内閣府記者発表資料_ACDR2026_案_0928.docx
@@ -8,12 +8,12 @@
         <w:ind w:left="6112" w:right="0"/>
         <w:jc w:val="distribute"/>
         <w:rPr>
-          <w:rFonts w:ascii="ＭＳ ゴシック;MS Gothic" w:hAnsi="ＭＳ ゴシック;MS Gothic" w:eastAsia="ＭＳ ゴシック;MS Gothic" w:cs="ＭＳ ゴシック;MS Gothic"/>
-        </w:rPr>
-      </w:pPr>
-      <w:r>
-        <w:rPr>
-          <w:rFonts w:ascii="ＭＳ ゴシック;MS Gothic" w:hAnsi="ＭＳ ゴシック;MS Gothic" w:cs="ＭＳ ゴシック;MS Gothic" w:eastAsia="ＭＳ ゴシック;MS Gothic"/>
+          <w:rFonts w:ascii="ＭＳ ゴシック" w:hAnsi="ＭＳ ゴシック" w:eastAsia="ＭＳ ゴシック" w:cs="ＭＳ ゴシック"/>
+        </w:rPr>
+      </w:pPr>
+      <w:r>
+        <w:rPr>
+          <w:rFonts w:ascii="ＭＳ ゴシック" w:hAnsi="ＭＳ ゴシック" w:cs="ＭＳ ゴシック" w:eastAsia="ＭＳ ゴシック"/>
         </w:rPr>
         <w:t>令和８年10月　日</w:t>
       </w:r>
@@ -72,30 +72,30 @@
         <w:ind w:left="6112" w:right="0"/>
         <w:jc w:val="distribute"/>
         <w:rPr>
-          <w:rFonts w:ascii="ＭＳ ゴシック;MS Gothic" w:hAnsi="ＭＳ ゴシック;MS Gothic" w:eastAsia="ＭＳ ゴシック;MS Gothic" w:cs="ＭＳ ゴシック;MS Gothic"/>
-        </w:rPr>
-      </w:pPr>
-      <w:r>
-        <w:rPr>
-          <w:rFonts w:ascii="ＭＳ ゴシック;MS Gothic" w:hAnsi="ＭＳ ゴシック;MS Gothic" w:cs="ＭＳ ゴシック;MS Gothic" w:eastAsia="ＭＳ ゴシック;MS Gothic"/>
+          <w:rFonts w:ascii="ＭＳ ゴシック" w:hAnsi="ＭＳ ゴシック" w:eastAsia="ＭＳ ゴシック" w:cs="ＭＳ ゴシック"/>
+        </w:rPr>
+      </w:pPr>
+      <w:r>
+        <w:rPr>
+          <w:rFonts w:ascii="ＭＳ ゴシック" w:hAnsi="ＭＳ ゴシック" w:cs="ＭＳ ゴシック" w:eastAsia="ＭＳ ゴシック"/>
         </w:rPr>
         <w:t>内閣府政策統括官</w:t>
       </w:r>
       <w:r>
         <w:rPr>
-          <w:rFonts w:eastAsia="ＭＳ ゴシック;MS Gothic" w:cs="ＭＳ ゴシック;MS Gothic" w:ascii="ＭＳ ゴシック;MS Gothic" w:hAnsi="ＭＳ ゴシック;MS Gothic"/>
+          <w:rFonts w:eastAsia="ＭＳ ゴシック" w:cs="ＭＳ ゴシック" w:ascii="ＭＳ ゴシック" w:hAnsi="ＭＳ ゴシック"/>
         </w:rPr>
         <w:t>(</w:t>
       </w:r>
       <w:r>
         <w:rPr>
-          <w:rFonts w:ascii="ＭＳ ゴシック;MS Gothic" w:hAnsi="ＭＳ ゴシック;MS Gothic" w:cs="ＭＳ ゴシック;MS Gothic" w:eastAsia="ＭＳ ゴシック;MS Gothic"/>
+          <w:rFonts w:ascii="ＭＳ ゴシック" w:hAnsi="ＭＳ ゴシック" w:cs="ＭＳ ゴシック" w:eastAsia="ＭＳ ゴシック"/>
         </w:rPr>
         <w:t>防災担当</w:t>
       </w:r>
       <w:r>
         <w:rPr>
-          <w:rFonts w:eastAsia="ＭＳ ゴシック;MS Gothic" w:cs="ＭＳ ゴシック;MS Gothic" w:ascii="ＭＳ ゴシック;MS Gothic" w:hAnsi="ＭＳ ゴシック;MS Gothic"/>
+          <w:rFonts w:eastAsia="ＭＳ ゴシック" w:cs="ＭＳ ゴシック" w:ascii="ＭＳ ゴシック" w:hAnsi="ＭＳ ゴシック"/>
         </w:rPr>
         <w:t>)</w:t>
       </w:r>
@@ -104,13 +104,13 @@
       <w:pPr>
         <w:pStyle w:val="Normal"/>
         <w:rPr>
-          <w:rFonts w:ascii="ＭＳ ゴシック;MS Gothic" w:hAnsi="ＭＳ ゴシック;MS Gothic" w:eastAsia="ＭＳ ゴシック;MS Gothic" w:cs="ＭＳ ゴシック;MS Gothic"/>
+          <w:rFonts w:ascii="ＭＳ ゴシック" w:hAnsi="ＭＳ ゴシック" w:eastAsia="ＭＳ ゴシック" w:cs="ＭＳ ゴシック"/>
           <w:sz w:val="32"/>
         </w:rPr>
       </w:pPr>
       <w:r>
         <w:rPr>
-          <w:rFonts w:eastAsia="ＭＳ ゴシック;MS Gothic" w:cs="ＭＳ ゴシック;MS Gothic" w:ascii="ＭＳ ゴシック;MS Gothic" w:hAnsi="ＭＳ ゴシック;MS Gothic"/>
+          <w:rFonts w:eastAsia="ＭＳ ゴシック" w:cs="ＭＳ ゴシック" w:ascii="ＭＳ ゴシック" w:hAnsi="ＭＳ ゴシック"/>
           <w:sz w:val="32"/>
         </w:rPr>
       </w:r>
@@ -122,14 +122,14 @@
         <w:ind w:firstLine="235" w:left="-317" w:right="0"/>
         <w:jc w:val="left"/>
         <w:rPr>
-          <w:rFonts w:ascii="ＭＳ ゴシック;MS Gothic" w:hAnsi="ＭＳ ゴシック;MS Gothic" w:eastAsia="ＭＳ ゴシック;MS Gothic" w:cs="ＭＳ ゴシック;MS Gothic"/>
+          <w:rFonts w:ascii="ＭＳ ゴシック" w:hAnsi="ＭＳ ゴシック" w:eastAsia="ＭＳ ゴシック" w:cs="ＭＳ ゴシック"/>
           <w:sz w:val="28"/>
           <w:szCs w:val="28"/>
         </w:rPr>
       </w:pPr>
       <w:r>
         <w:rPr>
-          <w:rFonts w:ascii="ＭＳ ゴシック;MS Gothic" w:hAnsi="ＭＳ ゴシック;MS Gothic" w:cs="ＭＳ ゴシック;MS Gothic" w:eastAsia="ＭＳ ゴシック;MS Gothic"/>
+          <w:rFonts w:ascii="ＭＳ ゴシック" w:hAnsi="ＭＳ ゴシック" w:cs="ＭＳ ゴシック" w:eastAsia="ＭＳ ゴシック"/>
           <w:szCs w:val="28"/>
         </w:rPr>
         <w:t>永田クラブ、経済研究会、国土交通記者会　へ公表</w:t>
@@ -142,14 +142,14 @@
         <w:ind w:left="6112" w:right="0"/>
         <w:jc w:val="distribute"/>
         <w:rPr>
-          <w:rFonts w:ascii="ＭＳ ゴシック;MS Gothic" w:hAnsi="ＭＳ ゴシック;MS Gothic" w:eastAsia="ＭＳ ゴシック;MS Gothic" w:cs="ＭＳ ゴシック;MS Gothic"/>
+          <w:rFonts w:ascii="ＭＳ ゴシック" w:hAnsi="ＭＳ ゴシック" w:eastAsia="ＭＳ ゴシック" w:cs="ＭＳ ゴシック"/>
           <w:sz w:val="28"/>
           <w:szCs w:val="28"/>
         </w:rPr>
       </w:pPr>
       <w:r>
         <w:rPr>
-          <w:rFonts w:eastAsia="ＭＳ ゴシック;MS Gothic" w:cs="ＭＳ ゴシック;MS Gothic" w:ascii="ＭＳ ゴシック;MS Gothic" w:hAnsi="ＭＳ ゴシック;MS Gothic"/>
+          <w:rFonts w:eastAsia="ＭＳ ゴシック" w:cs="ＭＳ ゴシック" w:ascii="ＭＳ ゴシック" w:hAnsi="ＭＳ ゴシック"/>
           <w:sz w:val="28"/>
           <w:szCs w:val="28"/>
         </w:rPr>
@@ -162,12 +162,12 @@
         <w:ind w:left="6112" w:right="0"/>
         <w:jc w:val="distribute"/>
         <w:rPr>
-          <w:rFonts w:ascii="ＭＳ ゴシック;MS Gothic" w:hAnsi="ＭＳ ゴシック;MS Gothic" w:eastAsia="ＭＳ ゴシック;MS Gothic" w:cs="ＭＳ ゴシック;MS Gothic"/>
-        </w:rPr>
-      </w:pPr>
-      <w:r>
-        <w:rPr>
-          <w:rFonts w:eastAsia="ＭＳ ゴシック;MS Gothic" w:cs="ＭＳ ゴシック;MS Gothic" w:ascii="ＭＳ ゴシック;MS Gothic" w:hAnsi="ＭＳ ゴシック;MS Gothic"/>
+          <w:rFonts w:ascii="ＭＳ ゴシック" w:hAnsi="ＭＳ ゴシック" w:eastAsia="ＭＳ ゴシック" w:cs="ＭＳ ゴシック"/>
+        </w:rPr>
+      </w:pPr>
+      <w:r>
+        <w:rPr>
+          <w:rFonts w:eastAsia="ＭＳ ゴシック" w:cs="ＭＳ ゴシック" w:ascii="ＭＳ ゴシック" w:hAnsi="ＭＳ ゴシック"/>
         </w:rPr>
       </w:r>
     </w:p>
@@ -177,7 +177,7 @@
         <w:spacing w:lineRule="exact" w:line="400"/>
         <w:jc w:val="center"/>
         <w:rPr>
-          <w:rFonts w:ascii="ＭＳ ゴシック;MS Gothic" w:hAnsi="ＭＳ ゴシック;MS Gothic" w:eastAsia="ＭＳ ゴシック;MS Gothic" w:cs="ＭＳ ゴシック;MS Gothic"/>
+          <w:rFonts w:ascii="ＭＳ ゴシック" w:hAnsi="ＭＳ ゴシック" w:eastAsia="ＭＳ ゴシック" w:cs="ＭＳ ゴシック"/>
           <w:b/>
           <w:sz w:val="24"/>
           <w:szCs w:val="24"/>
@@ -185,56 +185,88 @@
       </w:pPr>
       <w:r>
         <w:rPr>
-          <w:rFonts w:ascii="ＭＳ ゴシック;MS Gothic" w:hAnsi="ＭＳ ゴシック;MS Gothic" w:cs="ＭＳ ゴシック;MS Gothic" w:eastAsia="ＭＳ ゴシック;MS Gothic"/>
+          <w:rFonts w:ascii="ＭＳ ゴシック" w:hAnsi="ＭＳ ゴシック" w:cs="ＭＳ ゴシック" w:eastAsia="ＭＳ ゴシック"/>
           <w:b/>
           <w:sz w:val="28"/>
           <w:szCs w:val="28"/>
         </w:rPr>
         <w:t>「アジア防災会議2026」をシンガポール共和国で開催</w:t>
-        <w:br/>
-        <w:t>～アジア各国の防災能力の向上とアジア地域の防災ネットワークの充実・強化を図ります～</w:t>
-      </w:r>
-    </w:p>
-    <w:p>
-      <w:pPr>
-        <w:pStyle w:val="Normal"/>
-        <w:spacing w:lineRule="exact" w:line="240"/>
-        <w:jc w:val="center"/>
-        <w:rPr>
-          <w:rFonts w:ascii="ＭＳ ゴシック;MS Gothic" w:hAnsi="ＭＳ ゴシック;MS Gothic" w:eastAsia="ＭＳ ゴシック;MS Gothic" w:cs="ＭＳ ゴシック;MS Gothic"/>
+      </w:r>
+      <w:r>
+        <w:rPr>
+          <w:rFonts w:eastAsia="ＭＳ ゴシック" w:cs="ＭＳ ゴシック" w:ascii="ＭＳ ゴシック" w:hAnsi="ＭＳ ゴシック"/>
           <w:b/>
           <w:sz w:val="28"/>
           <w:szCs w:val="28"/>
         </w:rPr>
-      </w:pPr>
-      <w:r>
-        <w:rPr>
-          <w:rFonts w:eastAsia="ＭＳ ゴシック;MS Gothic" w:cs="ＭＳ ゴシック;MS Gothic" w:ascii="ＭＳ ゴシック;MS Gothic" w:hAnsi="ＭＳ ゴシック;MS Gothic"/>
+      </w:r>
+      <w:r>
+        <w:rPr>
+          <w:rFonts w:ascii="ＭＳ ゴシック" w:hAnsi="ＭＳ ゴシック" w:cs="ＭＳ ゴシック" w:eastAsia="ＭＳ ゴシック"/>
           <w:b/>
           <w:sz w:val="28"/>
           <w:szCs w:val="28"/>
         </w:rPr>
       </w:r>
-    </w:p>
-    <w:p>
-      <w:pPr>
-        <w:pStyle w:val="Normal"/>
-        <w:spacing w:lineRule="exact" w:line="240"/>
-        <w:jc w:val="center"/>
-        <w:rPr>
-          <w:rFonts w:ascii="ＭＳ ゴシック;MS Gothic" w:hAnsi="ＭＳ ゴシック;MS Gothic" w:eastAsia="ＭＳ ゴシック;MS Gothic" w:cs="ＭＳ ゴシック;MS Gothic"/>
+      <w:r>
+        <w:rPr>
+          <w:rFonts w:eastAsia="ＭＳ ゴシック" w:cs="ＭＳ ゴシック" w:ascii="ＭＳ ゴシック" w:hAnsi="ＭＳ ゴシック"/>
           <w:b/>
           <w:sz w:val="28"/>
           <w:szCs w:val="28"/>
         </w:rPr>
-      </w:pPr>
-      <w:r>
-        <w:rPr>
-          <w:rFonts w:eastAsia="ＭＳ ゴシック;MS Gothic" w:cs="ＭＳ ゴシック;MS Gothic" w:ascii="ＭＳ ゴシック;MS Gothic" w:hAnsi="ＭＳ ゴシック;MS Gothic"/>
+        <w:br/>
+      </w:r>
+      <w:r>
+        <w:rPr>
+          <w:rFonts w:ascii="ＭＳ ゴシック" w:hAnsi="ＭＳ ゴシック" w:cs="ＭＳ ゴシック" w:eastAsia="ＭＳ ゴシック"/>
+          <w:b/>
+          <w:sz w:val="24"/>
+          <w:szCs w:val="24"/>
+        </w:rPr>
+        <w:t>～アジア各国の防災能力の向上とアジア地域の防災ネットワークの充実・強化を図ります～</w:t>
+      </w:r>
+    </w:p>
+    <w:p>
+      <w:pPr>
+        <w:pStyle w:val="Normal"/>
+        <w:spacing w:lineRule="exact" w:line="240"/>
+        <w:jc w:val="center"/>
+        <w:rPr>
+          <w:rFonts w:ascii="ＭＳ ゴシック" w:hAnsi="ＭＳ ゴシック" w:eastAsia="ＭＳ ゴシック" w:cs="ＭＳ ゴシック"/>
           <w:b/>
           <w:sz w:val="28"/>
           <w:szCs w:val="28"/>
         </w:rPr>
+      </w:pPr>
+      <w:r>
+        <w:rPr>
+          <w:rFonts w:eastAsia="ＭＳ ゴシック" w:cs="ＭＳ ゴシック" w:ascii="ＭＳ ゴシック" w:hAnsi="ＭＳ ゴシック"/>
+          <w:b/>
+          <w:sz w:val="28"/>
+          <w:szCs w:val="28"/>
+        </w:rPr>
+      </w:r>
+    </w:p>
+    <w:p>
+      <w:pPr>
+        <w:pStyle w:val="Normal"/>
+        <w:spacing w:lineRule="exact" w:line="240"/>
+        <w:jc w:val="center"/>
+        <w:rPr>
+          <w:rFonts w:ascii="ＭＳ ゴシック" w:hAnsi="ＭＳ ゴシック" w:eastAsia="ＭＳ ゴシック" w:cs="ＭＳ ゴシック"/>
+          <w:b/>
+          <w:sz w:val="28"/>
+          <w:szCs w:val="28"/>
+        </w:rPr>
+      </w:pPr>
+      <w:r>
+        <w:rPr>
+          <w:rFonts w:eastAsia="ＭＳ ゴシック" w:cs="ＭＳ ゴシック" w:ascii="ＭＳ ゴシック" w:hAnsi="ＭＳ ゴシック"/>
+          <w:b/>
+          <w:sz w:val="28"/>
+          <w:szCs w:val="28"/>
+        </w:rPr>
       </w:r>
     </w:p>
     <w:p>
@@ -242,7 +274,7 @@
         <w:pStyle w:val="Normal"/>
         <w:ind w:firstLine="235" w:right="0"/>
         <w:rPr>
-          <w:rFonts w:ascii="ＭＳ ゴシック;MS Gothic" w:hAnsi="ＭＳ ゴシック;MS Gothic" w:eastAsia="ＭＳ ゴシック;MS Gothic" w:cs="ＭＳ ゴシック;MS Gothic"/>
+          <w:rFonts w:ascii="ＭＳ ゴシック" w:hAnsi="ＭＳ ゴシック" w:eastAsia="ＭＳ ゴシック" w:cs="ＭＳ ゴシック"/>
         </w:rPr>
       </w:pPr>
       <w:bookmarkStart w:id="0" w:name="_Hlk215130208"/>
@@ -250,7 +282,7 @@
       <w:bookmarkEnd w:id="1"/>
       <w:r>
         <w:rPr>
-          <w:rFonts w:ascii="ＭＳ ゴシック;MS Gothic" w:hAnsi="ＭＳ ゴシック;MS Gothic" w:cs="ＭＳ Ｐゴシック" w:eastAsia="ＭＳ ゴシック;MS Gothic"/>
+          <w:rFonts w:ascii="ＭＳ ゴシック" w:hAnsi="ＭＳ ゴシック" w:cs="ＭＳ Ｐゴシック" w:eastAsia="ＭＳ ゴシック"/>
           <w:kern w:val="0"/>
         </w:rPr>
         <w:t>内閣府政策統括官（防災担当）は、一般財団法人アジア防災センター（ADRC）と共同して、毎年「アジア防災会議」を開催しています。今回はシンガポール共和国において、シンガポール民間防衛庁（SCDF）を共同ホストとして、シンガポール国際防災・危機管理エキスポ（SIDEX）との合同開催「SIDEX-ACDR2026」（10月27日（火）から30日（金）まで）の中で開催しますのでお知らせします。</w:t>
@@ -262,13 +294,13 @@
         <w:pStyle w:val="Normal"/>
         <w:ind w:firstLine="235" w:right="0"/>
         <w:rPr>
-          <w:rFonts w:ascii="ＭＳ ゴシック;MS Gothic" w:hAnsi="ＭＳ ゴシック;MS Gothic" w:eastAsia="ＭＳ ゴシック;MS Gothic" w:cs="ＭＳ Ｐゴシック"/>
+          <w:rFonts w:ascii="ＭＳ ゴシック" w:hAnsi="ＭＳ ゴシック" w:eastAsia="ＭＳ ゴシック" w:cs="ＭＳ Ｐゴシック"/>
           <w:kern w:val="0"/>
         </w:rPr>
       </w:pPr>
       <w:r>
         <w:rPr>
-          <w:rFonts w:ascii="ＭＳ ゴシック;MS Gothic" w:hAnsi="ＭＳ ゴシック;MS Gothic" w:cs="ＭＳ ゴシック;MS Gothic" w:eastAsia="ＭＳ ゴシック;MS Gothic"/>
+          <w:rFonts w:ascii="ＭＳ ゴシック" w:hAnsi="ＭＳ ゴシック" w:cs="ＭＳ ゴシック" w:eastAsia="ＭＳ ゴシック"/>
         </w:rPr>
         <w:t>なお、ACDR2026ウェビナー（URLは確定後に記載）より、どなたでも会議を御覧いただけます。</w:t>
       </w:r>
@@ -278,13 +310,13 @@
         <w:pStyle w:val="Normal"/>
         <w:jc w:val="left"/>
         <w:rPr>
-          <w:rFonts w:ascii="ＭＳ ゴシック;MS Gothic" w:hAnsi="ＭＳ ゴシック;MS Gothic" w:eastAsia="ＭＳ ゴシック;MS Gothic" w:cs="ＭＳ ゴシック;MS Gothic"/>
+          <w:rFonts w:ascii="ＭＳ ゴシック" w:hAnsi="ＭＳ ゴシック" w:eastAsia="ＭＳ ゴシック" w:cs="ＭＳ ゴシック"/>
           <w:kern w:val="0"/>
         </w:rPr>
       </w:pPr>
       <w:r>
         <w:rPr>
-          <w:rFonts w:eastAsia="ＭＳ ゴシック;MS Gothic" w:cs="ＭＳ ゴシック;MS Gothic" w:ascii="ＭＳ ゴシック;MS Gothic" w:hAnsi="ＭＳ ゴシック;MS Gothic"/>
+          <w:rFonts w:eastAsia="ＭＳ ゴシック" w:cs="ＭＳ ゴシック" w:ascii="ＭＳ ゴシック" w:hAnsi="ＭＳ ゴシック"/>
           <w:kern w:val="0"/>
         </w:rPr>
       </w:r>
@@ -297,12 +329,12 @@
         <w:pStyle w:val="Normal"/>
         <w:jc w:val="left"/>
         <w:rPr>
-          <w:rFonts w:ascii="ＭＳ ゴシック;MS Gothic" w:hAnsi="ＭＳ ゴシック;MS Gothic" w:eastAsia="ＭＳ ゴシック;MS Gothic" w:cs="ＭＳ ゴシック;MS Gothic"/>
-        </w:rPr>
-      </w:pPr>
-      <w:r>
-        <w:rPr>
-          <w:rFonts w:ascii="ＭＳ ゴシック;MS Gothic" w:hAnsi="ＭＳ ゴシック;MS Gothic" w:cs="ＭＳ ゴシック;MS Gothic" w:eastAsia="ＭＳ ゴシック;MS Gothic"/>
+          <w:rFonts w:ascii="ＭＳ ゴシック" w:hAnsi="ＭＳ ゴシック" w:eastAsia="ＭＳ ゴシック" w:cs="ＭＳ ゴシック"/>
+        </w:rPr>
+      </w:pPr>
+      <w:r>
+        <w:rPr>
+          <w:rFonts w:ascii="ＭＳ ゴシック" w:hAnsi="ＭＳ ゴシック" w:cs="ＭＳ ゴシック" w:eastAsia="ＭＳ ゴシック"/>
         </w:rPr>
         <w:t>＜アジア防災会議2026の概要＞</w:t>
       </w:r>
@@ -317,13 +349,13 @@
         <w:spacing w:lineRule="exact" w:line="200"/>
         <w:ind w:hanging="1229" w:left="1229" w:right="0"/>
         <w:rPr>
-          <w:rFonts w:ascii="ＭＳ ゴシック;MS Gothic" w:hAnsi="ＭＳ ゴシック;MS Gothic" w:eastAsia="ＭＳ ゴシック;MS Gothic" w:cs="ＭＳ ゴシック;MS Gothic"/>
-          <w:color w:val="000000"/>
-        </w:rPr>
-      </w:pPr>
-      <w:r>
-        <w:rPr>
-          <w:rFonts w:eastAsia="ＭＳ ゴシック;MS Gothic" w:cs="ＭＳ ゴシック;MS Gothic" w:ascii="ＭＳ ゴシック;MS Gothic" w:hAnsi="ＭＳ ゴシック;MS Gothic"/>
+          <w:rFonts w:ascii="ＭＳ ゴシック" w:hAnsi="ＭＳ ゴシック" w:eastAsia="ＭＳ ゴシック" w:cs="ＭＳ ゴシック"/>
+          <w:color w:val="000000"/>
+        </w:rPr>
+      </w:pPr>
+      <w:r>
+        <w:rPr>
+          <w:rFonts w:eastAsia="ＭＳ ゴシック" w:cs="ＭＳ ゴシック" w:ascii="ＭＳ ゴシック" w:hAnsi="ＭＳ ゴシック"/>
           <w:color w:val="000000"/>
         </w:rPr>
       </w:r>
@@ -337,13 +369,13 @@
         </w:tabs>
         <w:ind w:hanging="1229" w:left="1229" w:right="0"/>
         <w:rPr>
-          <w:rFonts w:ascii="ＭＳ ゴシック;MS Gothic" w:hAnsi="ＭＳ ゴシック;MS Gothic" w:eastAsia="ＭＳ ゴシック;MS Gothic" w:cs="ＭＳ ゴシック;MS Gothic"/>
-          <w:color w:val="000000"/>
-        </w:rPr>
-      </w:pPr>
-      <w:r>
-        <w:rPr>
-          <w:rFonts w:ascii="ＭＳ ゴシック;MS Gothic" w:hAnsi="ＭＳ ゴシック;MS Gothic" w:cs="ＭＳ ゴシック;MS Gothic" w:eastAsia="ＭＳ ゴシック;MS Gothic"/>
+          <w:rFonts w:ascii="ＭＳ ゴシック" w:hAnsi="ＭＳ ゴシック" w:eastAsia="ＭＳ ゴシック" w:cs="ＭＳ ゴシック"/>
+          <w:color w:val="000000"/>
+        </w:rPr>
+      </w:pPr>
+      <w:r>
+        <w:rPr>
+          <w:rFonts w:ascii="ＭＳ ゴシック" w:hAnsi="ＭＳ ゴシック" w:cs="ＭＳ ゴシック" w:eastAsia="ＭＳ ゴシック"/>
           <w:color w:val="000000"/>
         </w:rPr>
         <w:t>１　日程　　令和８年10月28日（水）、29日（木）　※プログラムは別紙ご参照</w:t>
@@ -353,13 +385,13 @@
       <w:pPr>
         <w:pStyle w:val="Normal"/>
         <w:rPr>
-          <w:rFonts w:ascii="ＭＳ ゴシック;MS Gothic" w:hAnsi="ＭＳ ゴシック;MS Gothic" w:eastAsia="ＭＳ ゴシック;MS Gothic" w:cs="ＭＳ ゴシック;MS Gothic"/>
-          <w:color w:val="000000"/>
-        </w:rPr>
-      </w:pPr>
-      <w:r>
-        <w:rPr>
-          <w:rFonts w:ascii="ＭＳ ゴシック;MS Gothic" w:hAnsi="ＭＳ ゴシック;MS Gothic" w:cs="ＭＳ ゴシック;MS Gothic" w:eastAsia="ＭＳ ゴシック;MS Gothic"/>
+          <w:rFonts w:ascii="ＭＳ ゴシック" w:hAnsi="ＭＳ ゴシック" w:eastAsia="ＭＳ ゴシック" w:cs="ＭＳ ゴシック"/>
+          <w:color w:val="000000"/>
+        </w:rPr>
+      </w:pPr>
+      <w:r>
+        <w:rPr>
+          <w:rFonts w:ascii="ＭＳ ゴシック" w:hAnsi="ＭＳ ゴシック" w:cs="ＭＳ ゴシック" w:eastAsia="ＭＳ ゴシック"/>
           <w:color w:val="000000"/>
         </w:rPr>
         <w:t>２　場所  　シンガポールEXPO（シンガポール共和国）</w:t>
@@ -371,13 +403,13 @@
       <w:pPr>
         <w:pStyle w:val="Normal"/>
         <w:rPr>
-          <w:rFonts w:ascii="ＭＳ ゴシック;MS Gothic" w:hAnsi="ＭＳ ゴシック;MS Gothic" w:eastAsia="ＭＳ ゴシック;MS Gothic" w:cs="ＭＳ ゴシック;MS Gothic"/>
-          <w:color w:val="000000"/>
-        </w:rPr>
-      </w:pPr>
-      <w:r>
-        <w:rPr>
-          <w:rFonts w:ascii="ＭＳ ゴシック;MS Gothic" w:hAnsi="ＭＳ ゴシック;MS Gothic" w:cs="ＭＳ ゴシック;MS Gothic" w:eastAsia="ＭＳ ゴシック;MS Gothic"/>
+          <w:rFonts w:ascii="ＭＳ ゴシック" w:hAnsi="ＭＳ ゴシック" w:eastAsia="ＭＳ ゴシック" w:cs="ＭＳ ゴシック"/>
+          <w:color w:val="000000"/>
+        </w:rPr>
+      </w:pPr>
+      <w:r>
+        <w:rPr>
+          <w:rFonts w:ascii="ＭＳ ゴシック" w:hAnsi="ＭＳ ゴシック" w:cs="ＭＳ ゴシック" w:eastAsia="ＭＳ ゴシック"/>
           <w:color w:val="000000"/>
         </w:rPr>
         <w:t>　　　　　　　　（現地及びオンライン配信を組み合わせたハイブリッド形式）</w:t>
@@ -387,13 +419,13 @@
       <w:pPr>
         <w:pStyle w:val="Normal"/>
         <w:rPr>
-          <w:rFonts w:ascii="ＭＳ ゴシック;MS Gothic" w:hAnsi="ＭＳ ゴシック;MS Gothic" w:eastAsia="ＭＳ ゴシック;MS Gothic" w:cs="ＭＳ ゴシック;MS Gothic"/>
-          <w:color w:val="000000"/>
-        </w:rPr>
-      </w:pPr>
-      <w:r>
-        <w:rPr>
-          <w:rFonts w:ascii="ＭＳ ゴシック;MS Gothic" w:hAnsi="ＭＳ ゴシック;MS Gothic" w:cs="ＭＳ ゴシック;MS Gothic" w:eastAsia="ＭＳ ゴシック;MS Gothic"/>
+          <w:rFonts w:ascii="ＭＳ ゴシック" w:hAnsi="ＭＳ ゴシック" w:eastAsia="ＭＳ ゴシック" w:cs="ＭＳ ゴシック"/>
+          <w:color w:val="000000"/>
+        </w:rPr>
+      </w:pPr>
+      <w:r>
+        <w:rPr>
+          <w:rFonts w:ascii="ＭＳ ゴシック" w:hAnsi="ＭＳ ゴシック" w:cs="ＭＳ ゴシック" w:eastAsia="ＭＳ ゴシック"/>
           <w:color w:val="000000"/>
         </w:rPr>
         <w:t xml:space="preserve">　　　　　　　　（ACDR2026ウェビナー（URLは確定後に記載））</w:t>
@@ -408,13 +440,13 @@
         </w:tabs>
         <w:ind w:hanging="1881" w:left="1881" w:right="0"/>
         <w:rPr>
-          <w:rFonts w:ascii="ＭＳ ゴシック;MS Gothic" w:hAnsi="ＭＳ ゴシック;MS Gothic" w:eastAsia="ＭＳ ゴシック;MS Gothic" w:cs="ＭＳ ゴシック;MS Gothic"/>
-          <w:color w:val="000000"/>
-        </w:rPr>
-      </w:pPr>
-      <w:r>
-        <w:rPr>
-          <w:rFonts w:ascii="ＭＳ ゴシック;MS Gothic" w:hAnsi="ＭＳ ゴシック;MS Gothic" w:cs="ＭＳ ゴシック;MS Gothic" w:eastAsia="ＭＳ ゴシック;MS Gothic"/>
+          <w:rFonts w:ascii="ＭＳ ゴシック" w:hAnsi="ＭＳ ゴシック" w:eastAsia="ＭＳ ゴシック" w:cs="ＭＳ ゴシック"/>
+          <w:color w:val="000000"/>
+        </w:rPr>
+      </w:pPr>
+      <w:r>
+        <w:rPr>
+          <w:rFonts w:ascii="ＭＳ ゴシック" w:hAnsi="ＭＳ ゴシック" w:cs="ＭＳ ゴシック" w:eastAsia="ＭＳ ゴシック"/>
           <w:color w:val="000000"/>
         </w:rPr>
         <w:t>３　主催　　内閣府政策統括官（防災担当）、一般財団法人アジア防災センター（ADRC）、</w:t>
@@ -431,13 +463,13 @@
         </w:tabs>
         <w:ind w:hanging="1881" w:left="1881" w:right="0"/>
         <w:rPr>
-          <w:rFonts w:ascii="ＭＳ ゴシック;MS Gothic" w:hAnsi="ＭＳ ゴシック;MS Gothic" w:eastAsia="ＭＳ ゴシック;MS Gothic" w:cs="ＭＳ ゴシック;MS Gothic"/>
-          <w:color w:val="000000"/>
-        </w:rPr>
-      </w:pPr>
-      <w:r>
-        <w:rPr>
-          <w:rFonts w:ascii="ＭＳ ゴシック;MS Gothic" w:hAnsi="ＭＳ ゴシック;MS Gothic" w:cs="ＭＳ ゴシック;MS Gothic" w:eastAsia="ＭＳ ゴシック;MS Gothic"/>
+          <w:rFonts w:ascii="ＭＳ ゴシック" w:hAnsi="ＭＳ ゴシック" w:eastAsia="ＭＳ ゴシック" w:cs="ＭＳ ゴシック"/>
+          <w:color w:val="000000"/>
+        </w:rPr>
+      </w:pPr>
+      <w:r>
+        <w:rPr>
+          <w:rFonts w:ascii="ＭＳ ゴシック" w:hAnsi="ＭＳ ゴシック" w:cs="ＭＳ ゴシック" w:eastAsia="ＭＳ ゴシック"/>
           <w:color w:val="000000"/>
         </w:rPr>
         <w:t xml:space="preserve">　　　　　　　　シンガポール民間防衛庁（SCDF）（共同ホスト）　※SIDEX（主催：COSEM）と合同開催</w:t>
@@ -452,20 +484,20 @@
         </w:tabs>
         <w:ind w:hanging="1881" w:left="1881" w:right="0"/>
         <w:rPr>
-          <w:rFonts w:ascii="ＭＳ ゴシック;MS Gothic" w:hAnsi="ＭＳ ゴシック;MS Gothic" w:eastAsia="ＭＳ ゴシック;MS Gothic" w:cs="ＭＳ ゴシック;MS Gothic"/>
-          <w:color w:val="000000"/>
-        </w:rPr>
-      </w:pPr>
-      <w:r>
-        <w:rPr>
-          <w:rFonts w:ascii="ＭＳ ゴシック;MS Gothic" w:hAnsi="ＭＳ ゴシック;MS Gothic" w:cs="ＭＳ ゴシック;MS Gothic" w:eastAsia="ＭＳ ゴシック;MS Gothic"/>
+          <w:rFonts w:ascii="ＭＳ ゴシック" w:hAnsi="ＭＳ ゴシック" w:eastAsia="ＭＳ ゴシック" w:cs="ＭＳ ゴシック"/>
+          <w:color w:val="000000"/>
+        </w:rPr>
+      </w:pPr>
+      <w:r>
+        <w:rPr>
+          <w:rFonts w:ascii="ＭＳ ゴシック" w:hAnsi="ＭＳ ゴシック" w:cs="ＭＳ ゴシック" w:eastAsia="ＭＳ ゴシック"/>
           <w:color w:val="000000"/>
         </w:rPr>
         <w:t>４　</w:t>
       </w:r>
       <w:r>
         <w:rPr>
-          <w:rFonts w:ascii="ＭＳ ゴシック;MS Gothic" w:hAnsi="ＭＳ ゴシック;MS Gothic" w:cs="ＭＳ ゴシック;MS Gothic" w:eastAsia="ＭＳ ゴシック;MS Gothic"/>
+          <w:rFonts w:ascii="ＭＳ ゴシック" w:hAnsi="ＭＳ ゴシック" w:cs="ＭＳ ゴシック" w:eastAsia="ＭＳ ゴシック"/>
           <w:color w:val="000000"/>
           <w:spacing w:val="55"/>
           <w:kern w:val="0"/>
@@ -474,7 +506,7 @@
       </w:r>
       <w:r>
         <w:rPr>
-          <w:rFonts w:ascii="ＭＳ ゴシック;MS Gothic" w:hAnsi="ＭＳ ゴシック;MS Gothic" w:cs="ＭＳ ゴシック;MS Gothic" w:eastAsia="ＭＳ ゴシック;MS Gothic"/>
+          <w:rFonts w:ascii="ＭＳ ゴシック" w:hAnsi="ＭＳ ゴシック" w:cs="ＭＳ ゴシック" w:eastAsia="ＭＳ ゴシック"/>
           <w:color w:val="000000"/>
           <w:kern w:val="0"/>
         </w:rPr>
@@ -484,14 +516,14 @@
       <w:bookmarkStart w:id="7" w:name="_Hlk215129032"/>
       <w:r>
         <w:rPr>
-          <w:rFonts w:eastAsia="ＭＳ ゴシック;MS Gothic" w:cs="ＭＳ ゴシック;MS Gothic" w:ascii="ＭＳ ゴシック;MS Gothic" w:hAnsi="ＭＳ ゴシック;MS Gothic"/>
+          <w:rFonts w:eastAsia="ＭＳ ゴシック" w:cs="ＭＳ ゴシック" w:ascii="ＭＳ ゴシック" w:hAnsi="ＭＳ ゴシック"/>
           <w:color w:val="000000"/>
         </w:rPr>
         <w:t>ADRC</w:t>
       </w:r>
       <w:r>
         <w:rPr>
-          <w:rFonts w:ascii="ＭＳ ゴシック;MS Gothic" w:hAnsi="ＭＳ ゴシック;MS Gothic" w:cs="ＭＳ ゴシック;MS Gothic" w:eastAsia="ＭＳ ゴシック;MS Gothic"/>
+          <w:rFonts w:ascii="ＭＳ ゴシック" w:hAnsi="ＭＳ ゴシック" w:cs="ＭＳ ゴシック" w:eastAsia="ＭＳ ゴシック"/>
           <w:color w:val="000000"/>
         </w:rPr>
         <w:t>のメンバー国政府の防災機関関係者</w:t>
@@ -499,7 +531,7 @@
       <w:bookmarkEnd w:id="7"/>
       <w:r>
         <w:rPr>
-          <w:rFonts w:ascii="ＭＳ ゴシック;MS Gothic" w:hAnsi="ＭＳ ゴシック;MS Gothic" w:cs="ＭＳ ゴシック;MS Gothic" w:eastAsia="ＭＳ ゴシック;MS Gothic"/>
+          <w:rFonts w:ascii="ＭＳ ゴシック" w:hAnsi="ＭＳ ゴシック" w:cs="ＭＳ ゴシック" w:eastAsia="ＭＳ ゴシック"/>
           <w:color w:val="000000"/>
         </w:rPr>
         <w:t>、国連等関係機関防災担当者、</w:t>
@@ -514,13 +546,13 @@
         </w:tabs>
         <w:ind w:left="1881" w:right="0"/>
         <w:rPr>
-          <w:rFonts w:ascii="ＭＳ ゴシック;MS Gothic" w:hAnsi="ＭＳ ゴシック;MS Gothic" w:eastAsia="ＭＳ ゴシック;MS Gothic" w:cs="ＭＳ ゴシック;MS Gothic"/>
-          <w:color w:val="000000"/>
-        </w:rPr>
-      </w:pPr>
-      <w:r>
-        <w:rPr>
-          <w:rFonts w:ascii="ＭＳ ゴシック;MS Gothic" w:hAnsi="ＭＳ ゴシック;MS Gothic" w:cs="ＭＳ ゴシック;MS Gothic" w:eastAsia="ＭＳ ゴシック;MS Gothic"/>
+          <w:rFonts w:ascii="ＭＳ ゴシック" w:hAnsi="ＭＳ ゴシック" w:eastAsia="ＭＳ ゴシック" w:cs="ＭＳ ゴシック"/>
+          <w:color w:val="000000"/>
+        </w:rPr>
+      </w:pPr>
+      <w:r>
+        <w:rPr>
+          <w:rFonts w:ascii="ＭＳ ゴシック" w:hAnsi="ＭＳ ゴシック" w:cs="ＭＳ ゴシック" w:eastAsia="ＭＳ ゴシック"/>
           <w:color w:val="000000"/>
         </w:rPr>
         <w:t>防災専門家等</w:t>
@@ -530,7 +562,7 @@
       <w:pPr>
         <w:pStyle w:val="Normal"/>
         <w:rPr>
-          <w:rFonts w:ascii="ＭＳ ゴシック;MS Gothic" w:hAnsi="ＭＳ ゴシック;MS Gothic" w:eastAsia="ＭＳ ゴシック;MS Gothic" w:cs="ＭＳ ゴシック;MS Gothic"/>
+          <w:rFonts w:ascii="ＭＳ ゴシック" w:hAnsi="ＭＳ ゴシック" w:eastAsia="ＭＳ ゴシック" w:cs="ＭＳ ゴシック"/>
           <w:kern w:val="0"/>
           <w:lang w:eastAsia="ja-JP"/>
         </w:rPr>
@@ -538,7 +570,7 @@
       <w:bookmarkEnd w:id="6"/>
       <w:r>
         <w:rPr>
-          <w:rFonts w:ascii="ＭＳ ゴシック;MS Gothic" w:hAnsi="ＭＳ ゴシック;MS Gothic" w:cs="ＭＳ ゴシック;MS Gothic" w:eastAsia="ＭＳ ゴシック;MS Gothic"/>
+          <w:rFonts w:ascii="ＭＳ ゴシック" w:hAnsi="ＭＳ ゴシック" w:cs="ＭＳ ゴシック" w:eastAsia="ＭＳ ゴシック"/>
         </w:rPr>
         <w:t xml:space="preserve">５　使用言語　　英語　</w:t>
       </w:r>
@@ -549,13 +581,13 @@
       <w:pPr>
         <w:pStyle w:val="Normal"/>
         <w:rPr>
-          <w:rFonts w:ascii="ＭＳ ゴシック;MS Gothic" w:hAnsi="ＭＳ ゴシック;MS Gothic" w:eastAsia="ＭＳ ゴシック;MS Gothic" w:cs="ＭＳ ゴシック;MS Gothic"/>
+          <w:rFonts w:ascii="ＭＳ ゴシック" w:hAnsi="ＭＳ ゴシック" w:eastAsia="ＭＳ ゴシック" w:cs="ＭＳ ゴシック"/>
           <w:lang w:eastAsia="zh-TW"/>
         </w:rPr>
       </w:pPr>
       <w:r>
         <w:rPr>
-          <w:rFonts w:ascii="ＭＳ ゴシック;MS Gothic" w:hAnsi="ＭＳ ゴシック;MS Gothic" w:cs="ＭＳ ゴシック;MS Gothic" w:eastAsia="ＭＳ ゴシック;MS Gothic"/>
+          <w:rFonts w:ascii="ＭＳ ゴシック" w:hAnsi="ＭＳ ゴシック" w:cs="ＭＳ ゴシック" w:eastAsia="ＭＳ ゴシック"/>
         </w:rPr>
         <w:t>６　特設HP　　https://acdr.adrc.asia/home/acdr2026　※会議の詳細内容はこちら</w:t>
       </w:r>
@@ -565,14 +597,14 @@
         <w:pStyle w:val="Normal"/>
         <w:spacing w:lineRule="atLeast" w:line="0"/>
         <w:rPr>
-          <w:rFonts w:ascii="ＭＳ ゴシック;MS Gothic" w:hAnsi="ＭＳ ゴシック;MS Gothic" w:eastAsia="ＭＳ ゴシック;MS Gothic" w:cs="ＭＳ ゴシック;MS Gothic"/>
+          <w:rFonts w:ascii="ＭＳ ゴシック" w:hAnsi="ＭＳ ゴシック" w:eastAsia="ＭＳ ゴシック" w:cs="ＭＳ ゴシック"/>
           <w:szCs w:val="16"/>
           <w:lang w:eastAsia="zh-TW"/>
         </w:rPr>
       </w:pPr>
       <w:r>
         <w:rPr>
-          <w:rFonts w:eastAsia="ＭＳ ゴシック;MS Gothic" w:cs="ＭＳ ゴシック;MS Gothic" w:ascii="ＭＳ ゴシック;MS Gothic" w:hAnsi="ＭＳ ゴシック;MS Gothic"/>
+          <w:rFonts w:eastAsia="ＭＳ ゴシック" w:cs="ＭＳ ゴシック" w:ascii="ＭＳ ゴシック" w:hAnsi="ＭＳ ゴシック"/>
           <w:szCs w:val="16"/>
           <w:lang w:eastAsia="zh-TW"/>
         </w:rPr>
@@ -586,7 +618,7 @@
       </w:pPr>
       <w:r>
         <w:rPr>
-          <w:rFonts w:ascii="ＭＳ ゴシック;MS Gothic" w:hAnsi="ＭＳ ゴシック;MS Gothic" w:cs="ＭＳ ゴシック;MS Gothic" w:eastAsia="ＭＳ ゴシック;MS Gothic"/>
+          <w:rFonts w:ascii="ＭＳ ゴシック" w:hAnsi="ＭＳ ゴシック" w:cs="ＭＳ ゴシック" w:eastAsia="ＭＳ ゴシック"/>
         </w:rPr>
         <w:t>別紙１：プログラム</w:t>
       </w:r>
@@ -596,12 +628,12 @@
         <w:pStyle w:val="Normal"/>
         <w:ind w:firstLine="235" w:right="0"/>
         <w:rPr>
-          <w:rFonts w:ascii="ＭＳ ゴシック;MS Gothic" w:hAnsi="ＭＳ ゴシック;MS Gothic" w:eastAsia="ＭＳ ゴシック;MS Gothic" w:cs="ＭＳ ゴシック;MS Gothic"/>
-        </w:rPr>
-      </w:pPr>
-      <w:r>
-        <w:rPr>
-          <w:rFonts w:ascii="ＭＳ ゴシック;MS Gothic" w:hAnsi="ＭＳ ゴシック;MS Gothic" w:cs="ＭＳ ゴシック;MS Gothic" w:eastAsia="ＭＳ ゴシック;MS Gothic"/>
+          <w:rFonts w:ascii="ＭＳ ゴシック" w:hAnsi="ＭＳ ゴシック" w:eastAsia="ＭＳ ゴシック" w:cs="ＭＳ ゴシック"/>
+        </w:rPr>
+      </w:pPr>
+      <w:r>
+        <w:rPr>
+          <w:rFonts w:ascii="ＭＳ ゴシック" w:hAnsi="ＭＳ ゴシック" w:cs="ＭＳ ゴシック" w:eastAsia="ＭＳ ゴシック"/>
         </w:rPr>
         <w:t>別紙２：過去のアジア防災会議開催地</w:t>
       </w:r>
@@ -611,12 +643,12 @@
         <w:pStyle w:val="Normal"/>
         <w:ind w:firstLine="235" w:right="0"/>
         <w:rPr>
-          <w:rFonts w:ascii="ＭＳ ゴシック;MS Gothic" w:hAnsi="ＭＳ ゴシック;MS Gothic" w:eastAsia="ＭＳ ゴシック;MS Gothic" w:cs="ＭＳ ゴシック;MS Gothic"/>
-        </w:rPr>
-      </w:pPr>
-      <w:r>
-        <w:rPr>
-          <w:rFonts w:eastAsia="ＭＳ ゴシック;MS Gothic" w:cs="ＭＳ ゴシック;MS Gothic" w:ascii="ＭＳ ゴシック;MS Gothic" w:hAnsi="ＭＳ ゴシック;MS Gothic"/>
+          <w:rFonts w:ascii="ＭＳ ゴシック" w:hAnsi="ＭＳ ゴシック" w:eastAsia="ＭＳ ゴシック" w:cs="ＭＳ ゴシック"/>
+        </w:rPr>
+      </w:pPr>
+      <w:r>
+        <w:rPr>
+          <w:rFonts w:eastAsia="ＭＳ ゴシック" w:cs="ＭＳ ゴシック" w:ascii="ＭＳ ゴシック" w:hAnsi="ＭＳ ゴシック"/>
         </w:rPr>
       </w:r>
       <w:bookmarkStart w:id="10" w:name="_Hlk215129901_Copy_1"/>
@@ -631,14 +663,14 @@
           <w:numId w:val="1"/>
         </w:numPr>
         <w:rPr>
-          <w:rFonts w:ascii="ＭＳ ゴシック;MS Gothic" w:hAnsi="ＭＳ ゴシック;MS Gothic" w:eastAsia="ＭＳ ゴシック;MS Gothic" w:cs="ＭＳ ゴシック;MS Gothic"/>
+          <w:rFonts w:ascii="ＭＳ ゴシック" w:hAnsi="ＭＳ ゴシック" w:eastAsia="ＭＳ ゴシック" w:cs="ＭＳ ゴシック"/>
           <w:b/>
           <w:bCs/>
         </w:rPr>
       </w:pPr>
       <w:r>
         <w:rPr>
-          <w:rFonts w:ascii="ＭＳ ゴシック;MS Gothic" w:hAnsi="ＭＳ ゴシック;MS Gothic" w:cs="ＭＳ ゴシック;MS Gothic" w:eastAsia="ＭＳ ゴシック;MS Gothic"/>
+          <w:rFonts w:ascii="ＭＳ ゴシック" w:hAnsi="ＭＳ ゴシック" w:cs="ＭＳ ゴシック" w:eastAsia="ＭＳ ゴシック"/>
           <w:b/>
           <w:bCs/>
         </w:rPr>
@@ -646,7 +678,7 @@
       </w:r>
       <w:r>
         <w:rPr>
-          <w:rFonts w:eastAsia="ＭＳ ゴシック;MS Gothic" w:cs="ＭＳ ゴシック;MS Gothic" w:ascii="ＭＳ ゴシック;MS Gothic" w:hAnsi="ＭＳ ゴシック;MS Gothic"/>
+          <w:rFonts w:eastAsia="ＭＳ ゴシック" w:cs="ＭＳ ゴシック" w:ascii="ＭＳ ゴシック" w:hAnsi="ＭＳ ゴシック"/>
           <w:b/>
           <w:bCs/>
         </w:rPr>
@@ -654,7 +686,7 @@
       </w:r>
       <w:r>
         <w:rPr>
-          <w:rFonts w:ascii="ＭＳ ゴシック;MS Gothic" w:hAnsi="ＭＳ ゴシック;MS Gothic" w:cs="ＭＳ ゴシック;MS Gothic" w:eastAsia="ＭＳ ゴシック;MS Gothic"/>
+          <w:rFonts w:ascii="ＭＳ ゴシック" w:hAnsi="ＭＳ ゴシック" w:cs="ＭＳ ゴシック" w:eastAsia="ＭＳ ゴシック"/>
           <w:b/>
           <w:bCs/>
         </w:rPr>
@@ -662,7 +694,7 @@
       </w:r>
       <w:r>
         <w:rPr>
-          <w:rFonts w:eastAsia="ＭＳ ゴシック;MS Gothic" w:cs="ＭＳ ゴシック;MS Gothic" w:ascii="ＭＳ ゴシック;MS Gothic" w:hAnsi="ＭＳ ゴシック;MS Gothic"/>
+          <w:rFonts w:eastAsia="ＭＳ ゴシック" w:cs="ＭＳ ゴシック" w:ascii="ＭＳ ゴシック" w:hAnsi="ＭＳ ゴシック"/>
           <w:b/>
           <w:bCs/>
         </w:rPr>
@@ -670,7 +702,7 @@
       </w:r>
       <w:r>
         <w:rPr>
-          <w:rFonts w:ascii="ＭＳ ゴシック;MS Gothic" w:hAnsi="ＭＳ ゴシック;MS Gothic" w:cs="ＭＳ ゴシック;MS Gothic" w:eastAsia="ＭＳ ゴシック;MS Gothic"/>
+          <w:rFonts w:ascii="ＭＳ ゴシック" w:hAnsi="ＭＳ ゴシック" w:cs="ＭＳ ゴシック" w:eastAsia="ＭＳ ゴシック"/>
           <w:b/>
           <w:bCs/>
         </w:rPr>
@@ -681,13 +713,13 @@
       <w:pPr>
         <w:pStyle w:val="Normal"/>
         <w:rPr>
-          <w:rFonts w:ascii="ＭＳ ゴシック;MS Gothic" w:hAnsi="ＭＳ ゴシック;MS Gothic" w:eastAsia="ＭＳ ゴシック;MS Gothic" w:cs="ＭＳ ゴシック;MS Gothic"/>
+          <w:rFonts w:ascii="ＭＳ ゴシック" w:hAnsi="ＭＳ ゴシック" w:eastAsia="ＭＳ ゴシック" w:cs="ＭＳ ゴシック"/>
           <w:sz w:val="32"/>
         </w:rPr>
       </w:pPr>
       <w:r>
         <w:rPr>
-          <w:rFonts w:eastAsia="ＭＳ ゴシック;MS Gothic" w:cs="ＭＳ ゴシック;MS Gothic" w:ascii="ＭＳ ゴシック;MS Gothic" w:hAnsi="ＭＳ ゴシック;MS Gothic"/>
+          <w:rFonts w:eastAsia="ＭＳ ゴシック" w:cs="ＭＳ ゴシック" w:ascii="ＭＳ ゴシック" w:hAnsi="ＭＳ ゴシック"/>
           <w:sz w:val="8"/>
           <w:lang w:val="en-US" w:eastAsia="en-US"/>
         </w:rPr>
@@ -741,14 +773,14 @@
                               <w:ind w:firstLine="235" w:right="0"/>
                               <w:jc w:val="left"/>
                               <w:rPr>
-                                <w:rFonts w:ascii="ＭＳ ゴシック;MS Gothic" w:hAnsi="ＭＳ ゴシック;MS Gothic" w:eastAsia="ＭＳ ゴシック;MS Gothic" w:cs="ＭＳ ゴシック;MS Gothic"/>
+                                <w:rFonts w:ascii="ＭＳ ゴシック" w:hAnsi="ＭＳ ゴシック" w:eastAsia="ＭＳ ゴシック" w:cs="ＭＳ ゴシック"/>
                                 <w:b/>
                                 <w:color w:val="000000"/>
                               </w:rPr>
                             </w:pPr>
                             <w:r>
                               <w:rPr>
-                                <w:rFonts w:ascii="ＭＳ ゴシック;MS Gothic" w:hAnsi="ＭＳ ゴシック;MS Gothic" w:cs="ＭＳ ゴシック;MS Gothic" w:eastAsia="ＭＳ ゴシック;MS Gothic"/>
+                                <w:rFonts w:ascii="ＭＳ ゴシック" w:hAnsi="ＭＳ ゴシック" w:cs="ＭＳ ゴシック" w:eastAsia="ＭＳ ゴシック"/>
                                 <w:color w:val="000000"/>
                               </w:rPr>
                               <w:t>＜本件問合せ先＞　　</w:t>
@@ -761,20 +793,20 @@
                               <w:ind w:firstLine="235" w:right="0"/>
                               <w:jc w:val="left"/>
                               <w:rPr>
-                                <w:rFonts w:ascii="ＭＳ ゴシック;MS Gothic" w:hAnsi="ＭＳ ゴシック;MS Gothic" w:eastAsia="ＭＳ ゴシック;MS Gothic" w:cs="ＭＳ ゴシック;MS Gothic"/>
+                                <w:rFonts w:ascii="ＭＳ ゴシック" w:hAnsi="ＭＳ ゴシック" w:eastAsia="ＭＳ ゴシック" w:cs="ＭＳ ゴシック"/>
                                 <w:color w:val="000000"/>
                               </w:rPr>
                             </w:pPr>
                             <w:r>
                               <w:rPr>
-                                <w:rFonts w:eastAsia="ＭＳ ゴシック;MS Gothic" w:cs="ＭＳ ゴシック;MS Gothic" w:ascii="ＭＳ ゴシック;MS Gothic" w:hAnsi="ＭＳ ゴシック;MS Gothic"/>
+                                <w:rFonts w:eastAsia="ＭＳ ゴシック" w:cs="ＭＳ ゴシック" w:ascii="ＭＳ ゴシック" w:hAnsi="ＭＳ ゴシック"/>
                                 <w:color w:val="000000"/>
                               </w:rPr>
                               <w:t>●</w:t>
                             </w:r>
                             <w:r>
                               <w:rPr>
-                                <w:rFonts w:ascii="ＭＳ ゴシック;MS Gothic" w:hAnsi="ＭＳ ゴシック;MS Gothic" w:cs="ＭＳ ゴシック;MS Gothic" w:eastAsia="ＭＳ ゴシック;MS Gothic"/>
+                                <w:rFonts w:ascii="ＭＳ ゴシック" w:hAnsi="ＭＳ ゴシック" w:cs="ＭＳ ゴシック" w:eastAsia="ＭＳ ゴシック"/>
                                 <w:color w:val="000000"/>
                               </w:rPr>
                               <w:t>会議に関すること</w:t>
@@ -787,19 +819,19 @@
                               <w:ind w:firstLine="705" w:right="0"/>
                               <w:jc w:val="left"/>
                               <w:rPr>
-                                <w:rFonts w:ascii="ＭＳ ゴシック;MS Gothic" w:hAnsi="ＭＳ ゴシック;MS Gothic" w:eastAsia="ＭＳ ゴシック;MS Gothic" w:cs="ＭＳ ゴシック;MS Gothic"/>
+                                <w:rFonts w:ascii="ＭＳ ゴシック" w:hAnsi="ＭＳ ゴシック" w:eastAsia="ＭＳ ゴシック" w:cs="ＭＳ ゴシック"/>
                               </w:rPr>
                             </w:pPr>
                             <w:r>
                               <w:rPr>
-                                <w:rFonts w:ascii="ＭＳ ゴシック;MS Gothic" w:hAnsi="ＭＳ ゴシック;MS Gothic" w:cs="ＭＳ ゴシック;MS Gothic" w:eastAsia="ＭＳ ゴシック;MS Gothic"/>
+                                <w:rFonts w:ascii="ＭＳ ゴシック" w:hAnsi="ＭＳ ゴシック" w:cs="ＭＳ ゴシック" w:eastAsia="ＭＳ ゴシック"/>
                                 <w:color w:val="000000"/>
                               </w:rPr>
                               <w:t xml:space="preserve">事務局（一般財団法人アジア防災センター）担当：荒木田、池田</w:t>
                             </w:r>
                             <w:r>
                               <w:rPr>
-                                <w:rFonts w:ascii="ＭＳ ゴシック;MS Gothic" w:hAnsi="ＭＳ ゴシック;MS Gothic" w:cs="ＭＳ ゴシック;MS Gothic" w:eastAsia="ＭＳ ゴシック;MS Gothic"/>
+                                <w:rFonts w:ascii="ＭＳ ゴシック" w:hAnsi="ＭＳ ゴシック" w:cs="ＭＳ ゴシック" w:eastAsia="ＭＳ ゴシック"/>
                               </w:rPr>
                               <w:t/>
                             </w:r>
@@ -811,24 +843,24 @@
                               <w:ind w:firstLine="705" w:right="0"/>
                               <w:jc w:val="left"/>
                               <w:rPr>
-                                <w:rFonts w:ascii="ＭＳ ゴシック;MS Gothic" w:hAnsi="ＭＳ ゴシック;MS Gothic" w:eastAsia="ＭＳ ゴシック;MS Gothic" w:cs="ＭＳ ゴシック;MS Gothic"/>
+                                <w:rFonts w:ascii="ＭＳ ゴシック" w:hAnsi="ＭＳ ゴシック" w:eastAsia="ＭＳ ゴシック" w:cs="ＭＳ ゴシック"/>
                               </w:rPr>
                             </w:pPr>
                             <w:r>
                               <w:rPr>
-                                <w:rFonts w:eastAsia="ＭＳ ゴシック;MS Gothic" w:cs="ＭＳ ゴシック;MS Gothic" w:ascii="ＭＳ ゴシック;MS Gothic" w:hAnsi="ＭＳ ゴシック;MS Gothic"/>
+                                <w:rFonts w:eastAsia="ＭＳ ゴシック" w:cs="ＭＳ ゴシック" w:ascii="ＭＳ ゴシック" w:hAnsi="ＭＳ ゴシック"/>
                               </w:rPr>
                               <w:t xml:space="preserve">E-mail　ma-arakida@adrc.asia, mi-ikeda@adrc.asia</w:t>
                             </w:r>
                             <w:r>
                               <w:rPr>
-                                <w:rFonts w:ascii="ＭＳ ゴシック;MS Gothic" w:hAnsi="ＭＳ ゴシック;MS Gothic" w:cs="ＭＳ ゴシック;MS Gothic" w:eastAsia="ＭＳ ゴシック;MS Gothic"/>
+                                <w:rFonts w:ascii="ＭＳ ゴシック" w:hAnsi="ＭＳ ゴシック" w:cs="ＭＳ ゴシック" w:eastAsia="ＭＳ ゴシック"/>
                               </w:rPr>
                               <w:t/>
                             </w:r>
                             <w:r>
                               <w:rPr>
-                                <w:rFonts w:eastAsia="ＭＳ ゴシック;MS Gothic" w:cs="ＭＳ ゴシック;MS Gothic" w:ascii="ＭＳ ゴシック;MS Gothic" w:hAnsi="ＭＳ ゴシック;MS Gothic"/>
+                                <w:rFonts w:eastAsia="ＭＳ ゴシック" w:cs="ＭＳ ゴシック" w:ascii="ＭＳ ゴシック" w:hAnsi="ＭＳ ゴシック"/>
                               </w:rPr>
                               <w:t/>
                             </w:r>
@@ -840,12 +872,12 @@
                               <w:ind w:firstLine="705" w:right="0"/>
                               <w:jc w:val="left"/>
                               <w:rPr>
-                                <w:rFonts w:ascii="ＭＳ ゴシック;MS Gothic" w:hAnsi="ＭＳ ゴシック;MS Gothic" w:eastAsia="ＭＳ ゴシック;MS Gothic" w:cs="ＭＳ ゴシック;MS Gothic"/>
+                                <w:rFonts w:ascii="ＭＳ ゴシック" w:hAnsi="ＭＳ ゴシック" w:eastAsia="ＭＳ ゴシック" w:cs="ＭＳ ゴシック"/>
                               </w:rPr>
                             </w:pPr>
                             <w:r>
                               <w:rPr>
-                                <w:rFonts w:eastAsia="ＭＳ ゴシック;MS Gothic" w:cs="ＭＳ ゴシック;MS Gothic" w:ascii="ＭＳ ゴシック;MS Gothic" w:hAnsi="ＭＳ ゴシック;MS Gothic"/>
+                                <w:rFonts w:eastAsia="ＭＳ ゴシック" w:cs="ＭＳ ゴシック" w:ascii="ＭＳ ゴシック" w:hAnsi="ＭＳ ゴシック"/>
                               </w:rPr>
                               <w:t>TEL 078-262-5540 FAX 078-262-5546</w:t>
                             </w:r>
@@ -856,12 +888,12 @@
                               <w:spacing w:lineRule="exact" w:line="280"/>
                               <w:jc w:val="left"/>
                               <w:rPr>
-                                <w:rFonts w:ascii="ＭＳ ゴシック;MS Gothic" w:hAnsi="ＭＳ ゴシック;MS Gothic" w:eastAsia="ＭＳ ゴシック;MS Gothic" w:cs="ＭＳ ゴシック;MS Gothic"/>
+                                <w:rFonts w:ascii="ＭＳ ゴシック" w:hAnsi="ＭＳ ゴシック" w:eastAsia="ＭＳ ゴシック" w:cs="ＭＳ ゴシック"/>
                               </w:rPr>
                             </w:pPr>
                             <w:r>
                               <w:rPr>
-                                <w:rFonts w:ascii="ＭＳ ゴシック;MS Gothic" w:hAnsi="ＭＳ ゴシック;MS Gothic" w:cs="ＭＳ ゴシック;MS Gothic" w:eastAsia="ＭＳ ゴシック;MS Gothic"/>
+                                <w:rFonts w:ascii="ＭＳ ゴシック" w:hAnsi="ＭＳ ゴシック" w:cs="ＭＳ ゴシック" w:eastAsia="ＭＳ ゴシック"/>
                               </w:rPr>
                               <w:t>　●その他全般に関すること</w:t>
                             </w:r>
@@ -873,13 +905,13 @@
                               <w:ind w:firstLine="705" w:right="0"/>
                               <w:jc w:val="left"/>
                               <w:rPr>
-                                <w:rFonts w:ascii="ＭＳ ゴシック;MS Gothic" w:hAnsi="ＭＳ ゴシック;MS Gothic" w:eastAsia="ＭＳ ゴシック;MS Gothic" w:cs="ＭＳ ゴシック;MS Gothic"/>
+                                <w:rFonts w:ascii="ＭＳ ゴシック" w:hAnsi="ＭＳ ゴシック" w:eastAsia="ＭＳ ゴシック" w:cs="ＭＳ ゴシック"/>
                                 <w:color w:val="000000"/>
                               </w:rPr>
                             </w:pPr>
                             <w:r>
                               <w:rPr>
-                                <w:rFonts w:ascii="ＭＳ ゴシック;MS Gothic" w:hAnsi="ＭＳ ゴシック;MS Gothic" w:cs="ＭＳ ゴシック;MS Gothic" w:eastAsia="ＭＳ ゴシック;MS Gothic"/>
+                                <w:rFonts w:ascii="ＭＳ ゴシック" w:hAnsi="ＭＳ ゴシック" w:cs="ＭＳ ゴシック" w:eastAsia="ＭＳ ゴシック"/>
                                 <w:color w:val="000000"/>
                               </w:rPr>
                               <w:t>内閣府政策統括官（防災担当）付参事官（普及啓発・連携担当）付</w:t>
@@ -894,14 +926,14 @@
                             </w:pPr>
                             <w:r>
                               <w:rPr>
-                                <w:rFonts w:ascii="ＭＳ ゴシック;MS Gothic" w:hAnsi="ＭＳ ゴシック;MS Gothic" w:cs="ＭＳ ゴシック;MS Gothic" w:eastAsia="ＭＳ ゴシック;MS Gothic"/>
+                                <w:rFonts w:ascii="ＭＳ ゴシック" w:hAnsi="ＭＳ ゴシック" w:cs="ＭＳ ゴシック" w:eastAsia="ＭＳ ゴシック"/>
                                 <w:color w:val="000000"/>
                               </w:rPr>
                               <w:t xml:space="preserve">　　　担当：〇〇　TEL 03-5797-7543 FAX 03-3581-7510</w:t>
                             </w:r>
                             <w:r>
                               <w:rPr>
-                                <w:rFonts w:eastAsia="ＭＳ ゴシック;MS Gothic" w:cs="ＭＳ ゴシック;MS Gothic" w:ascii="ＭＳ ゴシック;MS Gothic" w:hAnsi="ＭＳ ゴシック;MS Gothic"/>
+                                <w:rFonts w:eastAsia="ＭＳ ゴシック" w:cs="ＭＳ ゴシック" w:ascii="ＭＳ ゴシック" w:hAnsi="ＭＳ ゴシック"/>
                                 <w:color w:val="000000"/>
                               </w:rPr>
                               <w:t/>
@@ -932,14 +964,14 @@
                         <w:ind w:firstLine="235" w:right="0"/>
                         <w:jc w:val="left"/>
                         <w:rPr>
-                          <w:rFonts w:ascii="ＭＳ ゴシック;MS Gothic" w:hAnsi="ＭＳ ゴシック;MS Gothic" w:eastAsia="ＭＳ ゴシック;MS Gothic" w:cs="ＭＳ ゴシック;MS Gothic"/>
+                          <w:rFonts w:ascii="ＭＳ ゴシック" w:hAnsi="ＭＳ ゴシック" w:eastAsia="ＭＳ ゴシック" w:cs="ＭＳ ゴシック"/>
                           <w:b/>
                           <w:color w:val="000000"/>
                         </w:rPr>
                       </w:pPr>
                       <w:r>
                         <w:rPr>
-                          <w:rFonts w:ascii="ＭＳ ゴシック;MS Gothic" w:hAnsi="ＭＳ ゴシック;MS Gothic" w:cs="ＭＳ ゴシック;MS Gothic" w:eastAsia="ＭＳ ゴシック;MS Gothic"/>
+                          <w:rFonts w:ascii="ＭＳ ゴシック" w:hAnsi="ＭＳ ゴシック" w:cs="ＭＳ ゴシック" w:eastAsia="ＭＳ ゴシック"/>
                           <w:color w:val="000000"/>
                         </w:rPr>
                         <w:t>＜本件問合せ先＞　　</w:t>
@@ -952,20 +984,20 @@
                         <w:ind w:firstLine="235" w:right="0"/>
                         <w:jc w:val="left"/>
                         <w:rPr>
-                          <w:rFonts w:ascii="ＭＳ ゴシック;MS Gothic" w:hAnsi="ＭＳ ゴシック;MS Gothic" w:eastAsia="ＭＳ ゴシック;MS Gothic" w:cs="ＭＳ ゴシック;MS Gothic"/>
+                          <w:rFonts w:ascii="ＭＳ ゴシック" w:hAnsi="ＭＳ ゴシック" w:eastAsia="ＭＳ ゴシック" w:cs="ＭＳ ゴシック"/>
                           <w:color w:val="000000"/>
                         </w:rPr>
                       </w:pPr>
                       <w:r>
                         <w:rPr>
-                          <w:rFonts w:eastAsia="ＭＳ ゴシック;MS Gothic" w:cs="ＭＳ ゴシック;MS Gothic" w:ascii="ＭＳ ゴシック;MS Gothic" w:hAnsi="ＭＳ ゴシック;MS Gothic"/>
+                          <w:rFonts w:eastAsia="ＭＳ ゴシック" w:cs="ＭＳ ゴシック" w:ascii="ＭＳ ゴシック" w:hAnsi="ＭＳ ゴシック"/>
                           <w:color w:val="000000"/>
                         </w:rPr>
                         <w:t>●</w:t>
                       </w:r>
                       <w:r>
                         <w:rPr>
-                          <w:rFonts w:ascii="ＭＳ ゴシック;MS Gothic" w:hAnsi="ＭＳ ゴシック;MS Gothic" w:cs="ＭＳ ゴシック;MS Gothic" w:eastAsia="ＭＳ ゴシック;MS Gothic"/>
+                          <w:rFonts w:ascii="ＭＳ ゴシック" w:hAnsi="ＭＳ ゴシック" w:cs="ＭＳ ゴシック" w:eastAsia="ＭＳ ゴシック"/>
                           <w:color w:val="000000"/>
                         </w:rPr>
                         <w:t>会議に関すること</w:t>
@@ -978,19 +1010,19 @@
                         <w:ind w:firstLine="705" w:right="0"/>
                         <w:jc w:val="left"/>
                         <w:rPr>
-                          <w:rFonts w:ascii="ＭＳ ゴシック;MS Gothic" w:hAnsi="ＭＳ ゴシック;MS Gothic" w:eastAsia="ＭＳ ゴシック;MS Gothic" w:cs="ＭＳ ゴシック;MS Gothic"/>
+                          <w:rFonts w:ascii="ＭＳ ゴシック" w:hAnsi="ＭＳ ゴシック" w:eastAsia="ＭＳ ゴシック" w:cs="ＭＳ ゴシック"/>
                         </w:rPr>
                       </w:pPr>
                       <w:r>
                         <w:rPr>
-                          <w:rFonts w:ascii="ＭＳ ゴシック;MS Gothic" w:hAnsi="ＭＳ ゴシック;MS Gothic" w:cs="ＭＳ ゴシック;MS Gothic" w:eastAsia="ＭＳ ゴシック;MS Gothic"/>
+                          <w:rFonts w:ascii="ＭＳ ゴシック" w:hAnsi="ＭＳ ゴシック" w:cs="ＭＳ ゴシック" w:eastAsia="ＭＳ ゴシック"/>
                           <w:color w:val="000000"/>
                         </w:rPr>
                         <w:t xml:space="preserve">事務局（一般財団法人アジア防災センター）担当：荒木田、池田</w:t>
                       </w:r>
                       <w:r>
                         <w:rPr>
-                          <w:rFonts w:ascii="ＭＳ ゴシック;MS Gothic" w:hAnsi="ＭＳ ゴシック;MS Gothic" w:cs="ＭＳ ゴシック;MS Gothic" w:eastAsia="ＭＳ ゴシック;MS Gothic"/>
+                          <w:rFonts w:ascii="ＭＳ ゴシック" w:hAnsi="ＭＳ ゴシック" w:cs="ＭＳ ゴシック" w:eastAsia="ＭＳ ゴシック"/>
                         </w:rPr>
                         <w:t/>
                       </w:r>
@@ -1002,24 +1034,24 @@
                         <w:ind w:firstLine="705" w:right="0"/>
                         <w:jc w:val="left"/>
                         <w:rPr>
-                          <w:rFonts w:ascii="ＭＳ ゴシック;MS Gothic" w:hAnsi="ＭＳ ゴシック;MS Gothic" w:eastAsia="ＭＳ ゴシック;MS Gothic" w:cs="ＭＳ ゴシック;MS Gothic"/>
+                          <w:rFonts w:ascii="ＭＳ ゴシック" w:hAnsi="ＭＳ ゴシック" w:eastAsia="ＭＳ ゴシック" w:cs="ＭＳ ゴシック"/>
                         </w:rPr>
                       </w:pPr>
                       <w:r>
                         <w:rPr>
-                          <w:rFonts w:eastAsia="ＭＳ ゴシック;MS Gothic" w:cs="ＭＳ ゴシック;MS Gothic" w:ascii="ＭＳ ゴシック;MS Gothic" w:hAnsi="ＭＳ ゴシック;MS Gothic"/>
+                          <w:rFonts w:eastAsia="ＭＳ ゴシック" w:cs="ＭＳ ゴシック" w:ascii="ＭＳ ゴシック" w:hAnsi="ＭＳ ゴシック"/>
                         </w:rPr>
                         <w:t xml:space="preserve">E-mail　ma-arakida@adrc.asia, mi-ikeda@adrc.asia</w:t>
                       </w:r>
                       <w:r>
                         <w:rPr>
-                          <w:rFonts w:ascii="ＭＳ ゴシック;MS Gothic" w:hAnsi="ＭＳ ゴシック;MS Gothic" w:cs="ＭＳ ゴシック;MS Gothic" w:eastAsia="ＭＳ ゴシック;MS Gothic"/>
+                          <w:rFonts w:ascii="ＭＳ ゴシック" w:hAnsi="ＭＳ ゴシック" w:cs="ＭＳ ゴシック" w:eastAsia="ＭＳ ゴシック"/>
                         </w:rPr>
                         <w:t/>
                       </w:r>
                       <w:r>
                         <w:rPr>
-                          <w:rFonts w:eastAsia="ＭＳ ゴシック;MS Gothic" w:cs="ＭＳ ゴシック;MS Gothic" w:ascii="ＭＳ ゴシック;MS Gothic" w:hAnsi="ＭＳ ゴシック;MS Gothic"/>
+                          <w:rFonts w:eastAsia="ＭＳ ゴシック" w:cs="ＭＳ ゴシック" w:ascii="ＭＳ ゴシック" w:hAnsi="ＭＳ ゴシック"/>
                         </w:rPr>
                         <w:t/>
                       </w:r>
@@ -1031,12 +1063,12 @@
                         <w:ind w:firstLine="705" w:right="0"/>
                         <w:jc w:val="left"/>
                         <w:rPr>
-                          <w:rFonts w:ascii="ＭＳ ゴシック;MS Gothic" w:hAnsi="ＭＳ ゴシック;MS Gothic" w:eastAsia="ＭＳ ゴシック;MS Gothic" w:cs="ＭＳ ゴシック;MS Gothic"/>
+                          <w:rFonts w:ascii="ＭＳ ゴシック" w:hAnsi="ＭＳ ゴシック" w:eastAsia="ＭＳ ゴシック" w:cs="ＭＳ ゴシック"/>
                         </w:rPr>
                       </w:pPr>
                       <w:r>
                         <w:rPr>
-                          <w:rFonts w:eastAsia="ＭＳ ゴシック;MS Gothic" w:cs="ＭＳ ゴシック;MS Gothic" w:ascii="ＭＳ ゴシック;MS Gothic" w:hAnsi="ＭＳ ゴシック;MS Gothic"/>
+                          <w:rFonts w:eastAsia="ＭＳ ゴシック" w:cs="ＭＳ ゴシック" w:ascii="ＭＳ ゴシック" w:hAnsi="ＭＳ ゴシック"/>
                         </w:rPr>
                         <w:t>TEL 078-262-5540 FAX 078-262-5546</w:t>
                       </w:r>
@@ -1047,12 +1079,12 @@
                         <w:spacing w:lineRule="exact" w:line="280"/>
                         <w:jc w:val="left"/>
                         <w:rPr>
-                          <w:rFonts w:ascii="ＭＳ ゴシック;MS Gothic" w:hAnsi="ＭＳ ゴシック;MS Gothic" w:eastAsia="ＭＳ ゴシック;MS Gothic" w:cs="ＭＳ ゴシック;MS Gothic"/>
+                          <w:rFonts w:ascii="ＭＳ ゴシック" w:hAnsi="ＭＳ ゴシック" w:eastAsia="ＭＳ ゴシック" w:cs="ＭＳ ゴシック"/>
                         </w:rPr>
                       </w:pPr>
                       <w:r>
                         <w:rPr>
-                          <w:rFonts w:ascii="ＭＳ ゴシック;MS Gothic" w:hAnsi="ＭＳ ゴシック;MS Gothic" w:cs="ＭＳ ゴシック;MS Gothic" w:eastAsia="ＭＳ ゴシック;MS Gothic"/>
+                          <w:rFonts w:ascii="ＭＳ ゴシック" w:hAnsi="ＭＳ ゴシック" w:cs="ＭＳ ゴシック" w:eastAsia="ＭＳ ゴシック"/>
                         </w:rPr>
                         <w:t>　●その他全般に関すること</w:t>
                       </w:r>
@@ -1064,13 +1096,13 @@
                         <w:ind w:firstLine="705" w:right="0"/>
                         <w:jc w:val="left"/>
                         <w:rPr>
-                          <w:rFonts w:ascii="ＭＳ ゴシック;MS Gothic" w:hAnsi="ＭＳ ゴシック;MS Gothic" w:eastAsia="ＭＳ ゴシック;MS Gothic" w:cs="ＭＳ ゴシック;MS Gothic"/>
+                          <w:rFonts w:ascii="ＭＳ ゴシック" w:hAnsi="ＭＳ ゴシック" w:eastAsia="ＭＳ ゴシック" w:cs="ＭＳ ゴシック"/>
                           <w:color w:val="000000"/>
                         </w:rPr>
                       </w:pPr>
                       <w:r>
                         <w:rPr>
-                          <w:rFonts w:ascii="ＭＳ ゴシック;MS Gothic" w:hAnsi="ＭＳ ゴシック;MS Gothic" w:cs="ＭＳ ゴシック;MS Gothic" w:eastAsia="ＭＳ ゴシック;MS Gothic"/>
+                          <w:rFonts w:ascii="ＭＳ ゴシック" w:hAnsi="ＭＳ ゴシック" w:cs="ＭＳ ゴシック" w:eastAsia="ＭＳ ゴシック"/>
                           <w:color w:val="000000"/>
                         </w:rPr>
                         <w:t>内閣府政策統括官（防災担当）付参事官（普及啓発・連携担当）付</w:t>
@@ -1085,14 +1117,14 @@
                       </w:pPr>
                       <w:r>
                         <w:rPr>
-                          <w:rFonts w:ascii="ＭＳ ゴシック;MS Gothic" w:hAnsi="ＭＳ ゴシック;MS Gothic" w:cs="ＭＳ ゴシック;MS Gothic" w:eastAsia="ＭＳ ゴシック;MS Gothic"/>
+                          <w:rFonts w:ascii="ＭＳ ゴシック" w:hAnsi="ＭＳ ゴシック" w:cs="ＭＳ ゴシック" w:eastAsia="ＭＳ ゴシック"/>
                           <w:color w:val="000000"/>
                         </w:rPr>
                         <w:t xml:space="preserve">　　　担当：〇〇　TEL 03-5797-7543 FAX 03-3581-7510</w:t>
                       </w:r>
                       <w:r>
                         <w:rPr>
-                          <w:rFonts w:eastAsia="ＭＳ ゴシック;MS Gothic" w:cs="ＭＳ ゴシック;MS Gothic" w:ascii="ＭＳ ゴシック;MS Gothic" w:hAnsi="ＭＳ ゴシック;MS Gothic"/>
+                          <w:rFonts w:eastAsia="ＭＳ ゴシック" w:cs="ＭＳ ゴシック" w:ascii="ＭＳ ゴシック" w:hAnsi="ＭＳ ゴシック"/>
                           <w:color w:val="000000"/>
                         </w:rPr>
                         <w:t/>
@@ -1121,14 +1153,14 @@
         <w:ind w:hanging="0" w:left="0"/>
         <w:jc w:val="both"/>
         <w:rPr>
-          <w:rFonts w:ascii="ＭＳ ゴシック;MS Gothic" w:hAnsi="ＭＳ ゴシック;MS Gothic" w:eastAsia="ＭＳ ゴシック;MS Gothic" w:cs="ＭＳ ゴシック;MS Gothic"/>
+          <w:rFonts w:ascii="ＭＳ ゴシック" w:hAnsi="ＭＳ ゴシック" w:eastAsia="ＭＳ ゴシック" w:cs="ＭＳ ゴシック"/>
           <w:sz w:val="8"/>
           <w:lang w:val="en-US" w:eastAsia="en-US"/>
         </w:rPr>
       </w:pPr>
       <w:r>
         <w:rPr>
-          <w:rFonts w:eastAsia="ＭＳ ゴシック;MS Gothic" w:cs="ＭＳ ゴシック;MS Gothic" w:ascii="ＭＳ ゴシック;MS Gothic" w:hAnsi="ＭＳ ゴシック;MS Gothic"/>
+          <w:rFonts w:eastAsia="ＭＳ ゴシック" w:cs="ＭＳ ゴシック" w:ascii="ＭＳ ゴシック" w:hAnsi="ＭＳ ゴシック"/>
           <w:sz w:val="8"/>
           <w:lang w:val="en-US" w:eastAsia="en-US"/>
         </w:rPr>
@@ -1174,12 +1206,12 @@
       <w:pStyle w:val="Normal"/>
       <w:jc w:val="left"/>
       <w:rPr>
-        <w:rFonts w:ascii="ＭＳ 明朝;MS Mincho" w:hAnsi="ＭＳ 明朝;MS Mincho"/>
+        <w:rFonts w:ascii="ＭＳ 明朝" w:hAnsi="ＭＳ 明朝"/>
       </w:rPr>
     </w:pPr>
     <w:r>
       <w:rPr>
-        <w:rFonts w:ascii="ＭＳ 明朝;MS Mincho" w:hAnsi="ＭＳ 明朝;MS Mincho"/>
+        <w:rFonts w:ascii="ＭＳ 明朝" w:hAnsi="ＭＳ 明朝"/>
       </w:rPr>
     </w:r>
   </w:p>
@@ -1193,12 +1225,12 @@
       <w:pStyle w:val="Normal"/>
       <w:jc w:val="left"/>
       <w:rPr>
-        <w:rFonts w:ascii="ＭＳ 明朝;MS Mincho" w:hAnsi="ＭＳ 明朝;MS Mincho"/>
+        <w:rFonts w:ascii="ＭＳ 明朝" w:hAnsi="ＭＳ 明朝"/>
       </w:rPr>
     </w:pPr>
     <w:r>
       <w:rPr>
-        <w:rFonts w:ascii="ＭＳ 明朝;MS Mincho" w:hAnsi="ＭＳ 明朝;MS Mincho"/>
+        <w:rFonts w:ascii="ＭＳ 明朝" w:hAnsi="ＭＳ 明朝"/>
       </w:rPr>
     </w:r>
   </w:p>
@@ -1226,12 +1258,12 @@
       <w:pStyle w:val="Normal"/>
       <w:jc w:val="left"/>
       <w:rPr>
-        <w:rFonts w:ascii="ＭＳ 明朝;MS Mincho" w:hAnsi="ＭＳ 明朝;MS Mincho"/>
+        <w:rFonts w:ascii="ＭＳ 明朝" w:hAnsi="ＭＳ 明朝"/>
       </w:rPr>
     </w:pPr>
     <w:r>
       <w:rPr>
-        <w:rFonts w:ascii="ＭＳ 明朝;MS Mincho" w:hAnsi="ＭＳ 明朝;MS Mincho"/>
+        <w:rFonts w:ascii="ＭＳ 明朝" w:hAnsi="ＭＳ 明朝"/>
       </w:rPr>
     </w:r>
   </w:p>
@@ -1245,12 +1277,12 @@
       <w:pStyle w:val="Normal"/>
       <w:jc w:val="left"/>
       <w:rPr>
-        <w:rFonts w:ascii="ＭＳ 明朝;MS Mincho" w:hAnsi="ＭＳ 明朝;MS Mincho"/>
+        <w:rFonts w:ascii="ＭＳ 明朝" w:hAnsi="ＭＳ 明朝"/>
       </w:rPr>
     </w:pPr>
     <w:r>
       <w:rPr>
-        <w:rFonts w:ascii="ＭＳ 明朝;MS Mincho" w:hAnsi="ＭＳ 明朝;MS Mincho"/>
+        <w:rFonts w:ascii="ＭＳ 明朝" w:hAnsi="ＭＳ 明朝"/>
       </w:rPr>
     </w:r>
   </w:p>
@@ -1504,7 +1536,7 @@
   <w:docDefaults>
     <w:rPrDefault>
       <w:rPr>
-        <w:rFonts w:ascii="Liberation Serif" w:hAnsi="Liberation Serif" w:eastAsia="WenQuanYi Zen Hei" w:cs="FreeSans"/>
+        <w:rFonts w:ascii="Times New Roman" w:hAnsi="Times New Roman" w:eastAsia="ＭＳ 明朝" w:cs="Times New Roman"/>
         <w:sz w:val="24"/>
         <w:szCs w:val="24"/>
         <w:lang w:val="en-US" w:eastAsia="zh-CN" w:bidi="hi-IN"/>
@@ -1527,7 +1559,7 @@
       <w:jc w:val="both"/>
     </w:pPr>
     <w:rPr>
-      <w:rFonts w:ascii="Times New Roman" w:hAnsi="Times New Roman" w:eastAsia="ＭＳ 明朝;MS Mincho" w:cs="Times New Roman"/>
+      <w:rFonts w:ascii="Times New Roman" w:hAnsi="Times New Roman" w:eastAsia="ＭＳ 明朝" w:cs="Times New Roman"/>
       <w:color w:val="auto"/>
       <w:kern w:val="2"/>
       <w:sz w:val="24"/>
@@ -1539,7 +1571,7 @@
     <w:name w:val="WW8Num1z0"/>
     <w:qFormat/>
     <w:rPr>
-      <w:rFonts w:ascii="ＭＳ ゴシック;MS Gothic" w:hAnsi="ＭＳ ゴシック;MS Gothic" w:eastAsia="ＭＳ ゴシック;MS Gothic" w:cs="ＭＳ ゴシック;MS Gothic"/>
+      <w:rFonts w:ascii="ＭＳ ゴシック" w:hAnsi="ＭＳ ゴシック" w:eastAsia="ＭＳ ゴシック" w:cs="ＭＳ ゴシック"/>
     </w:rPr>
   </w:style>
   <w:style w:type="character" w:styleId="WW8Num1z1">
@@ -1553,7 +1585,7 @@
     <w:name w:val="WW8Num2z0"/>
     <w:qFormat/>
     <w:rPr>
-      <w:rFonts w:ascii="ＭＳ ゴシック;MS Gothic" w:hAnsi="ＭＳ ゴシック;MS Gothic" w:eastAsia="ＭＳ ゴシック;MS Gothic" w:cs="ＭＳ ゴシック;MS Gothic"/>
+      <w:rFonts w:ascii="ＭＳ ゴシック" w:hAnsi="ＭＳ ゴシック" w:eastAsia="ＭＳ ゴシック" w:cs="ＭＳ ゴシック"/>
     </w:rPr>
   </w:style>
   <w:style w:type="character" w:styleId="WW8Num2z1">
@@ -1581,7 +1613,7 @@
     <w:name w:val="WW8Num4z0"/>
     <w:qFormat/>
     <w:rPr>
-      <w:rFonts w:ascii="ＭＳ ゴシック;MS Gothic" w:hAnsi="ＭＳ ゴシック;MS Gothic" w:eastAsia="ＭＳ ゴシック;MS Gothic" w:cs="ＭＳ ゴシック;MS Gothic"/>
+      <w:rFonts w:ascii="ＭＳ ゴシック" w:hAnsi="ＭＳ ゴシック" w:eastAsia="ＭＳ ゴシック" w:cs="ＭＳ ゴシック"/>
     </w:rPr>
   </w:style>
   <w:style w:type="character" w:styleId="WW8Num4z1">
@@ -1628,7 +1660,7 @@
     <w:name w:val="HTML 書式付き (文字)"/>
     <w:qFormat/>
     <w:rPr>
-      <w:rFonts w:ascii="ＭＳ ゴシック;MS Gothic" w:hAnsi="ＭＳ ゴシック;MS Gothic" w:eastAsia="ＭＳ ゴシック;MS Gothic" w:cs="ＭＳ ゴシック;MS Gothic"/>
+      <w:rFonts w:ascii="ＭＳ ゴシック" w:hAnsi="ＭＳ ゴシック" w:eastAsia="ＭＳ ゴシック" w:cs="ＭＳ ゴシック"/>
       <w:sz w:val="24"/>
       <w:szCs w:val="24"/>
     </w:rPr>
@@ -1692,7 +1724,7 @@
       <w:spacing w:before="240" w:after="120"/>
     </w:pPr>
     <w:rPr>
-      <w:rFonts w:ascii="Liberation Sans" w:hAnsi="Liberation Sans" w:eastAsia="WenQuanYi Zen Hei" w:cs="FreeSans"/>
+      <w:rFonts w:ascii="Liberation Sans" w:hAnsi="Liberation Sans" w:eastAsia="ＭＳ 明朝" w:cs="Times New Roman"/>
       <w:sz w:val="28"/>
       <w:szCs w:val="28"/>
     </w:rPr>
@@ -1710,7 +1742,7 @@
     <w:basedOn w:val="BodyText"/>
     <w:pPr/>
     <w:rPr>
-      <w:rFonts w:cs="FreeSans"/>
+      <w:rFonts w:cs="Times New Roman"/>
     </w:rPr>
   </w:style>
   <w:style w:type="paragraph" w:styleId="Caption">
@@ -1722,7 +1754,7 @@
       <w:spacing w:before="120" w:after="120"/>
     </w:pPr>
     <w:rPr>
-      <w:rFonts w:cs="FreeSans"/>
+      <w:rFonts w:cs="Times New Roman"/>
       <w:i/>
       <w:iCs/>
       <w:sz w:val="24"/>
@@ -1737,7 +1769,7 @@
       <w:suppressLineNumbers/>
     </w:pPr>
     <w:rPr>
-      <w:rFonts w:cs="FreeSans"/>
+      <w:rFonts w:cs="Times New Roman"/>
     </w:rPr>
   </w:style>
   <w:style w:type="paragraph" w:styleId="Style21">
@@ -1746,7 +1778,7 @@
     <w:qFormat/>
     <w:pPr/>
     <w:rPr>
-      <w:rFonts w:ascii="Arial" w:hAnsi="Arial" w:eastAsia="ＭＳ ゴシック;MS Gothic" w:cs="Arial"/>
+      <w:rFonts w:ascii="Arial" w:hAnsi="Arial" w:eastAsia="ＭＳ ゴシック" w:cs="Arial"/>
       <w:sz w:val="18"/>
       <w:szCs w:val="18"/>
     </w:rPr>
@@ -1835,7 +1867,7 @@
       <w:jc w:val="left"/>
     </w:pPr>
     <w:rPr>
-      <w:rFonts w:ascii="ＭＳ ゴシック;MS Gothic" w:hAnsi="ＭＳ ゴシック;MS Gothic" w:eastAsia="ＭＳ ゴシック;MS Gothic" w:cs="ＭＳ ゴシック;MS Gothic"/>
+      <w:rFonts w:ascii="ＭＳ ゴシック" w:hAnsi="ＭＳ ゴシック" w:eastAsia="ＭＳ ゴシック" w:cs="ＭＳ ゴシック"/>
       <w:kern w:val="0"/>
     </w:rPr>
   </w:style>
@@ -1870,7 +1902,7 @@
       <w:jc w:val="left"/>
     </w:pPr>
     <w:rPr>
-      <w:rFonts w:ascii="Times New Roman" w:hAnsi="Times New Roman" w:eastAsia="ＭＳ 明朝;MS Mincho" w:cs="Times New Roman"/>
+      <w:rFonts w:ascii="Times New Roman" w:hAnsi="Times New Roman" w:eastAsia="ＭＳ 明朝" w:cs="Times New Roman"/>
       <w:color w:val="auto"/>
       <w:kern w:val="2"/>
       <w:sz w:val="24"/>

</xml_diff>